<commit_message>
Literally just changed the formatting with the testing.
</commit_message>
<xml_diff>
--- a/Testing.docx
+++ b/Testing.docx
@@ -4,7 +4,7 @@
   <w:body>
     <w:tbl>
       <w:tblPr>
-        <w:tblStyle w:val="11"/>
+        <w:tblStyle w:val="697"/>
         <w:tblW w:w="0" w:type="auto"/>
         <w:tblBorders/>
         <w:tblLayout w:type="fixed"/>
@@ -12,13 +12,13 @@
       </w:tblPr>
       <w:tblGrid>
         <w:gridCol w:w="1033"/>
-        <w:gridCol w:w="1133"/>
-        <w:gridCol w:w="1316"/>
-        <w:gridCol w:w="1016"/>
-        <w:gridCol w:w="1030"/>
-        <w:gridCol w:w="913"/>
-        <w:gridCol w:w="972"/>
-        <w:gridCol w:w="972"/>
+        <w:gridCol w:w="1376"/>
+        <w:gridCol w:w="1559"/>
+        <w:gridCol w:w="850"/>
+        <w:gridCol w:w="1276"/>
+        <w:gridCol w:w="992"/>
+        <w:gridCol w:w="1559"/>
+        <w:gridCol w:w="1417"/>
       </w:tblGrid>
       <w:tr>
         <w:trPr/>
@@ -45,7 +45,7 @@
         <w:tc>
           <w:tcPr>
             <w:tcBorders/>
-            <w:tcW w:w="1133" w:type="dxa"/>
+            <w:tcW w:w="1376" w:type="dxa"/>
             <w:textDirection w:val="lrTb"/>
             <w:noWrap w:val="false"/>
           </w:tcPr>
@@ -65,7 +65,7 @@
         <w:tc>
           <w:tcPr>
             <w:tcBorders/>
-            <w:tcW w:w="1316" w:type="dxa"/>
+            <w:tcW w:w="1559" w:type="dxa"/>
             <w:textDirection w:val="lrTb"/>
             <w:noWrap w:val="false"/>
           </w:tcPr>
@@ -85,7 +85,7 @@
         <w:tc>
           <w:tcPr>
             <w:tcBorders/>
-            <w:tcW w:w="1016" w:type="dxa"/>
+            <w:tcW w:w="850" w:type="dxa"/>
             <w:textDirection w:val="lrTb"/>
             <w:noWrap w:val="false"/>
           </w:tcPr>
@@ -105,7 +105,7 @@
         <w:tc>
           <w:tcPr>
             <w:tcBorders/>
-            <w:tcW w:w="1030" w:type="dxa"/>
+            <w:tcW w:w="1276" w:type="dxa"/>
             <w:textDirection w:val="lrTb"/>
             <w:noWrap w:val="false"/>
           </w:tcPr>
@@ -125,7 +125,7 @@
         <w:tc>
           <w:tcPr>
             <w:tcBorders/>
-            <w:tcW w:w="913" w:type="dxa"/>
+            <w:tcW w:w="992" w:type="dxa"/>
             <w:textDirection w:val="lrTb"/>
             <w:noWrap w:val="false"/>
           </w:tcPr>
@@ -145,7 +145,7 @@
         <w:tc>
           <w:tcPr>
             <w:tcBorders/>
-            <w:tcW w:w="972" w:type="dxa"/>
+            <w:tcW w:w="1559" w:type="dxa"/>
             <w:textDirection w:val="lrTb"/>
             <w:noWrap w:val="false"/>
           </w:tcPr>
@@ -165,7 +165,7 @@
         <w:tc>
           <w:tcPr>
             <w:tcBorders/>
-            <w:tcW w:w="972" w:type="dxa"/>
+            <w:tcW w:w="1417" w:type="dxa"/>
             <w:textDirection w:val="lrTb"/>
             <w:noWrap w:val="false"/>
           </w:tcPr>
@@ -206,7 +206,7 @@
         <w:tc>
           <w:tcPr>
             <w:tcBorders/>
-            <w:tcW w:w="1133" w:type="dxa"/>
+            <w:tcW w:w="1376" w:type="dxa"/>
             <w:textDirection w:val="lrTb"/>
             <w:noWrap w:val="false"/>
           </w:tcPr>
@@ -224,7 +224,7 @@
         <w:tc>
           <w:tcPr>
             <w:tcBorders/>
-            <w:tcW w:w="1316" w:type="dxa"/>
+            <w:tcW w:w="1559" w:type="dxa"/>
             <w:textDirection w:val="lrTb"/>
             <w:noWrap w:val="false"/>
           </w:tcPr>
@@ -242,7 +242,7 @@
         <w:tc>
           <w:tcPr>
             <w:tcBorders/>
-            <w:tcW w:w="1016" w:type="dxa"/>
+            <w:tcW w:w="850" w:type="dxa"/>
             <w:textDirection w:val="lrTb"/>
             <w:noWrap w:val="false"/>
           </w:tcPr>
@@ -260,7 +260,7 @@
         <w:tc>
           <w:tcPr>
             <w:tcBorders/>
-            <w:tcW w:w="1030" w:type="dxa"/>
+            <w:tcW w:w="1276" w:type="dxa"/>
             <w:textDirection w:val="lrTb"/>
             <w:noWrap w:val="false"/>
           </w:tcPr>
@@ -278,7 +278,7 @@
         <w:tc>
           <w:tcPr>
             <w:tcBorders/>
-            <w:tcW w:w="913" w:type="dxa"/>
+            <w:tcW w:w="992" w:type="dxa"/>
             <w:textDirection w:val="lrTb"/>
             <w:noWrap w:val="false"/>
           </w:tcPr>
@@ -296,7 +296,7 @@
         <w:tc>
           <w:tcPr>
             <w:tcBorders/>
-            <w:tcW w:w="972" w:type="dxa"/>
+            <w:tcW w:w="1559" w:type="dxa"/>
             <w:textDirection w:val="lrTb"/>
             <w:noWrap w:val="false"/>
           </w:tcPr>
@@ -314,7 +314,7 @@
         <w:tc>
           <w:tcPr>
             <w:tcBorders/>
-            <w:tcW w:w="972" w:type="dxa"/>
+            <w:tcW w:w="1417" w:type="dxa"/>
             <w:textDirection w:val="lrTb"/>
             <w:noWrap w:val="false"/>
           </w:tcPr>
@@ -363,7 +363,6 @@
         <w:ind/>
         <w:rPr/>
       </w:pPr>
-      <w:r/>
       <w:r>
         <w:separator/>
       </w:r>
@@ -378,7 +377,6 @@
         <w:ind/>
         <w:rPr/>
       </w:pPr>
-      <w:r/>
       <w:r>
         <w:continuationSeparator/>
       </w:r>
@@ -398,7 +396,6 @@
         <w:ind/>
         <w:rPr/>
       </w:pPr>
-      <w:r/>
       <w:r>
         <w:separator/>
       </w:r>
@@ -413,7 +410,6 @@
         <w:ind/>
         <w:rPr/>
       </w:pPr>
-      <w:r/>
       <w:r>
         <w:continuationSeparator/>
       </w:r>
@@ -581,9 +577,9 @@
     <w:lsdException w:name="Bibliography" w:uiPriority="37"/>
     <w:lsdException w:name="TOC Heading" w:uiPriority="39" w:qFormat="1"/>
   </w:latentStyles>
-  <w:style w:type="table" w:styleId="11">
+  <w:style w:type="table" w:styleId="697">
     <w:name w:val="Table Grid"/>
-    <w:basedOn w:val="661"/>
+    <w:basedOn w:val="882"/>
     <w:uiPriority w:val="59"/>
     <w:pPr>
       <w:pBdr/>
@@ -780,9 +776,9 @@
       </w:tcPr>
     </w:tblStylePr>
   </w:style>
-  <w:style w:type="table" w:styleId="12">
+  <w:style w:type="table" w:styleId="698">
     <w:name w:val="Table Grid Light"/>
-    <w:basedOn w:val="661"/>
+    <w:basedOn w:val="882"/>
     <w:uiPriority w:val="59"/>
     <w:pPr>
       <w:pBdr/>
@@ -979,9 +975,9 @@
       </w:tcPr>
     </w:tblStylePr>
   </w:style>
-  <w:style w:type="table" w:styleId="13">
+  <w:style w:type="table" w:styleId="699">
     <w:name w:val="Plain Table 1"/>
-    <w:basedOn w:val="661"/>
+    <w:basedOn w:val="882"/>
     <w:uiPriority w:val="59"/>
     <w:pPr>
       <w:pBdr/>
@@ -1204,9 +1200,9 @@
       </w:tcPr>
     </w:tblStylePr>
   </w:style>
-  <w:style w:type="table" w:styleId="14">
+  <w:style w:type="table" w:styleId="700">
     <w:name w:val="Plain Table 2"/>
-    <w:basedOn w:val="661"/>
+    <w:basedOn w:val="882"/>
     <w:uiPriority w:val="59"/>
     <w:pPr>
       <w:pBdr/>
@@ -1437,9 +1433,9 @@
       </w:tcPr>
     </w:tblStylePr>
   </w:style>
-  <w:style w:type="table" w:styleId="15">
+  <w:style w:type="table" w:styleId="701">
     <w:name w:val="Plain Table 3"/>
-    <w:basedOn w:val="661"/>
+    <w:basedOn w:val="882"/>
     <w:uiPriority w:val="99"/>
     <w:pPr>
       <w:pBdr/>
@@ -1667,9 +1663,9 @@
       </w:tcPr>
     </w:tblStylePr>
   </w:style>
-  <w:style w:type="table" w:styleId="16">
+  <w:style w:type="table" w:styleId="702">
     <w:name w:val="Plain Table 4"/>
-    <w:basedOn w:val="661"/>
+    <w:basedOn w:val="882"/>
     <w:uiPriority w:val="99"/>
     <w:pPr>
       <w:pBdr/>
@@ -1883,9 +1879,9 @@
       </w:tcPr>
     </w:tblStylePr>
   </w:style>
-  <w:style w:type="table" w:styleId="17">
+  <w:style w:type="table" w:styleId="703">
     <w:name w:val="Plain Table 5"/>
-    <w:basedOn w:val="661"/>
+    <w:basedOn w:val="882"/>
     <w:uiPriority w:val="99"/>
     <w:pPr>
       <w:pBdr/>
@@ -2116,9 +2112,9 @@
       </w:tcPr>
     </w:tblStylePr>
   </w:style>
-  <w:style w:type="table" w:styleId="18">
+  <w:style w:type="table" w:styleId="704">
     <w:name w:val="Grid Table 1 Light"/>
-    <w:basedOn w:val="661"/>
+    <w:basedOn w:val="882"/>
     <w:uiPriority w:val="99"/>
     <w:pPr>
       <w:pBdr/>
@@ -2339,9 +2335,9 @@
       </w:tcPr>
     </w:tblStylePr>
   </w:style>
-  <w:style w:type="table" w:styleId="19">
+  <w:style w:type="table" w:styleId="705">
     <w:name w:val="Grid Table 1 Light - Accent 1"/>
-    <w:basedOn w:val="661"/>
+    <w:basedOn w:val="882"/>
     <w:uiPriority w:val="99"/>
     <w:pPr>
       <w:pBdr/>
@@ -2562,9 +2558,9 @@
       </w:tcPr>
     </w:tblStylePr>
   </w:style>
-  <w:style w:type="table" w:styleId="20">
+  <w:style w:type="table" w:styleId="706">
     <w:name w:val="Grid Table 1 Light - Accent 2"/>
-    <w:basedOn w:val="661"/>
+    <w:basedOn w:val="882"/>
     <w:uiPriority w:val="99"/>
     <w:pPr>
       <w:pBdr/>
@@ -2785,9 +2781,9 @@
       </w:tcPr>
     </w:tblStylePr>
   </w:style>
-  <w:style w:type="table" w:styleId="21">
+  <w:style w:type="table" w:styleId="707">
     <w:name w:val="Grid Table 1 Light - Accent 3"/>
-    <w:basedOn w:val="661"/>
+    <w:basedOn w:val="882"/>
     <w:uiPriority w:val="99"/>
     <w:pPr>
       <w:pBdr/>
@@ -3008,9 +3004,9 @@
       </w:tcPr>
     </w:tblStylePr>
   </w:style>
-  <w:style w:type="table" w:styleId="22">
+  <w:style w:type="table" w:styleId="708">
     <w:name w:val="Grid Table 1 Light - Accent 4"/>
-    <w:basedOn w:val="661"/>
+    <w:basedOn w:val="882"/>
     <w:uiPriority w:val="99"/>
     <w:pPr>
       <w:pBdr/>
@@ -3231,9 +3227,9 @@
       </w:tcPr>
     </w:tblStylePr>
   </w:style>
-  <w:style w:type="table" w:styleId="23">
+  <w:style w:type="table" w:styleId="709">
     <w:name w:val="Grid Table 1 Light - Accent 5"/>
-    <w:basedOn w:val="661"/>
+    <w:basedOn w:val="882"/>
     <w:uiPriority w:val="99"/>
     <w:pPr>
       <w:pBdr/>
@@ -3454,9 +3450,9 @@
       </w:tcPr>
     </w:tblStylePr>
   </w:style>
-  <w:style w:type="table" w:styleId="24">
+  <w:style w:type="table" w:styleId="710">
     <w:name w:val="Grid Table 1 Light - Accent 6"/>
-    <w:basedOn w:val="661"/>
+    <w:basedOn w:val="882"/>
     <w:uiPriority w:val="99"/>
     <w:pPr>
       <w:pBdr/>
@@ -3677,9 +3673,9 @@
       </w:tcPr>
     </w:tblStylePr>
   </w:style>
-  <w:style w:type="table" w:styleId="25">
+  <w:style w:type="table" w:styleId="711">
     <w:name w:val="Grid Table 2"/>
-    <w:basedOn w:val="661"/>
+    <w:basedOn w:val="882"/>
     <w:uiPriority w:val="99"/>
     <w:pPr>
       <w:pBdr/>
@@ -3909,9 +3905,9 @@
       </w:tcPr>
     </w:tblStylePr>
   </w:style>
-  <w:style w:type="table" w:styleId="26">
+  <w:style w:type="table" w:styleId="712">
     <w:name w:val="Grid Table 2 - Accent 1"/>
-    <w:basedOn w:val="661"/>
+    <w:basedOn w:val="882"/>
     <w:uiPriority w:val="99"/>
     <w:pPr>
       <w:pBdr/>
@@ -4141,9 +4137,9 @@
       </w:tcPr>
     </w:tblStylePr>
   </w:style>
-  <w:style w:type="table" w:styleId="27">
+  <w:style w:type="table" w:styleId="713">
     <w:name w:val="Grid Table 2 - Accent 2"/>
-    <w:basedOn w:val="661"/>
+    <w:basedOn w:val="882"/>
     <w:uiPriority w:val="99"/>
     <w:pPr>
       <w:pBdr/>
@@ -4373,9 +4369,9 @@
       </w:tcPr>
     </w:tblStylePr>
   </w:style>
-  <w:style w:type="table" w:styleId="28">
+  <w:style w:type="table" w:styleId="714">
     <w:name w:val="Grid Table 2 - Accent 3"/>
-    <w:basedOn w:val="661"/>
+    <w:basedOn w:val="882"/>
     <w:uiPriority w:val="99"/>
     <w:pPr>
       <w:pBdr/>
@@ -4605,9 +4601,9 @@
       </w:tcPr>
     </w:tblStylePr>
   </w:style>
-  <w:style w:type="table" w:styleId="29">
+  <w:style w:type="table" w:styleId="715">
     <w:name w:val="Grid Table 2 - Accent 4"/>
-    <w:basedOn w:val="661"/>
+    <w:basedOn w:val="882"/>
     <w:uiPriority w:val="99"/>
     <w:pPr>
       <w:pBdr/>
@@ -4837,9 +4833,9 @@
       </w:tcPr>
     </w:tblStylePr>
   </w:style>
-  <w:style w:type="table" w:styleId="30">
+  <w:style w:type="table" w:styleId="716">
     <w:name w:val="Grid Table 2 - Accent 5"/>
-    <w:basedOn w:val="661"/>
+    <w:basedOn w:val="882"/>
     <w:uiPriority w:val="99"/>
     <w:pPr>
       <w:pBdr/>
@@ -5069,9 +5065,9 @@
       </w:tcPr>
     </w:tblStylePr>
   </w:style>
-  <w:style w:type="table" w:styleId="31">
+  <w:style w:type="table" w:styleId="717">
     <w:name w:val="Grid Table 2 - Accent 6"/>
-    <w:basedOn w:val="661"/>
+    <w:basedOn w:val="882"/>
     <w:uiPriority w:val="99"/>
     <w:pPr>
       <w:pBdr/>
@@ -5301,9 +5297,9 @@
       </w:tcPr>
     </w:tblStylePr>
   </w:style>
-  <w:style w:type="table" w:styleId="32">
+  <w:style w:type="table" w:styleId="718">
     <w:name w:val="Grid Table 3"/>
-    <w:basedOn w:val="661"/>
+    <w:basedOn w:val="882"/>
     <w:uiPriority w:val="99"/>
     <w:pPr>
       <w:pBdr/>
@@ -5402,29 +5398,6 @@
         <w:tblBorders/>
       </w:tblPr>
       <w:tcPr>
-        <w:shd w:color="ffffff"/>
-        <w:tcBorders>
-          <w:top w:val="none" w:color="000000" w:sz="4" w:space="0"/>
-          <w:left w:val="none" w:color="000000" w:sz="4" w:space="0"/>
-          <w:bottom w:val="none" w:color="000000" w:sz="4" w:space="0"/>
-          <w:right w:val="none" w:color="000000" w:sz="4" w:space="0"/>
-        </w:tcBorders>
-      </w:tcPr>
-    </w:tblStylePr>
-    <w:tblStylePr w:type="firstRow">
-      <w:rPr>
-        <w:b/>
-        <w:color w:val="404040"/>
-      </w:rPr>
-      <w:pPr>
-        <w:pBdr/>
-        <w:spacing/>
-        <w:ind/>
-      </w:pPr>
-      <w:tblPr>
-        <w:tblBorders/>
-      </w:tblPr>
-      <w:tcPr>
         <w:shd w:val="clear" w:color="ffffff"/>
         <w:tcBorders>
           <w:top w:val="none" w:color="000000" w:sz="4" w:space="0"/>
@@ -5434,30 +5407,7 @@
         </w:tcBorders>
       </w:tcPr>
     </w:tblStylePr>
-    <w:tblStylePr w:type="lastCol">
-      <w:rPr>
-        <w:i/>
-        <w:color w:val="404040"/>
-      </w:rPr>
-      <w:pPr>
-        <w:pBdr/>
-        <w:spacing/>
-        <w:ind/>
-      </w:pPr>
-      <w:tblPr>
-        <w:tblBorders/>
-      </w:tblPr>
-      <w:tcPr>
-        <w:shd w:color="ffffff"/>
-        <w:tcBorders>
-          <w:top w:val="none" w:color="000000" w:sz="4" w:space="0"/>
-          <w:left w:val="none" w:color="000000" w:sz="4" w:space="0"/>
-          <w:bottom w:val="none" w:color="000000" w:sz="4" w:space="0"/>
-          <w:right w:val="none" w:color="000000" w:sz="4" w:space="0"/>
-        </w:tcBorders>
-      </w:tcPr>
-    </w:tblStylePr>
-    <w:tblStylePr w:type="lastRow">
+    <w:tblStylePr w:type="firstRow">
       <w:rPr>
         <w:b/>
         <w:color w:val="404040"/>
@@ -5480,6 +5430,52 @@
         </w:tcBorders>
       </w:tcPr>
     </w:tblStylePr>
+    <w:tblStylePr w:type="lastCol">
+      <w:rPr>
+        <w:i/>
+        <w:color w:val="404040"/>
+      </w:rPr>
+      <w:pPr>
+        <w:pBdr/>
+        <w:spacing/>
+        <w:ind/>
+      </w:pPr>
+      <w:tblPr>
+        <w:tblBorders/>
+      </w:tblPr>
+      <w:tcPr>
+        <w:shd w:val="clear" w:color="ffffff"/>
+        <w:tcBorders>
+          <w:top w:val="none" w:color="000000" w:sz="4" w:space="0"/>
+          <w:left w:val="none" w:color="000000" w:sz="4" w:space="0"/>
+          <w:bottom w:val="none" w:color="000000" w:sz="4" w:space="0"/>
+          <w:right w:val="none" w:color="000000" w:sz="4" w:space="0"/>
+        </w:tcBorders>
+      </w:tcPr>
+    </w:tblStylePr>
+    <w:tblStylePr w:type="lastRow">
+      <w:rPr>
+        <w:b/>
+        <w:color w:val="404040"/>
+      </w:rPr>
+      <w:pPr>
+        <w:pBdr/>
+        <w:spacing/>
+        <w:ind/>
+      </w:pPr>
+      <w:tblPr>
+        <w:tblBorders/>
+      </w:tblPr>
+      <w:tcPr>
+        <w:shd w:val="clear" w:color="ffffff"/>
+        <w:tcBorders>
+          <w:top w:val="none" w:color="000000" w:sz="4" w:space="0"/>
+          <w:left w:val="none" w:color="000000" w:sz="4" w:space="0"/>
+          <w:bottom w:val="none" w:color="000000" w:sz="4" w:space="0"/>
+          <w:right w:val="none" w:color="000000" w:sz="4" w:space="0"/>
+        </w:tcBorders>
+      </w:tcPr>
+    </w:tblStylePr>
     <w:tblStylePr w:type="nwCell">
       <w:pPr>
         <w:pBdr/>
@@ -5546,9 +5542,9 @@
       </w:tcPr>
     </w:tblStylePr>
   </w:style>
-  <w:style w:type="table" w:styleId="33">
+  <w:style w:type="table" w:styleId="719">
     <w:name w:val="Grid Table 3 - Accent 1"/>
-    <w:basedOn w:val="661"/>
+    <w:basedOn w:val="882"/>
     <w:uiPriority w:val="99"/>
     <w:pPr>
       <w:pBdr/>
@@ -5647,29 +5643,6 @@
         <w:tblBorders/>
       </w:tblPr>
       <w:tcPr>
-        <w:shd w:color="ffffff"/>
-        <w:tcBorders>
-          <w:top w:val="none" w:color="000000" w:sz="4" w:space="0"/>
-          <w:left w:val="none" w:color="000000" w:sz="4" w:space="0"/>
-          <w:bottom w:val="none" w:color="000000" w:sz="4" w:space="0"/>
-          <w:right w:val="none" w:color="000000" w:sz="4" w:space="0"/>
-        </w:tcBorders>
-      </w:tcPr>
-    </w:tblStylePr>
-    <w:tblStylePr w:type="firstRow">
-      <w:rPr>
-        <w:b/>
-        <w:color w:val="404040"/>
-      </w:rPr>
-      <w:pPr>
-        <w:pBdr/>
-        <w:spacing/>
-        <w:ind/>
-      </w:pPr>
-      <w:tblPr>
-        <w:tblBorders/>
-      </w:tblPr>
-      <w:tcPr>
         <w:shd w:val="clear" w:color="ffffff"/>
         <w:tcBorders>
           <w:top w:val="none" w:color="000000" w:sz="4" w:space="0"/>
@@ -5679,30 +5652,7 @@
         </w:tcBorders>
       </w:tcPr>
     </w:tblStylePr>
-    <w:tblStylePr w:type="lastCol">
-      <w:rPr>
-        <w:i/>
-        <w:color w:val="404040"/>
-      </w:rPr>
-      <w:pPr>
-        <w:pBdr/>
-        <w:spacing/>
-        <w:ind/>
-      </w:pPr>
-      <w:tblPr>
-        <w:tblBorders/>
-      </w:tblPr>
-      <w:tcPr>
-        <w:shd w:color="ffffff"/>
-        <w:tcBorders>
-          <w:top w:val="none" w:color="000000" w:sz="4" w:space="0"/>
-          <w:left w:val="none" w:color="000000" w:sz="4" w:space="0"/>
-          <w:bottom w:val="none" w:color="000000" w:sz="4" w:space="0"/>
-          <w:right w:val="none" w:color="000000" w:sz="4" w:space="0"/>
-        </w:tcBorders>
-      </w:tcPr>
-    </w:tblStylePr>
-    <w:tblStylePr w:type="lastRow">
+    <w:tblStylePr w:type="firstRow">
       <w:rPr>
         <w:b/>
         <w:color w:val="404040"/>
@@ -5725,6 +5675,52 @@
         </w:tcBorders>
       </w:tcPr>
     </w:tblStylePr>
+    <w:tblStylePr w:type="lastCol">
+      <w:rPr>
+        <w:i/>
+        <w:color w:val="404040"/>
+      </w:rPr>
+      <w:pPr>
+        <w:pBdr/>
+        <w:spacing/>
+        <w:ind/>
+      </w:pPr>
+      <w:tblPr>
+        <w:tblBorders/>
+      </w:tblPr>
+      <w:tcPr>
+        <w:shd w:val="clear" w:color="ffffff"/>
+        <w:tcBorders>
+          <w:top w:val="none" w:color="000000" w:sz="4" w:space="0"/>
+          <w:left w:val="none" w:color="000000" w:sz="4" w:space="0"/>
+          <w:bottom w:val="none" w:color="000000" w:sz="4" w:space="0"/>
+          <w:right w:val="none" w:color="000000" w:sz="4" w:space="0"/>
+        </w:tcBorders>
+      </w:tcPr>
+    </w:tblStylePr>
+    <w:tblStylePr w:type="lastRow">
+      <w:rPr>
+        <w:b/>
+        <w:color w:val="404040"/>
+      </w:rPr>
+      <w:pPr>
+        <w:pBdr/>
+        <w:spacing/>
+        <w:ind/>
+      </w:pPr>
+      <w:tblPr>
+        <w:tblBorders/>
+      </w:tblPr>
+      <w:tcPr>
+        <w:shd w:val="clear" w:color="ffffff"/>
+        <w:tcBorders>
+          <w:top w:val="none" w:color="000000" w:sz="4" w:space="0"/>
+          <w:left w:val="none" w:color="000000" w:sz="4" w:space="0"/>
+          <w:bottom w:val="none" w:color="000000" w:sz="4" w:space="0"/>
+          <w:right w:val="none" w:color="000000" w:sz="4" w:space="0"/>
+        </w:tcBorders>
+      </w:tcPr>
+    </w:tblStylePr>
     <w:tblStylePr w:type="nwCell">
       <w:pPr>
         <w:pBdr/>
@@ -5791,9 +5787,9 @@
       </w:tcPr>
     </w:tblStylePr>
   </w:style>
-  <w:style w:type="table" w:styleId="34">
+  <w:style w:type="table" w:styleId="720">
     <w:name w:val="Grid Table 3 - Accent 2"/>
-    <w:basedOn w:val="661"/>
+    <w:basedOn w:val="882"/>
     <w:uiPriority w:val="99"/>
     <w:pPr>
       <w:pBdr/>
@@ -5892,29 +5888,6 @@
         <w:tblBorders/>
       </w:tblPr>
       <w:tcPr>
-        <w:shd w:color="ffffff"/>
-        <w:tcBorders>
-          <w:top w:val="none" w:color="000000" w:sz="4" w:space="0"/>
-          <w:left w:val="none" w:color="000000" w:sz="4" w:space="0"/>
-          <w:bottom w:val="none" w:color="000000" w:sz="4" w:space="0"/>
-          <w:right w:val="none" w:color="000000" w:sz="4" w:space="0"/>
-        </w:tcBorders>
-      </w:tcPr>
-    </w:tblStylePr>
-    <w:tblStylePr w:type="firstRow">
-      <w:rPr>
-        <w:b/>
-        <w:color w:val="404040"/>
-      </w:rPr>
-      <w:pPr>
-        <w:pBdr/>
-        <w:spacing/>
-        <w:ind/>
-      </w:pPr>
-      <w:tblPr>
-        <w:tblBorders/>
-      </w:tblPr>
-      <w:tcPr>
         <w:shd w:val="clear" w:color="ffffff"/>
         <w:tcBorders>
           <w:top w:val="none" w:color="000000" w:sz="4" w:space="0"/>
@@ -5924,30 +5897,7 @@
         </w:tcBorders>
       </w:tcPr>
     </w:tblStylePr>
-    <w:tblStylePr w:type="lastCol">
-      <w:rPr>
-        <w:i/>
-        <w:color w:val="404040"/>
-      </w:rPr>
-      <w:pPr>
-        <w:pBdr/>
-        <w:spacing/>
-        <w:ind/>
-      </w:pPr>
-      <w:tblPr>
-        <w:tblBorders/>
-      </w:tblPr>
-      <w:tcPr>
-        <w:shd w:color="ffffff"/>
-        <w:tcBorders>
-          <w:top w:val="none" w:color="000000" w:sz="4" w:space="0"/>
-          <w:left w:val="none" w:color="000000" w:sz="4" w:space="0"/>
-          <w:bottom w:val="none" w:color="000000" w:sz="4" w:space="0"/>
-          <w:right w:val="none" w:color="000000" w:sz="4" w:space="0"/>
-        </w:tcBorders>
-      </w:tcPr>
-    </w:tblStylePr>
-    <w:tblStylePr w:type="lastRow">
+    <w:tblStylePr w:type="firstRow">
       <w:rPr>
         <w:b/>
         <w:color w:val="404040"/>
@@ -5970,6 +5920,52 @@
         </w:tcBorders>
       </w:tcPr>
     </w:tblStylePr>
+    <w:tblStylePr w:type="lastCol">
+      <w:rPr>
+        <w:i/>
+        <w:color w:val="404040"/>
+      </w:rPr>
+      <w:pPr>
+        <w:pBdr/>
+        <w:spacing/>
+        <w:ind/>
+      </w:pPr>
+      <w:tblPr>
+        <w:tblBorders/>
+      </w:tblPr>
+      <w:tcPr>
+        <w:shd w:val="clear" w:color="ffffff"/>
+        <w:tcBorders>
+          <w:top w:val="none" w:color="000000" w:sz="4" w:space="0"/>
+          <w:left w:val="none" w:color="000000" w:sz="4" w:space="0"/>
+          <w:bottom w:val="none" w:color="000000" w:sz="4" w:space="0"/>
+          <w:right w:val="none" w:color="000000" w:sz="4" w:space="0"/>
+        </w:tcBorders>
+      </w:tcPr>
+    </w:tblStylePr>
+    <w:tblStylePr w:type="lastRow">
+      <w:rPr>
+        <w:b/>
+        <w:color w:val="404040"/>
+      </w:rPr>
+      <w:pPr>
+        <w:pBdr/>
+        <w:spacing/>
+        <w:ind/>
+      </w:pPr>
+      <w:tblPr>
+        <w:tblBorders/>
+      </w:tblPr>
+      <w:tcPr>
+        <w:shd w:val="clear" w:color="ffffff"/>
+        <w:tcBorders>
+          <w:top w:val="none" w:color="000000" w:sz="4" w:space="0"/>
+          <w:left w:val="none" w:color="000000" w:sz="4" w:space="0"/>
+          <w:bottom w:val="none" w:color="000000" w:sz="4" w:space="0"/>
+          <w:right w:val="none" w:color="000000" w:sz="4" w:space="0"/>
+        </w:tcBorders>
+      </w:tcPr>
+    </w:tblStylePr>
     <w:tblStylePr w:type="nwCell">
       <w:pPr>
         <w:pBdr/>
@@ -6036,9 +6032,9 @@
       </w:tcPr>
     </w:tblStylePr>
   </w:style>
-  <w:style w:type="table" w:styleId="35">
+  <w:style w:type="table" w:styleId="721">
     <w:name w:val="Grid Table 3 - Accent 3"/>
-    <w:basedOn w:val="661"/>
+    <w:basedOn w:val="882"/>
     <w:uiPriority w:val="99"/>
     <w:pPr>
       <w:pBdr/>
@@ -6137,29 +6133,6 @@
         <w:tblBorders/>
       </w:tblPr>
       <w:tcPr>
-        <w:shd w:color="ffffff"/>
-        <w:tcBorders>
-          <w:top w:val="none" w:color="000000" w:sz="4" w:space="0"/>
-          <w:left w:val="none" w:color="000000" w:sz="4" w:space="0"/>
-          <w:bottom w:val="none" w:color="000000" w:sz="4" w:space="0"/>
-          <w:right w:val="none" w:color="000000" w:sz="4" w:space="0"/>
-        </w:tcBorders>
-      </w:tcPr>
-    </w:tblStylePr>
-    <w:tblStylePr w:type="firstRow">
-      <w:rPr>
-        <w:b/>
-        <w:color w:val="404040"/>
-      </w:rPr>
-      <w:pPr>
-        <w:pBdr/>
-        <w:spacing/>
-        <w:ind/>
-      </w:pPr>
-      <w:tblPr>
-        <w:tblBorders/>
-      </w:tblPr>
-      <w:tcPr>
         <w:shd w:val="clear" w:color="ffffff"/>
         <w:tcBorders>
           <w:top w:val="none" w:color="000000" w:sz="4" w:space="0"/>
@@ -6169,30 +6142,7 @@
         </w:tcBorders>
       </w:tcPr>
     </w:tblStylePr>
-    <w:tblStylePr w:type="lastCol">
-      <w:rPr>
-        <w:i/>
-        <w:color w:val="404040"/>
-      </w:rPr>
-      <w:pPr>
-        <w:pBdr/>
-        <w:spacing/>
-        <w:ind/>
-      </w:pPr>
-      <w:tblPr>
-        <w:tblBorders/>
-      </w:tblPr>
-      <w:tcPr>
-        <w:shd w:color="ffffff"/>
-        <w:tcBorders>
-          <w:top w:val="none" w:color="000000" w:sz="4" w:space="0"/>
-          <w:left w:val="none" w:color="000000" w:sz="4" w:space="0"/>
-          <w:bottom w:val="none" w:color="000000" w:sz="4" w:space="0"/>
-          <w:right w:val="none" w:color="000000" w:sz="4" w:space="0"/>
-        </w:tcBorders>
-      </w:tcPr>
-    </w:tblStylePr>
-    <w:tblStylePr w:type="lastRow">
+    <w:tblStylePr w:type="firstRow">
       <w:rPr>
         <w:b/>
         <w:color w:val="404040"/>
@@ -6215,6 +6165,52 @@
         </w:tcBorders>
       </w:tcPr>
     </w:tblStylePr>
+    <w:tblStylePr w:type="lastCol">
+      <w:rPr>
+        <w:i/>
+        <w:color w:val="404040"/>
+      </w:rPr>
+      <w:pPr>
+        <w:pBdr/>
+        <w:spacing/>
+        <w:ind/>
+      </w:pPr>
+      <w:tblPr>
+        <w:tblBorders/>
+      </w:tblPr>
+      <w:tcPr>
+        <w:shd w:val="clear" w:color="ffffff"/>
+        <w:tcBorders>
+          <w:top w:val="none" w:color="000000" w:sz="4" w:space="0"/>
+          <w:left w:val="none" w:color="000000" w:sz="4" w:space="0"/>
+          <w:bottom w:val="none" w:color="000000" w:sz="4" w:space="0"/>
+          <w:right w:val="none" w:color="000000" w:sz="4" w:space="0"/>
+        </w:tcBorders>
+      </w:tcPr>
+    </w:tblStylePr>
+    <w:tblStylePr w:type="lastRow">
+      <w:rPr>
+        <w:b/>
+        <w:color w:val="404040"/>
+      </w:rPr>
+      <w:pPr>
+        <w:pBdr/>
+        <w:spacing/>
+        <w:ind/>
+      </w:pPr>
+      <w:tblPr>
+        <w:tblBorders/>
+      </w:tblPr>
+      <w:tcPr>
+        <w:shd w:val="clear" w:color="ffffff"/>
+        <w:tcBorders>
+          <w:top w:val="none" w:color="000000" w:sz="4" w:space="0"/>
+          <w:left w:val="none" w:color="000000" w:sz="4" w:space="0"/>
+          <w:bottom w:val="none" w:color="000000" w:sz="4" w:space="0"/>
+          <w:right w:val="none" w:color="000000" w:sz="4" w:space="0"/>
+        </w:tcBorders>
+      </w:tcPr>
+    </w:tblStylePr>
     <w:tblStylePr w:type="nwCell">
       <w:pPr>
         <w:pBdr/>
@@ -6281,9 +6277,9 @@
       </w:tcPr>
     </w:tblStylePr>
   </w:style>
-  <w:style w:type="table" w:styleId="36">
+  <w:style w:type="table" w:styleId="722">
     <w:name w:val="Grid Table 3 - Accent 4"/>
-    <w:basedOn w:val="661"/>
+    <w:basedOn w:val="882"/>
     <w:uiPriority w:val="99"/>
     <w:pPr>
       <w:pBdr/>
@@ -6382,29 +6378,6 @@
         <w:tblBorders/>
       </w:tblPr>
       <w:tcPr>
-        <w:shd w:color="ffffff"/>
-        <w:tcBorders>
-          <w:top w:val="none" w:color="000000" w:sz="4" w:space="0"/>
-          <w:left w:val="none" w:color="000000" w:sz="4" w:space="0"/>
-          <w:bottom w:val="none" w:color="000000" w:sz="4" w:space="0"/>
-          <w:right w:val="none" w:color="000000" w:sz="4" w:space="0"/>
-        </w:tcBorders>
-      </w:tcPr>
-    </w:tblStylePr>
-    <w:tblStylePr w:type="firstRow">
-      <w:rPr>
-        <w:b/>
-        <w:color w:val="404040"/>
-      </w:rPr>
-      <w:pPr>
-        <w:pBdr/>
-        <w:spacing/>
-        <w:ind/>
-      </w:pPr>
-      <w:tblPr>
-        <w:tblBorders/>
-      </w:tblPr>
-      <w:tcPr>
         <w:shd w:val="clear" w:color="ffffff"/>
         <w:tcBorders>
           <w:top w:val="none" w:color="000000" w:sz="4" w:space="0"/>
@@ -6414,30 +6387,7 @@
         </w:tcBorders>
       </w:tcPr>
     </w:tblStylePr>
-    <w:tblStylePr w:type="lastCol">
-      <w:rPr>
-        <w:i/>
-        <w:color w:val="404040"/>
-      </w:rPr>
-      <w:pPr>
-        <w:pBdr/>
-        <w:spacing/>
-        <w:ind/>
-      </w:pPr>
-      <w:tblPr>
-        <w:tblBorders/>
-      </w:tblPr>
-      <w:tcPr>
-        <w:shd w:color="ffffff"/>
-        <w:tcBorders>
-          <w:top w:val="none" w:color="000000" w:sz="4" w:space="0"/>
-          <w:left w:val="none" w:color="000000" w:sz="4" w:space="0"/>
-          <w:bottom w:val="none" w:color="000000" w:sz="4" w:space="0"/>
-          <w:right w:val="none" w:color="000000" w:sz="4" w:space="0"/>
-        </w:tcBorders>
-      </w:tcPr>
-    </w:tblStylePr>
-    <w:tblStylePr w:type="lastRow">
+    <w:tblStylePr w:type="firstRow">
       <w:rPr>
         <w:b/>
         <w:color w:val="404040"/>
@@ -6460,6 +6410,52 @@
         </w:tcBorders>
       </w:tcPr>
     </w:tblStylePr>
+    <w:tblStylePr w:type="lastCol">
+      <w:rPr>
+        <w:i/>
+        <w:color w:val="404040"/>
+      </w:rPr>
+      <w:pPr>
+        <w:pBdr/>
+        <w:spacing/>
+        <w:ind/>
+      </w:pPr>
+      <w:tblPr>
+        <w:tblBorders/>
+      </w:tblPr>
+      <w:tcPr>
+        <w:shd w:val="clear" w:color="ffffff"/>
+        <w:tcBorders>
+          <w:top w:val="none" w:color="000000" w:sz="4" w:space="0"/>
+          <w:left w:val="none" w:color="000000" w:sz="4" w:space="0"/>
+          <w:bottom w:val="none" w:color="000000" w:sz="4" w:space="0"/>
+          <w:right w:val="none" w:color="000000" w:sz="4" w:space="0"/>
+        </w:tcBorders>
+      </w:tcPr>
+    </w:tblStylePr>
+    <w:tblStylePr w:type="lastRow">
+      <w:rPr>
+        <w:b/>
+        <w:color w:val="404040"/>
+      </w:rPr>
+      <w:pPr>
+        <w:pBdr/>
+        <w:spacing/>
+        <w:ind/>
+      </w:pPr>
+      <w:tblPr>
+        <w:tblBorders/>
+      </w:tblPr>
+      <w:tcPr>
+        <w:shd w:val="clear" w:color="ffffff"/>
+        <w:tcBorders>
+          <w:top w:val="none" w:color="000000" w:sz="4" w:space="0"/>
+          <w:left w:val="none" w:color="000000" w:sz="4" w:space="0"/>
+          <w:bottom w:val="none" w:color="000000" w:sz="4" w:space="0"/>
+          <w:right w:val="none" w:color="000000" w:sz="4" w:space="0"/>
+        </w:tcBorders>
+      </w:tcPr>
+    </w:tblStylePr>
     <w:tblStylePr w:type="nwCell">
       <w:pPr>
         <w:pBdr/>
@@ -6526,9 +6522,9 @@
       </w:tcPr>
     </w:tblStylePr>
   </w:style>
-  <w:style w:type="table" w:styleId="37">
+  <w:style w:type="table" w:styleId="723">
     <w:name w:val="Grid Table 3 - Accent 5"/>
-    <w:basedOn w:val="661"/>
+    <w:basedOn w:val="882"/>
     <w:uiPriority w:val="99"/>
     <w:pPr>
       <w:pBdr/>
@@ -6627,29 +6623,6 @@
         <w:tblBorders/>
       </w:tblPr>
       <w:tcPr>
-        <w:shd w:color="ffffff"/>
-        <w:tcBorders>
-          <w:top w:val="none" w:color="000000" w:sz="4" w:space="0"/>
-          <w:left w:val="none" w:color="000000" w:sz="4" w:space="0"/>
-          <w:bottom w:val="none" w:color="000000" w:sz="4" w:space="0"/>
-          <w:right w:val="none" w:color="000000" w:sz="4" w:space="0"/>
-        </w:tcBorders>
-      </w:tcPr>
-    </w:tblStylePr>
-    <w:tblStylePr w:type="firstRow">
-      <w:rPr>
-        <w:b/>
-        <w:color w:val="404040"/>
-      </w:rPr>
-      <w:pPr>
-        <w:pBdr/>
-        <w:spacing/>
-        <w:ind/>
-      </w:pPr>
-      <w:tblPr>
-        <w:tblBorders/>
-      </w:tblPr>
-      <w:tcPr>
         <w:shd w:val="clear" w:color="ffffff"/>
         <w:tcBorders>
           <w:top w:val="none" w:color="000000" w:sz="4" w:space="0"/>
@@ -6659,30 +6632,7 @@
         </w:tcBorders>
       </w:tcPr>
     </w:tblStylePr>
-    <w:tblStylePr w:type="lastCol">
-      <w:rPr>
-        <w:i/>
-        <w:color w:val="404040"/>
-      </w:rPr>
-      <w:pPr>
-        <w:pBdr/>
-        <w:spacing/>
-        <w:ind/>
-      </w:pPr>
-      <w:tblPr>
-        <w:tblBorders/>
-      </w:tblPr>
-      <w:tcPr>
-        <w:shd w:color="ffffff"/>
-        <w:tcBorders>
-          <w:top w:val="none" w:color="000000" w:sz="4" w:space="0"/>
-          <w:left w:val="none" w:color="000000" w:sz="4" w:space="0"/>
-          <w:bottom w:val="none" w:color="000000" w:sz="4" w:space="0"/>
-          <w:right w:val="none" w:color="000000" w:sz="4" w:space="0"/>
-        </w:tcBorders>
-      </w:tcPr>
-    </w:tblStylePr>
-    <w:tblStylePr w:type="lastRow">
+    <w:tblStylePr w:type="firstRow">
       <w:rPr>
         <w:b/>
         <w:color w:val="404040"/>
@@ -6705,6 +6655,52 @@
         </w:tcBorders>
       </w:tcPr>
     </w:tblStylePr>
+    <w:tblStylePr w:type="lastCol">
+      <w:rPr>
+        <w:i/>
+        <w:color w:val="404040"/>
+      </w:rPr>
+      <w:pPr>
+        <w:pBdr/>
+        <w:spacing/>
+        <w:ind/>
+      </w:pPr>
+      <w:tblPr>
+        <w:tblBorders/>
+      </w:tblPr>
+      <w:tcPr>
+        <w:shd w:val="clear" w:color="ffffff"/>
+        <w:tcBorders>
+          <w:top w:val="none" w:color="000000" w:sz="4" w:space="0"/>
+          <w:left w:val="none" w:color="000000" w:sz="4" w:space="0"/>
+          <w:bottom w:val="none" w:color="000000" w:sz="4" w:space="0"/>
+          <w:right w:val="none" w:color="000000" w:sz="4" w:space="0"/>
+        </w:tcBorders>
+      </w:tcPr>
+    </w:tblStylePr>
+    <w:tblStylePr w:type="lastRow">
+      <w:rPr>
+        <w:b/>
+        <w:color w:val="404040"/>
+      </w:rPr>
+      <w:pPr>
+        <w:pBdr/>
+        <w:spacing/>
+        <w:ind/>
+      </w:pPr>
+      <w:tblPr>
+        <w:tblBorders/>
+      </w:tblPr>
+      <w:tcPr>
+        <w:shd w:val="clear" w:color="ffffff"/>
+        <w:tcBorders>
+          <w:top w:val="none" w:color="000000" w:sz="4" w:space="0"/>
+          <w:left w:val="none" w:color="000000" w:sz="4" w:space="0"/>
+          <w:bottom w:val="none" w:color="000000" w:sz="4" w:space="0"/>
+          <w:right w:val="none" w:color="000000" w:sz="4" w:space="0"/>
+        </w:tcBorders>
+      </w:tcPr>
+    </w:tblStylePr>
     <w:tblStylePr w:type="nwCell">
       <w:pPr>
         <w:pBdr/>
@@ -6771,9 +6767,9 @@
       </w:tcPr>
     </w:tblStylePr>
   </w:style>
-  <w:style w:type="table" w:styleId="38">
+  <w:style w:type="table" w:styleId="724">
     <w:name w:val="Grid Table 3 - Accent 6"/>
-    <w:basedOn w:val="661"/>
+    <w:basedOn w:val="882"/>
     <w:uiPriority w:val="99"/>
     <w:pPr>
       <w:pBdr/>
@@ -6872,29 +6868,6 @@
         <w:tblBorders/>
       </w:tblPr>
       <w:tcPr>
-        <w:shd w:color="ffffff"/>
-        <w:tcBorders>
-          <w:top w:val="none" w:color="000000" w:sz="4" w:space="0"/>
-          <w:left w:val="none" w:color="000000" w:sz="4" w:space="0"/>
-          <w:bottom w:val="none" w:color="000000" w:sz="4" w:space="0"/>
-          <w:right w:val="none" w:color="000000" w:sz="4" w:space="0"/>
-        </w:tcBorders>
-      </w:tcPr>
-    </w:tblStylePr>
-    <w:tblStylePr w:type="firstRow">
-      <w:rPr>
-        <w:b/>
-        <w:color w:val="404040"/>
-      </w:rPr>
-      <w:pPr>
-        <w:pBdr/>
-        <w:spacing/>
-        <w:ind/>
-      </w:pPr>
-      <w:tblPr>
-        <w:tblBorders/>
-      </w:tblPr>
-      <w:tcPr>
         <w:shd w:val="clear" w:color="ffffff"/>
         <w:tcBorders>
           <w:top w:val="none" w:color="000000" w:sz="4" w:space="0"/>
@@ -6904,30 +6877,7 @@
         </w:tcBorders>
       </w:tcPr>
     </w:tblStylePr>
-    <w:tblStylePr w:type="lastCol">
-      <w:rPr>
-        <w:i/>
-        <w:color w:val="404040"/>
-      </w:rPr>
-      <w:pPr>
-        <w:pBdr/>
-        <w:spacing/>
-        <w:ind/>
-      </w:pPr>
-      <w:tblPr>
-        <w:tblBorders/>
-      </w:tblPr>
-      <w:tcPr>
-        <w:shd w:color="ffffff"/>
-        <w:tcBorders>
-          <w:top w:val="none" w:color="000000" w:sz="4" w:space="0"/>
-          <w:left w:val="none" w:color="000000" w:sz="4" w:space="0"/>
-          <w:bottom w:val="none" w:color="000000" w:sz="4" w:space="0"/>
-          <w:right w:val="none" w:color="000000" w:sz="4" w:space="0"/>
-        </w:tcBorders>
-      </w:tcPr>
-    </w:tblStylePr>
-    <w:tblStylePr w:type="lastRow">
+    <w:tblStylePr w:type="firstRow">
       <w:rPr>
         <w:b/>
         <w:color w:val="404040"/>
@@ -6950,6 +6900,52 @@
         </w:tcBorders>
       </w:tcPr>
     </w:tblStylePr>
+    <w:tblStylePr w:type="lastCol">
+      <w:rPr>
+        <w:i/>
+        <w:color w:val="404040"/>
+      </w:rPr>
+      <w:pPr>
+        <w:pBdr/>
+        <w:spacing/>
+        <w:ind/>
+      </w:pPr>
+      <w:tblPr>
+        <w:tblBorders/>
+      </w:tblPr>
+      <w:tcPr>
+        <w:shd w:val="clear" w:color="ffffff"/>
+        <w:tcBorders>
+          <w:top w:val="none" w:color="000000" w:sz="4" w:space="0"/>
+          <w:left w:val="none" w:color="000000" w:sz="4" w:space="0"/>
+          <w:bottom w:val="none" w:color="000000" w:sz="4" w:space="0"/>
+          <w:right w:val="none" w:color="000000" w:sz="4" w:space="0"/>
+        </w:tcBorders>
+      </w:tcPr>
+    </w:tblStylePr>
+    <w:tblStylePr w:type="lastRow">
+      <w:rPr>
+        <w:b/>
+        <w:color w:val="404040"/>
+      </w:rPr>
+      <w:pPr>
+        <w:pBdr/>
+        <w:spacing/>
+        <w:ind/>
+      </w:pPr>
+      <w:tblPr>
+        <w:tblBorders/>
+      </w:tblPr>
+      <w:tcPr>
+        <w:shd w:val="clear" w:color="ffffff"/>
+        <w:tcBorders>
+          <w:top w:val="none" w:color="000000" w:sz="4" w:space="0"/>
+          <w:left w:val="none" w:color="000000" w:sz="4" w:space="0"/>
+          <w:bottom w:val="none" w:color="000000" w:sz="4" w:space="0"/>
+          <w:right w:val="none" w:color="000000" w:sz="4" w:space="0"/>
+        </w:tcBorders>
+      </w:tcPr>
+    </w:tblStylePr>
     <w:tblStylePr w:type="nwCell">
       <w:pPr>
         <w:pBdr/>
@@ -7016,9 +7012,9 @@
       </w:tcPr>
     </w:tblStylePr>
   </w:style>
-  <w:style w:type="table" w:styleId="39">
+  <w:style w:type="table" w:styleId="725">
     <w:name w:val="Grid Table 4"/>
-    <w:basedOn w:val="661"/>
+    <w:basedOn w:val="882"/>
     <w:uiPriority w:val="59"/>
     <w:pPr>
       <w:pBdr/>
@@ -7249,9 +7245,9 @@
       </w:tcPr>
     </w:tblStylePr>
   </w:style>
-  <w:style w:type="table" w:styleId="40">
+  <w:style w:type="table" w:styleId="726">
     <w:name w:val="Grid Table 4 - Accent 1"/>
-    <w:basedOn w:val="661"/>
+    <w:basedOn w:val="882"/>
     <w:uiPriority w:val="59"/>
     <w:pPr>
       <w:pBdr/>
@@ -7482,9 +7478,9 @@
       </w:tcPr>
     </w:tblStylePr>
   </w:style>
-  <w:style w:type="table" w:styleId="41">
+  <w:style w:type="table" w:styleId="727">
     <w:name w:val="Grid Table 4 - Accent 2"/>
-    <w:basedOn w:val="661"/>
+    <w:basedOn w:val="882"/>
     <w:uiPriority w:val="59"/>
     <w:pPr>
       <w:pBdr/>
@@ -7715,9 +7711,9 @@
       </w:tcPr>
     </w:tblStylePr>
   </w:style>
-  <w:style w:type="table" w:styleId="42">
+  <w:style w:type="table" w:styleId="728">
     <w:name w:val="Grid Table 4 - Accent 3"/>
-    <w:basedOn w:val="661"/>
+    <w:basedOn w:val="882"/>
     <w:uiPriority w:val="59"/>
     <w:pPr>
       <w:pBdr/>
@@ -7948,9 +7944,9 @@
       </w:tcPr>
     </w:tblStylePr>
   </w:style>
-  <w:style w:type="table" w:styleId="43">
+  <w:style w:type="table" w:styleId="729">
     <w:name w:val="Grid Table 4 - Accent 4"/>
-    <w:basedOn w:val="661"/>
+    <w:basedOn w:val="882"/>
     <w:uiPriority w:val="59"/>
     <w:pPr>
       <w:pBdr/>
@@ -8181,9 +8177,9 @@
       </w:tcPr>
     </w:tblStylePr>
   </w:style>
-  <w:style w:type="table" w:styleId="44">
+  <w:style w:type="table" w:styleId="730">
     <w:name w:val="Grid Table 4 - Accent 5"/>
-    <w:basedOn w:val="661"/>
+    <w:basedOn w:val="882"/>
     <w:uiPriority w:val="59"/>
     <w:pPr>
       <w:pBdr/>
@@ -8414,9 +8410,9 @@
       </w:tcPr>
     </w:tblStylePr>
   </w:style>
-  <w:style w:type="table" w:styleId="45">
+  <w:style w:type="table" w:styleId="731">
     <w:name w:val="Grid Table 4 - Accent 6"/>
-    <w:basedOn w:val="661"/>
+    <w:basedOn w:val="882"/>
     <w:uiPriority w:val="59"/>
     <w:pPr>
       <w:pBdr/>
@@ -8647,9 +8643,9 @@
       </w:tcPr>
     </w:tblStylePr>
   </w:style>
-  <w:style w:type="table" w:styleId="46">
+  <w:style w:type="table" w:styleId="732">
     <w:name w:val="Grid Table 5 Dark"/>
-    <w:basedOn w:val="661"/>
+    <w:basedOn w:val="882"/>
     <w:uiPriority w:val="99"/>
     <w:pPr>
       <w:pBdr/>
@@ -8875,9 +8871,9 @@
       </w:tcPr>
     </w:tblStylePr>
   </w:style>
-  <w:style w:type="table" w:styleId="47">
+  <w:style w:type="table" w:styleId="733">
     <w:name w:val="Grid Table 5 Dark- Accent 1"/>
-    <w:basedOn w:val="661"/>
+    <w:basedOn w:val="882"/>
     <w:uiPriority w:val="99"/>
     <w:pPr>
       <w:pBdr/>
@@ -9103,9 +9099,9 @@
       </w:tcPr>
     </w:tblStylePr>
   </w:style>
-  <w:style w:type="table" w:styleId="48">
+  <w:style w:type="table" w:styleId="734">
     <w:name w:val="Grid Table 5 Dark - Accent 2"/>
-    <w:basedOn w:val="661"/>
+    <w:basedOn w:val="882"/>
     <w:uiPriority w:val="99"/>
     <w:pPr>
       <w:pBdr/>
@@ -9331,9 +9327,9 @@
       </w:tcPr>
     </w:tblStylePr>
   </w:style>
-  <w:style w:type="table" w:styleId="49">
+  <w:style w:type="table" w:styleId="735">
     <w:name w:val="Grid Table 5 Dark - Accent 3"/>
-    <w:basedOn w:val="661"/>
+    <w:basedOn w:val="882"/>
     <w:uiPriority w:val="99"/>
     <w:pPr>
       <w:pBdr/>
@@ -9559,9 +9555,9 @@
       </w:tcPr>
     </w:tblStylePr>
   </w:style>
-  <w:style w:type="table" w:styleId="50">
+  <w:style w:type="table" w:styleId="736">
     <w:name w:val="Grid Table 5 Dark- Accent 4"/>
-    <w:basedOn w:val="661"/>
+    <w:basedOn w:val="882"/>
     <w:uiPriority w:val="99"/>
     <w:pPr>
       <w:pBdr/>
@@ -9787,9 +9783,9 @@
       </w:tcPr>
     </w:tblStylePr>
   </w:style>
-  <w:style w:type="table" w:styleId="51">
+  <w:style w:type="table" w:styleId="737">
     <w:name w:val="Grid Table 5 Dark - Accent 5"/>
-    <w:basedOn w:val="661"/>
+    <w:basedOn w:val="882"/>
     <w:uiPriority w:val="99"/>
     <w:pPr>
       <w:pBdr/>
@@ -10015,9 +10011,9 @@
       </w:tcPr>
     </w:tblStylePr>
   </w:style>
-  <w:style w:type="table" w:styleId="52">
+  <w:style w:type="table" w:styleId="738">
     <w:name w:val="Grid Table 5 Dark - Accent 6"/>
-    <w:basedOn w:val="661"/>
+    <w:basedOn w:val="882"/>
     <w:uiPriority w:val="99"/>
     <w:pPr>
       <w:pBdr/>
@@ -10243,9 +10239,9 @@
       </w:tcPr>
     </w:tblStylePr>
   </w:style>
-  <w:style w:type="table" w:styleId="53">
+  <w:style w:type="table" w:styleId="739">
     <w:name w:val="Grid Table 6 Colorful"/>
-    <w:basedOn w:val="661"/>
+    <w:basedOn w:val="882"/>
     <w:uiPriority w:val="99"/>
     <w:pPr>
       <w:pBdr/>
@@ -10473,9 +10469,9 @@
       </w:tcPr>
     </w:tblStylePr>
   </w:style>
-  <w:style w:type="table" w:styleId="54">
+  <w:style w:type="table" w:styleId="740">
     <w:name w:val="Grid Table 6 Colorful - Accent 1"/>
-    <w:basedOn w:val="661"/>
+    <w:basedOn w:val="882"/>
     <w:uiPriority w:val="99"/>
     <w:pPr>
       <w:pBdr/>
@@ -10703,9 +10699,9 @@
       </w:tcPr>
     </w:tblStylePr>
   </w:style>
-  <w:style w:type="table" w:styleId="55">
+  <w:style w:type="table" w:styleId="741">
     <w:name w:val="Grid Table 6 Colorful - Accent 2"/>
-    <w:basedOn w:val="661"/>
+    <w:basedOn w:val="882"/>
     <w:uiPriority w:val="99"/>
     <w:pPr>
       <w:pBdr/>
@@ -10933,9 +10929,9 @@
       </w:tcPr>
     </w:tblStylePr>
   </w:style>
-  <w:style w:type="table" w:styleId="56">
+  <w:style w:type="table" w:styleId="742">
     <w:name w:val="Grid Table 6 Colorful - Accent 3"/>
-    <w:basedOn w:val="661"/>
+    <w:basedOn w:val="882"/>
     <w:uiPriority w:val="99"/>
     <w:pPr>
       <w:pBdr/>
@@ -11163,9 +11159,9 @@
       </w:tcPr>
     </w:tblStylePr>
   </w:style>
-  <w:style w:type="table" w:styleId="57">
+  <w:style w:type="table" w:styleId="743">
     <w:name w:val="Grid Table 6 Colorful - Accent 4"/>
-    <w:basedOn w:val="661"/>
+    <w:basedOn w:val="882"/>
     <w:uiPriority w:val="99"/>
     <w:pPr>
       <w:pBdr/>
@@ -11393,9 +11389,9 @@
       </w:tcPr>
     </w:tblStylePr>
   </w:style>
-  <w:style w:type="table" w:styleId="58">
+  <w:style w:type="table" w:styleId="744">
     <w:name w:val="Grid Table 6 Colorful - Accent 5"/>
-    <w:basedOn w:val="661"/>
+    <w:basedOn w:val="882"/>
     <w:uiPriority w:val="99"/>
     <w:pPr>
       <w:pBdr/>
@@ -11623,9 +11619,9 @@
       </w:tcPr>
     </w:tblStylePr>
   </w:style>
-  <w:style w:type="table" w:styleId="59">
+  <w:style w:type="table" w:styleId="745">
     <w:name w:val="Grid Table 6 Colorful - Accent 6"/>
-    <w:basedOn w:val="661"/>
+    <w:basedOn w:val="882"/>
     <w:uiPriority w:val="99"/>
     <w:pPr>
       <w:pBdr/>
@@ -11853,9 +11849,9 @@
       </w:tcPr>
     </w:tblStylePr>
   </w:style>
-  <w:style w:type="table" w:styleId="60">
+  <w:style w:type="table" w:styleId="746">
     <w:name w:val="Grid Table 7 Colorful"/>
-    <w:basedOn w:val="661"/>
+    <w:basedOn w:val="882"/>
     <w:uiPriority w:val="99"/>
     <w:pPr>
       <w:pBdr/>
@@ -11957,11 +11953,11 @@
         <w:tblBorders/>
       </w:tblPr>
       <w:tcPr>
-        <w:shd w:color="ffffff"/>
+        <w:shd w:val="clear" w:color="ffffff"/>
         <w:tcBorders>
-          <w:top w:val="none"/>
-          <w:left w:val="none"/>
-          <w:bottom w:val="none"/>
+          <w:top w:val="none" w:color="000000" w:sz="4" w:space="0"/>
+          <w:left w:val="none" w:color="000000" w:sz="4" w:space="0"/>
+          <w:bottom w:val="none" w:color="000000" w:sz="4" w:space="0"/>
           <w:right w:val="single" w:color="000000" w:themeColor="text1" w:themeTint="80" w:sz="4" w:space="0"/>
         </w:tcBorders>
       </w:tcPr>
@@ -11984,10 +11980,10 @@
       <w:tcPr>
         <w:shd w:val="clear" w:color="ffffff" w:themeColor="light1" w:fill="ffffff" w:themeFill="light1"/>
         <w:tcBorders>
-          <w:top w:val="none"/>
-          <w:left w:val="none"/>
+          <w:top w:val="none" w:color="000000" w:sz="4" w:space="0"/>
+          <w:left w:val="none" w:color="000000" w:sz="4" w:space="0"/>
           <w:bottom w:val="single" w:color="000000" w:themeColor="text1" w:themeTint="80" w:sz="4" w:space="0"/>
-          <w:right w:val="none"/>
+          <w:right w:val="none" w:color="000000" w:sz="4" w:space="0"/>
         </w:tcBorders>
       </w:tcPr>
     </w:tblStylePr>
@@ -12007,12 +12003,12 @@
         <w:tblBorders/>
       </w:tblPr>
       <w:tcPr>
-        <w:shd w:color="ffffff"/>
+        <w:shd w:val="clear" w:color="ffffff"/>
         <w:tcBorders>
-          <w:top w:val="none"/>
+          <w:top w:val="none" w:color="000000" w:sz="4" w:space="0"/>
           <w:left w:val="single" w:color="000000" w:themeColor="text1" w:themeTint="80" w:sz="4" w:space="0"/>
-          <w:bottom w:val="none"/>
-          <w:right w:val="none"/>
+          <w:bottom w:val="none" w:color="000000" w:sz="4" w:space="0"/>
+          <w:right w:val="none" w:color="000000" w:sz="4" w:space="0"/>
         </w:tcBorders>
       </w:tcPr>
     </w:tblStylePr>
@@ -12035,9 +12031,9 @@
         <w:shd w:val="clear" w:color="ffffff" w:themeColor="light1" w:fill="ffffff" w:themeFill="light1"/>
         <w:tcBorders>
           <w:top w:val="single" w:color="000000" w:themeColor="text1" w:themeTint="80" w:sz="4" w:space="0"/>
-          <w:left w:val="none"/>
-          <w:bottom w:val="none"/>
-          <w:right w:val="none"/>
+          <w:left w:val="none" w:color="000000" w:sz="4" w:space="0"/>
+          <w:bottom w:val="none" w:color="000000" w:sz="4" w:space="0"/>
+          <w:right w:val="none" w:color="000000" w:sz="4" w:space="0"/>
         </w:tcBorders>
       </w:tcPr>
     </w:tblStylePr>
@@ -12107,9 +12103,9 @@
       </w:tcPr>
     </w:tblStylePr>
   </w:style>
-  <w:style w:type="table" w:styleId="61">
+  <w:style w:type="table" w:styleId="747">
     <w:name w:val="Grid Table 7 Colorful - Accent 1"/>
-    <w:basedOn w:val="661"/>
+    <w:basedOn w:val="882"/>
     <w:uiPriority w:val="99"/>
     <w:pPr>
       <w:pBdr/>
@@ -12211,11 +12207,11 @@
         <w:tblBorders/>
       </w:tblPr>
       <w:tcPr>
-        <w:shd w:color="ffffff"/>
+        <w:shd w:val="clear" w:color="ffffff"/>
         <w:tcBorders>
-          <w:top w:val="none"/>
-          <w:left w:val="none"/>
-          <w:bottom w:val="none"/>
+          <w:top w:val="none" w:color="000000" w:sz="4" w:space="0"/>
+          <w:left w:val="none" w:color="000000" w:sz="4" w:space="0"/>
+          <w:bottom w:val="none" w:color="000000" w:sz="4" w:space="0"/>
           <w:right w:val="single" w:color="000000" w:themeColor="accent1" w:themeTint="80" w:sz="4" w:space="0"/>
         </w:tcBorders>
       </w:tcPr>
@@ -12238,10 +12234,10 @@
       <w:tcPr>
         <w:shd w:val="clear" w:color="ffffff" w:themeColor="light1" w:fill="ffffff" w:themeFill="light1"/>
         <w:tcBorders>
-          <w:top w:val="none"/>
-          <w:left w:val="none"/>
+          <w:top w:val="none" w:color="000000" w:sz="4" w:space="0"/>
+          <w:left w:val="none" w:color="000000" w:sz="4" w:space="0"/>
           <w:bottom w:val="single" w:color="000000" w:themeColor="accent1" w:themeTint="80" w:sz="4" w:space="0"/>
-          <w:right w:val="none"/>
+          <w:right w:val="none" w:color="000000" w:sz="4" w:space="0"/>
         </w:tcBorders>
       </w:tcPr>
     </w:tblStylePr>
@@ -12261,12 +12257,12 @@
         <w:tblBorders/>
       </w:tblPr>
       <w:tcPr>
-        <w:shd w:color="ffffff"/>
+        <w:shd w:val="clear" w:color="ffffff"/>
         <w:tcBorders>
-          <w:top w:val="none"/>
+          <w:top w:val="none" w:color="000000" w:sz="4" w:space="0"/>
           <w:left w:val="single" w:color="000000" w:themeColor="accent1" w:themeTint="80" w:sz="4" w:space="0"/>
-          <w:bottom w:val="none"/>
-          <w:right w:val="none"/>
+          <w:bottom w:val="none" w:color="000000" w:sz="4" w:space="0"/>
+          <w:right w:val="none" w:color="000000" w:sz="4" w:space="0"/>
         </w:tcBorders>
       </w:tcPr>
     </w:tblStylePr>
@@ -12289,9 +12285,9 @@
         <w:shd w:val="clear" w:color="ffffff" w:themeColor="light1" w:fill="ffffff" w:themeFill="light1"/>
         <w:tcBorders>
           <w:top w:val="single" w:color="000000" w:themeColor="accent1" w:themeTint="80" w:sz="4" w:space="0"/>
-          <w:left w:val="none"/>
-          <w:bottom w:val="none"/>
-          <w:right w:val="none"/>
+          <w:left w:val="none" w:color="000000" w:sz="4" w:space="0"/>
+          <w:bottom w:val="none" w:color="000000" w:sz="4" w:space="0"/>
+          <w:right w:val="none" w:color="000000" w:sz="4" w:space="0"/>
         </w:tcBorders>
       </w:tcPr>
     </w:tblStylePr>
@@ -12361,9 +12357,9 @@
       </w:tcPr>
     </w:tblStylePr>
   </w:style>
-  <w:style w:type="table" w:styleId="62">
+  <w:style w:type="table" w:styleId="748">
     <w:name w:val="Grid Table 7 Colorful - Accent 2"/>
-    <w:basedOn w:val="661"/>
+    <w:basedOn w:val="882"/>
     <w:uiPriority w:val="99"/>
     <w:pPr>
       <w:pBdr/>
@@ -12465,11 +12461,11 @@
         <w:tblBorders/>
       </w:tblPr>
       <w:tcPr>
-        <w:shd w:color="ffffff"/>
+        <w:shd w:val="clear" w:color="ffffff"/>
         <w:tcBorders>
-          <w:top w:val="none"/>
-          <w:left w:val="none"/>
-          <w:bottom w:val="none"/>
+          <w:top w:val="none" w:color="000000" w:sz="4" w:space="0"/>
+          <w:left w:val="none" w:color="000000" w:sz="4" w:space="0"/>
+          <w:bottom w:val="none" w:color="000000" w:sz="4" w:space="0"/>
           <w:right w:val="single" w:color="000000" w:themeColor="accent2" w:themeTint="97" w:sz="4" w:space="0"/>
         </w:tcBorders>
       </w:tcPr>
@@ -12492,10 +12488,10 @@
       <w:tcPr>
         <w:shd w:val="clear" w:color="ffffff" w:themeColor="light1" w:fill="ffffff" w:themeFill="light1"/>
         <w:tcBorders>
-          <w:top w:val="none"/>
-          <w:left w:val="none"/>
+          <w:top w:val="none" w:color="000000" w:sz="4" w:space="0"/>
+          <w:left w:val="none" w:color="000000" w:sz="4" w:space="0"/>
           <w:bottom w:val="single" w:color="000000" w:themeColor="accent2" w:themeTint="97" w:sz="4" w:space="0"/>
-          <w:right w:val="none"/>
+          <w:right w:val="none" w:color="000000" w:sz="4" w:space="0"/>
         </w:tcBorders>
       </w:tcPr>
     </w:tblStylePr>
@@ -12515,12 +12511,12 @@
         <w:tblBorders/>
       </w:tblPr>
       <w:tcPr>
-        <w:shd w:color="ffffff"/>
+        <w:shd w:val="clear" w:color="ffffff"/>
         <w:tcBorders>
-          <w:top w:val="none"/>
+          <w:top w:val="none" w:color="000000" w:sz="4" w:space="0"/>
           <w:left w:val="single" w:color="000000" w:themeColor="accent2" w:themeTint="97" w:sz="4" w:space="0"/>
-          <w:bottom w:val="none"/>
-          <w:right w:val="none"/>
+          <w:bottom w:val="none" w:color="000000" w:sz="4" w:space="0"/>
+          <w:right w:val="none" w:color="000000" w:sz="4" w:space="0"/>
         </w:tcBorders>
       </w:tcPr>
     </w:tblStylePr>
@@ -12543,9 +12539,9 @@
         <w:shd w:val="clear" w:color="ffffff" w:themeColor="light1" w:fill="ffffff" w:themeFill="light1"/>
         <w:tcBorders>
           <w:top w:val="single" w:color="000000" w:themeColor="accent2" w:themeTint="97" w:sz="4" w:space="0"/>
-          <w:left w:val="none"/>
-          <w:bottom w:val="none"/>
-          <w:right w:val="none"/>
+          <w:left w:val="none" w:color="000000" w:sz="4" w:space="0"/>
+          <w:bottom w:val="none" w:color="000000" w:sz="4" w:space="0"/>
+          <w:right w:val="none" w:color="000000" w:sz="4" w:space="0"/>
         </w:tcBorders>
       </w:tcPr>
     </w:tblStylePr>
@@ -12615,9 +12611,9 @@
       </w:tcPr>
     </w:tblStylePr>
   </w:style>
-  <w:style w:type="table" w:styleId="63">
+  <w:style w:type="table" w:styleId="749">
     <w:name w:val="Grid Table 7 Colorful - Accent 3"/>
-    <w:basedOn w:val="661"/>
+    <w:basedOn w:val="882"/>
     <w:uiPriority w:val="99"/>
     <w:pPr>
       <w:pBdr/>
@@ -12719,11 +12715,11 @@
         <w:tblBorders/>
       </w:tblPr>
       <w:tcPr>
-        <w:shd w:color="ffffff"/>
+        <w:shd w:val="clear" w:color="ffffff"/>
         <w:tcBorders>
-          <w:top w:val="none"/>
-          <w:left w:val="none"/>
-          <w:bottom w:val="none"/>
+          <w:top w:val="none" w:color="000000" w:sz="4" w:space="0"/>
+          <w:left w:val="none" w:color="000000" w:sz="4" w:space="0"/>
+          <w:bottom w:val="none" w:color="000000" w:sz="4" w:space="0"/>
           <w:right w:val="single" w:color="000000" w:themeColor="accent3" w:themeTint="FE" w:sz="4" w:space="0"/>
         </w:tcBorders>
       </w:tcPr>
@@ -12746,10 +12742,10 @@
       <w:tcPr>
         <w:shd w:val="clear" w:color="ffffff" w:themeColor="light1" w:fill="ffffff" w:themeFill="light1"/>
         <w:tcBorders>
-          <w:top w:val="none"/>
-          <w:left w:val="none"/>
+          <w:top w:val="none" w:color="000000" w:sz="4" w:space="0"/>
+          <w:left w:val="none" w:color="000000" w:sz="4" w:space="0"/>
           <w:bottom w:val="single" w:color="000000" w:themeColor="accent3" w:themeTint="FE" w:sz="4" w:space="0"/>
-          <w:right w:val="none"/>
+          <w:right w:val="none" w:color="000000" w:sz="4" w:space="0"/>
         </w:tcBorders>
       </w:tcPr>
     </w:tblStylePr>
@@ -12769,12 +12765,12 @@
         <w:tblBorders/>
       </w:tblPr>
       <w:tcPr>
-        <w:shd w:color="ffffff"/>
+        <w:shd w:val="clear" w:color="ffffff"/>
         <w:tcBorders>
-          <w:top w:val="none"/>
+          <w:top w:val="none" w:color="000000" w:sz="4" w:space="0"/>
           <w:left w:val="single" w:color="000000" w:themeColor="accent3" w:themeTint="FE" w:sz="4" w:space="0"/>
-          <w:bottom w:val="none"/>
-          <w:right w:val="none"/>
+          <w:bottom w:val="none" w:color="000000" w:sz="4" w:space="0"/>
+          <w:right w:val="none" w:color="000000" w:sz="4" w:space="0"/>
         </w:tcBorders>
       </w:tcPr>
     </w:tblStylePr>
@@ -12797,9 +12793,9 @@
         <w:shd w:val="clear" w:color="ffffff" w:themeColor="light1" w:fill="ffffff" w:themeFill="light1"/>
         <w:tcBorders>
           <w:top w:val="single" w:color="000000" w:themeColor="accent3" w:themeTint="FE" w:sz="4" w:space="0"/>
-          <w:left w:val="none"/>
-          <w:bottom w:val="none"/>
-          <w:right w:val="none"/>
+          <w:left w:val="none" w:color="000000" w:sz="4" w:space="0"/>
+          <w:bottom w:val="none" w:color="000000" w:sz="4" w:space="0"/>
+          <w:right w:val="none" w:color="000000" w:sz="4" w:space="0"/>
         </w:tcBorders>
       </w:tcPr>
     </w:tblStylePr>
@@ -12869,9 +12865,9 @@
       </w:tcPr>
     </w:tblStylePr>
   </w:style>
-  <w:style w:type="table" w:styleId="64">
+  <w:style w:type="table" w:styleId="750">
     <w:name w:val="Grid Table 7 Colorful - Accent 4"/>
-    <w:basedOn w:val="661"/>
+    <w:basedOn w:val="882"/>
     <w:uiPriority w:val="99"/>
     <w:pPr>
       <w:pBdr/>
@@ -12973,11 +12969,11 @@
         <w:tblBorders/>
       </w:tblPr>
       <w:tcPr>
-        <w:shd w:color="ffffff"/>
+        <w:shd w:val="clear" w:color="ffffff"/>
         <w:tcBorders>
-          <w:top w:val="none"/>
-          <w:left w:val="none"/>
-          <w:bottom w:val="none"/>
+          <w:top w:val="none" w:color="000000" w:sz="4" w:space="0"/>
+          <w:left w:val="none" w:color="000000" w:sz="4" w:space="0"/>
+          <w:bottom w:val="none" w:color="000000" w:sz="4" w:space="0"/>
           <w:right w:val="single" w:color="000000" w:themeColor="accent4" w:themeTint="9A" w:sz="4" w:space="0"/>
         </w:tcBorders>
       </w:tcPr>
@@ -13000,10 +12996,10 @@
       <w:tcPr>
         <w:shd w:val="clear" w:color="ffffff" w:themeColor="light1" w:fill="ffffff" w:themeFill="light1"/>
         <w:tcBorders>
-          <w:top w:val="none"/>
-          <w:left w:val="none"/>
+          <w:top w:val="none" w:color="000000" w:sz="4" w:space="0"/>
+          <w:left w:val="none" w:color="000000" w:sz="4" w:space="0"/>
           <w:bottom w:val="single" w:color="000000" w:themeColor="accent4" w:themeTint="9A" w:sz="4" w:space="0"/>
-          <w:right w:val="none"/>
+          <w:right w:val="none" w:color="000000" w:sz="4" w:space="0"/>
         </w:tcBorders>
       </w:tcPr>
     </w:tblStylePr>
@@ -13023,12 +13019,12 @@
         <w:tblBorders/>
       </w:tblPr>
       <w:tcPr>
-        <w:shd w:color="ffffff"/>
+        <w:shd w:val="clear" w:color="ffffff"/>
         <w:tcBorders>
-          <w:top w:val="none"/>
+          <w:top w:val="none" w:color="000000" w:sz="4" w:space="0"/>
           <w:left w:val="single" w:color="000000" w:themeColor="accent4" w:themeTint="9A" w:sz="4" w:space="0"/>
-          <w:bottom w:val="none"/>
-          <w:right w:val="none"/>
+          <w:bottom w:val="none" w:color="000000" w:sz="4" w:space="0"/>
+          <w:right w:val="none" w:color="000000" w:sz="4" w:space="0"/>
         </w:tcBorders>
       </w:tcPr>
     </w:tblStylePr>
@@ -13051,9 +13047,9 @@
         <w:shd w:val="clear" w:color="ffffff" w:themeColor="light1" w:fill="ffffff" w:themeFill="light1"/>
         <w:tcBorders>
           <w:top w:val="single" w:color="000000" w:themeColor="accent4" w:themeTint="9A" w:sz="4" w:space="0"/>
-          <w:left w:val="none"/>
-          <w:bottom w:val="none"/>
-          <w:right w:val="none"/>
+          <w:left w:val="none" w:color="000000" w:sz="4" w:space="0"/>
+          <w:bottom w:val="none" w:color="000000" w:sz="4" w:space="0"/>
+          <w:right w:val="none" w:color="000000" w:sz="4" w:space="0"/>
         </w:tcBorders>
       </w:tcPr>
     </w:tblStylePr>
@@ -13123,9 +13119,9 @@
       </w:tcPr>
     </w:tblStylePr>
   </w:style>
-  <w:style w:type="table" w:styleId="65">
+  <w:style w:type="table" w:styleId="751">
     <w:name w:val="Grid Table 7 Colorful - Accent 5"/>
-    <w:basedOn w:val="661"/>
+    <w:basedOn w:val="882"/>
     <w:uiPriority w:val="99"/>
     <w:pPr>
       <w:pBdr/>
@@ -13227,11 +13223,11 @@
         <w:tblBorders/>
       </w:tblPr>
       <w:tcPr>
-        <w:shd w:color="ffffff"/>
+        <w:shd w:val="clear" w:color="ffffff"/>
         <w:tcBorders>
-          <w:top w:val="none"/>
-          <w:left w:val="none"/>
-          <w:bottom w:val="none"/>
+          <w:top w:val="none" w:color="000000" w:sz="4" w:space="0"/>
+          <w:left w:val="none" w:color="000000" w:sz="4" w:space="0"/>
+          <w:bottom w:val="none" w:color="000000" w:sz="4" w:space="0"/>
           <w:right w:val="single" w:color="000000" w:themeColor="accent5" w:themeTint="90" w:sz="4" w:space="0"/>
         </w:tcBorders>
       </w:tcPr>
@@ -13254,10 +13250,10 @@
       <w:tcPr>
         <w:shd w:val="clear" w:color="ffffff" w:themeColor="light1" w:fill="ffffff" w:themeFill="light1"/>
         <w:tcBorders>
-          <w:top w:val="none"/>
-          <w:left w:val="none"/>
+          <w:top w:val="none" w:color="000000" w:sz="4" w:space="0"/>
+          <w:left w:val="none" w:color="000000" w:sz="4" w:space="0"/>
           <w:bottom w:val="single" w:color="000000" w:themeColor="accent5" w:themeTint="90" w:sz="4" w:space="0"/>
-          <w:right w:val="none"/>
+          <w:right w:val="none" w:color="000000" w:sz="4" w:space="0"/>
         </w:tcBorders>
       </w:tcPr>
     </w:tblStylePr>
@@ -13277,12 +13273,12 @@
         <w:tblBorders/>
       </w:tblPr>
       <w:tcPr>
-        <w:shd w:color="ffffff"/>
+        <w:shd w:val="clear" w:color="ffffff"/>
         <w:tcBorders>
-          <w:top w:val="none"/>
+          <w:top w:val="none" w:color="000000" w:sz="4" w:space="0"/>
           <w:left w:val="single" w:color="000000" w:themeColor="accent5" w:themeTint="90" w:sz="4" w:space="0"/>
-          <w:bottom w:val="none"/>
-          <w:right w:val="none"/>
+          <w:bottom w:val="none" w:color="000000" w:sz="4" w:space="0"/>
+          <w:right w:val="none" w:color="000000" w:sz="4" w:space="0"/>
         </w:tcBorders>
       </w:tcPr>
     </w:tblStylePr>
@@ -13305,9 +13301,9 @@
         <w:shd w:val="clear" w:color="ffffff" w:themeColor="light1" w:fill="ffffff" w:themeFill="light1"/>
         <w:tcBorders>
           <w:top w:val="single" w:color="000000" w:themeColor="accent5" w:themeTint="90" w:sz="4" w:space="0"/>
-          <w:left w:val="none"/>
-          <w:bottom w:val="none"/>
-          <w:right w:val="none"/>
+          <w:left w:val="none" w:color="000000" w:sz="4" w:space="0"/>
+          <w:bottom w:val="none" w:color="000000" w:sz="4" w:space="0"/>
+          <w:right w:val="none" w:color="000000" w:sz="4" w:space="0"/>
         </w:tcBorders>
       </w:tcPr>
     </w:tblStylePr>
@@ -13377,9 +13373,9 @@
       </w:tcPr>
     </w:tblStylePr>
   </w:style>
-  <w:style w:type="table" w:styleId="66">
+  <w:style w:type="table" w:styleId="752">
     <w:name w:val="Grid Table 7 Colorful - Accent 6"/>
-    <w:basedOn w:val="661"/>
+    <w:basedOn w:val="882"/>
     <w:uiPriority w:val="99"/>
     <w:pPr>
       <w:pBdr/>
@@ -13481,11 +13477,11 @@
         <w:tblBorders/>
       </w:tblPr>
       <w:tcPr>
-        <w:shd w:color="ffffff"/>
+        <w:shd w:val="clear" w:color="ffffff"/>
         <w:tcBorders>
-          <w:top w:val="none"/>
-          <w:left w:val="none"/>
-          <w:bottom w:val="none"/>
+          <w:top w:val="none" w:color="000000" w:sz="4" w:space="0"/>
+          <w:left w:val="none" w:color="000000" w:sz="4" w:space="0"/>
+          <w:bottom w:val="none" w:color="000000" w:sz="4" w:space="0"/>
           <w:right w:val="single" w:color="000000" w:themeColor="accent6" w:themeTint="90" w:sz="4" w:space="0"/>
         </w:tcBorders>
       </w:tcPr>
@@ -13508,10 +13504,10 @@
       <w:tcPr>
         <w:shd w:val="clear" w:color="ffffff" w:themeColor="light1" w:fill="ffffff" w:themeFill="light1"/>
         <w:tcBorders>
-          <w:top w:val="none"/>
-          <w:left w:val="none"/>
+          <w:top w:val="none" w:color="000000" w:sz="4" w:space="0"/>
+          <w:left w:val="none" w:color="000000" w:sz="4" w:space="0"/>
           <w:bottom w:val="single" w:color="000000" w:themeColor="accent6" w:themeTint="90" w:sz="4" w:space="0"/>
-          <w:right w:val="none"/>
+          <w:right w:val="none" w:color="000000" w:sz="4" w:space="0"/>
         </w:tcBorders>
       </w:tcPr>
     </w:tblStylePr>
@@ -13531,12 +13527,12 @@
         <w:tblBorders/>
       </w:tblPr>
       <w:tcPr>
-        <w:shd w:color="ffffff"/>
+        <w:shd w:val="clear" w:color="ffffff"/>
         <w:tcBorders>
-          <w:top w:val="none"/>
+          <w:top w:val="none" w:color="000000" w:sz="4" w:space="0"/>
           <w:left w:val="single" w:color="000000" w:themeColor="accent6" w:themeTint="90" w:sz="4" w:space="0"/>
-          <w:bottom w:val="none"/>
-          <w:right w:val="none"/>
+          <w:bottom w:val="none" w:color="000000" w:sz="4" w:space="0"/>
+          <w:right w:val="none" w:color="000000" w:sz="4" w:space="0"/>
         </w:tcBorders>
       </w:tcPr>
     </w:tblStylePr>
@@ -13559,9 +13555,9 @@
         <w:shd w:val="clear" w:color="ffffff" w:themeColor="light1" w:fill="ffffff" w:themeFill="light1"/>
         <w:tcBorders>
           <w:top w:val="single" w:color="000000" w:themeColor="accent6" w:themeTint="90" w:sz="4" w:space="0"/>
-          <w:left w:val="none"/>
-          <w:bottom w:val="none"/>
-          <w:right w:val="none"/>
+          <w:left w:val="none" w:color="000000" w:sz="4" w:space="0"/>
+          <w:bottom w:val="none" w:color="000000" w:sz="4" w:space="0"/>
+          <w:right w:val="none" w:color="000000" w:sz="4" w:space="0"/>
         </w:tcBorders>
       </w:tcPr>
     </w:tblStylePr>
@@ -13631,9 +13627,9 @@
       </w:tcPr>
     </w:tblStylePr>
   </w:style>
-  <w:style w:type="table" w:styleId="67">
+  <w:style w:type="table" w:styleId="753">
     <w:name w:val="List Table 1 Light"/>
-    <w:basedOn w:val="661"/>
+    <w:basedOn w:val="882"/>
     <w:uiPriority w:val="99"/>
     <w:pPr>
       <w:pBdr/>
@@ -13847,9 +13843,9 @@
       </w:tcPr>
     </w:tblStylePr>
   </w:style>
-  <w:style w:type="table" w:styleId="68">
+  <w:style w:type="table" w:styleId="754">
     <w:name w:val="List Table 1 Light - Accent 1"/>
-    <w:basedOn w:val="661"/>
+    <w:basedOn w:val="882"/>
     <w:uiPriority w:val="99"/>
     <w:pPr>
       <w:pBdr/>
@@ -14063,9 +14059,9 @@
       </w:tcPr>
     </w:tblStylePr>
   </w:style>
-  <w:style w:type="table" w:styleId="69">
+  <w:style w:type="table" w:styleId="755">
     <w:name w:val="List Table 1 Light - Accent 2"/>
-    <w:basedOn w:val="661"/>
+    <w:basedOn w:val="882"/>
     <w:uiPriority w:val="99"/>
     <w:pPr>
       <w:pBdr/>
@@ -14279,9 +14275,9 @@
       </w:tcPr>
     </w:tblStylePr>
   </w:style>
-  <w:style w:type="table" w:styleId="70">
+  <w:style w:type="table" w:styleId="756">
     <w:name w:val="List Table 1 Light - Accent 3"/>
-    <w:basedOn w:val="661"/>
+    <w:basedOn w:val="882"/>
     <w:uiPriority w:val="99"/>
     <w:pPr>
       <w:pBdr/>
@@ -14495,9 +14491,9 @@
       </w:tcPr>
     </w:tblStylePr>
   </w:style>
-  <w:style w:type="table" w:styleId="71">
+  <w:style w:type="table" w:styleId="757">
     <w:name w:val="List Table 1 Light - Accent 4"/>
-    <w:basedOn w:val="661"/>
+    <w:basedOn w:val="882"/>
     <w:uiPriority w:val="99"/>
     <w:pPr>
       <w:pBdr/>
@@ -14711,9 +14707,9 @@
       </w:tcPr>
     </w:tblStylePr>
   </w:style>
-  <w:style w:type="table" w:styleId="72">
+  <w:style w:type="table" w:styleId="758">
     <w:name w:val="List Table 1 Light - Accent 5"/>
-    <w:basedOn w:val="661"/>
+    <w:basedOn w:val="882"/>
     <w:uiPriority w:val="99"/>
     <w:pPr>
       <w:pBdr/>
@@ -14927,9 +14923,9 @@
       </w:tcPr>
     </w:tblStylePr>
   </w:style>
-  <w:style w:type="table" w:styleId="73">
+  <w:style w:type="table" w:styleId="759">
     <w:name w:val="List Table 1 Light - Accent 6"/>
-    <w:basedOn w:val="661"/>
+    <w:basedOn w:val="882"/>
     <w:uiPriority w:val="99"/>
     <w:pPr>
       <w:pBdr/>
@@ -15143,9 +15139,9 @@
       </w:tcPr>
     </w:tblStylePr>
   </w:style>
-  <w:style w:type="table" w:styleId="74">
+  <w:style w:type="table" w:styleId="760">
     <w:name w:val="List Table 2"/>
-    <w:basedOn w:val="661"/>
+    <w:basedOn w:val="882"/>
     <w:uiPriority w:val="99"/>
     <w:pPr>
       <w:pBdr/>
@@ -15381,9 +15377,9 @@
       </w:tcPr>
     </w:tblStylePr>
   </w:style>
-  <w:style w:type="table" w:styleId="75">
+  <w:style w:type="table" w:styleId="761">
     <w:name w:val="List Table 2 - Accent 1"/>
-    <w:basedOn w:val="661"/>
+    <w:basedOn w:val="882"/>
     <w:uiPriority w:val="99"/>
     <w:pPr>
       <w:pBdr/>
@@ -15619,9 +15615,9 @@
       </w:tcPr>
     </w:tblStylePr>
   </w:style>
-  <w:style w:type="table" w:styleId="76">
+  <w:style w:type="table" w:styleId="762">
     <w:name w:val="List Table 2 - Accent 2"/>
-    <w:basedOn w:val="661"/>
+    <w:basedOn w:val="882"/>
     <w:uiPriority w:val="99"/>
     <w:pPr>
       <w:pBdr/>
@@ -15857,9 +15853,9 @@
       </w:tcPr>
     </w:tblStylePr>
   </w:style>
-  <w:style w:type="table" w:styleId="77">
+  <w:style w:type="table" w:styleId="763">
     <w:name w:val="List Table 2 - Accent 3"/>
-    <w:basedOn w:val="661"/>
+    <w:basedOn w:val="882"/>
     <w:uiPriority w:val="99"/>
     <w:pPr>
       <w:pBdr/>
@@ -16095,9 +16091,9 @@
       </w:tcPr>
     </w:tblStylePr>
   </w:style>
-  <w:style w:type="table" w:styleId="78">
+  <w:style w:type="table" w:styleId="764">
     <w:name w:val="List Table 2 - Accent 4"/>
-    <w:basedOn w:val="661"/>
+    <w:basedOn w:val="882"/>
     <w:uiPriority w:val="99"/>
     <w:pPr>
       <w:pBdr/>
@@ -16333,9 +16329,9 @@
       </w:tcPr>
     </w:tblStylePr>
   </w:style>
-  <w:style w:type="table" w:styleId="79">
+  <w:style w:type="table" w:styleId="765">
     <w:name w:val="List Table 2 - Accent 5"/>
-    <w:basedOn w:val="661"/>
+    <w:basedOn w:val="882"/>
     <w:uiPriority w:val="99"/>
     <w:pPr>
       <w:pBdr/>
@@ -16571,9 +16567,9 @@
       </w:tcPr>
     </w:tblStylePr>
   </w:style>
-  <w:style w:type="table" w:styleId="80">
+  <w:style w:type="table" w:styleId="766">
     <w:name w:val="List Table 2 - Accent 6"/>
-    <w:basedOn w:val="661"/>
+    <w:basedOn w:val="882"/>
     <w:uiPriority w:val="99"/>
     <w:pPr>
       <w:pBdr/>
@@ -16809,9 +16805,9 @@
       </w:tcPr>
     </w:tblStylePr>
   </w:style>
-  <w:style w:type="table" w:styleId="81">
+  <w:style w:type="table" w:styleId="767">
     <w:name w:val="List Table 3"/>
-    <w:basedOn w:val="661"/>
+    <w:basedOn w:val="882"/>
     <w:uiPriority w:val="99"/>
     <w:pPr>
       <w:pBdr/>
@@ -17037,9 +17033,9 @@
       </w:tcPr>
     </w:tblStylePr>
   </w:style>
-  <w:style w:type="table" w:styleId="82">
+  <w:style w:type="table" w:styleId="768">
     <w:name w:val="List Table 3 - Accent 1"/>
-    <w:basedOn w:val="661"/>
+    <w:basedOn w:val="882"/>
     <w:uiPriority w:val="99"/>
     <w:pPr>
       <w:pBdr/>
@@ -17265,9 +17261,9 @@
       </w:tcPr>
     </w:tblStylePr>
   </w:style>
-  <w:style w:type="table" w:styleId="83">
+  <w:style w:type="table" w:styleId="769">
     <w:name w:val="List Table 3 - Accent 2"/>
-    <w:basedOn w:val="661"/>
+    <w:basedOn w:val="882"/>
     <w:uiPriority w:val="99"/>
     <w:pPr>
       <w:pBdr/>
@@ -17493,9 +17489,9 @@
       </w:tcPr>
     </w:tblStylePr>
   </w:style>
-  <w:style w:type="table" w:styleId="84">
+  <w:style w:type="table" w:styleId="770">
     <w:name w:val="List Table 3 - Accent 3"/>
-    <w:basedOn w:val="661"/>
+    <w:basedOn w:val="882"/>
     <w:uiPriority w:val="99"/>
     <w:pPr>
       <w:pBdr/>
@@ -17721,9 +17717,9 @@
       </w:tcPr>
     </w:tblStylePr>
   </w:style>
-  <w:style w:type="table" w:styleId="85">
+  <w:style w:type="table" w:styleId="771">
     <w:name w:val="List Table 3 - Accent 4"/>
-    <w:basedOn w:val="661"/>
+    <w:basedOn w:val="882"/>
     <w:uiPriority w:val="99"/>
     <w:pPr>
       <w:pBdr/>
@@ -17949,9 +17945,9 @@
       </w:tcPr>
     </w:tblStylePr>
   </w:style>
-  <w:style w:type="table" w:styleId="86">
+  <w:style w:type="table" w:styleId="772">
     <w:name w:val="List Table 3 - Accent 5"/>
-    <w:basedOn w:val="661"/>
+    <w:basedOn w:val="882"/>
     <w:uiPriority w:val="99"/>
     <w:pPr>
       <w:pBdr/>
@@ -18177,9 +18173,9 @@
       </w:tcPr>
     </w:tblStylePr>
   </w:style>
-  <w:style w:type="table" w:styleId="87">
+  <w:style w:type="table" w:styleId="773">
     <w:name w:val="List Table 3 - Accent 6"/>
-    <w:basedOn w:val="661"/>
+    <w:basedOn w:val="882"/>
     <w:uiPriority w:val="99"/>
     <w:pPr>
       <w:pBdr/>
@@ -18405,9 +18401,9 @@
       </w:tcPr>
     </w:tblStylePr>
   </w:style>
-  <w:style w:type="table" w:styleId="88">
+  <w:style w:type="table" w:styleId="774">
     <w:name w:val="List Table 4"/>
-    <w:basedOn w:val="661"/>
+    <w:basedOn w:val="882"/>
     <w:uiPriority w:val="99"/>
     <w:pPr>
       <w:pBdr/>
@@ -18630,9 +18626,9 @@
       </w:tcPr>
     </w:tblStylePr>
   </w:style>
-  <w:style w:type="table" w:styleId="89">
+  <w:style w:type="table" w:styleId="775">
     <w:name w:val="List Table 4 - Accent 1"/>
-    <w:basedOn w:val="661"/>
+    <w:basedOn w:val="882"/>
     <w:uiPriority w:val="99"/>
     <w:pPr>
       <w:pBdr/>
@@ -18855,9 +18851,9 @@
       </w:tcPr>
     </w:tblStylePr>
   </w:style>
-  <w:style w:type="table" w:styleId="90">
+  <w:style w:type="table" w:styleId="776">
     <w:name w:val="List Table 4 - Accent 2"/>
-    <w:basedOn w:val="661"/>
+    <w:basedOn w:val="882"/>
     <w:uiPriority w:val="99"/>
     <w:pPr>
       <w:pBdr/>
@@ -19080,9 +19076,9 @@
       </w:tcPr>
     </w:tblStylePr>
   </w:style>
-  <w:style w:type="table" w:styleId="91">
+  <w:style w:type="table" w:styleId="777">
     <w:name w:val="List Table 4 - Accent 3"/>
-    <w:basedOn w:val="661"/>
+    <w:basedOn w:val="882"/>
     <w:uiPriority w:val="99"/>
     <w:pPr>
       <w:pBdr/>
@@ -19305,9 +19301,9 @@
       </w:tcPr>
     </w:tblStylePr>
   </w:style>
-  <w:style w:type="table" w:styleId="92">
+  <w:style w:type="table" w:styleId="778">
     <w:name w:val="List Table 4 - Accent 4"/>
-    <w:basedOn w:val="661"/>
+    <w:basedOn w:val="882"/>
     <w:uiPriority w:val="99"/>
     <w:pPr>
       <w:pBdr/>
@@ -19530,9 +19526,9 @@
       </w:tcPr>
     </w:tblStylePr>
   </w:style>
-  <w:style w:type="table" w:styleId="93">
+  <w:style w:type="table" w:styleId="779">
     <w:name w:val="List Table 4 - Accent 5"/>
-    <w:basedOn w:val="661"/>
+    <w:basedOn w:val="882"/>
     <w:uiPriority w:val="99"/>
     <w:pPr>
       <w:pBdr/>
@@ -19755,9 +19751,9 @@
       </w:tcPr>
     </w:tblStylePr>
   </w:style>
-  <w:style w:type="table" w:styleId="94">
+  <w:style w:type="table" w:styleId="780">
     <w:name w:val="List Table 4 - Accent 6"/>
-    <w:basedOn w:val="661"/>
+    <w:basedOn w:val="882"/>
     <w:uiPriority w:val="99"/>
     <w:pPr>
       <w:pBdr/>
@@ -19980,9 +19976,9 @@
       </w:tcPr>
     </w:tblStylePr>
   </w:style>
-  <w:style w:type="table" w:styleId="95">
+  <w:style w:type="table" w:styleId="781">
     <w:name w:val="List Table 5 Dark"/>
-    <w:basedOn w:val="661"/>
+    <w:basedOn w:val="882"/>
     <w:uiPriority w:val="99"/>
     <w:pPr>
       <w:pBdr/>
@@ -20222,9 +20218,9 @@
       </w:tcPr>
     </w:tblStylePr>
   </w:style>
-  <w:style w:type="table" w:styleId="96">
+  <w:style w:type="table" w:styleId="782">
     <w:name w:val="List Table 5 Dark - Accent 1"/>
-    <w:basedOn w:val="661"/>
+    <w:basedOn w:val="882"/>
     <w:uiPriority w:val="99"/>
     <w:pPr>
       <w:pBdr/>
@@ -20464,9 +20460,9 @@
       </w:tcPr>
     </w:tblStylePr>
   </w:style>
-  <w:style w:type="table" w:styleId="97">
+  <w:style w:type="table" w:styleId="783">
     <w:name w:val="List Table 5 Dark - Accent 2"/>
-    <w:basedOn w:val="661"/>
+    <w:basedOn w:val="882"/>
     <w:uiPriority w:val="99"/>
     <w:pPr>
       <w:pBdr/>
@@ -20706,9 +20702,9 @@
       </w:tcPr>
     </w:tblStylePr>
   </w:style>
-  <w:style w:type="table" w:styleId="98">
+  <w:style w:type="table" w:styleId="784">
     <w:name w:val="List Table 5 Dark - Accent 3"/>
-    <w:basedOn w:val="661"/>
+    <w:basedOn w:val="882"/>
     <w:uiPriority w:val="99"/>
     <w:pPr>
       <w:pBdr/>
@@ -20948,9 +20944,9 @@
       </w:tcPr>
     </w:tblStylePr>
   </w:style>
-  <w:style w:type="table" w:styleId="99">
+  <w:style w:type="table" w:styleId="785">
     <w:name w:val="List Table 5 Dark - Accent 4"/>
-    <w:basedOn w:val="661"/>
+    <w:basedOn w:val="882"/>
     <w:uiPriority w:val="99"/>
     <w:pPr>
       <w:pBdr/>
@@ -21190,9 +21186,9 @@
       </w:tcPr>
     </w:tblStylePr>
   </w:style>
-  <w:style w:type="table" w:styleId="100">
+  <w:style w:type="table" w:styleId="786">
     <w:name w:val="List Table 5 Dark - Accent 5"/>
-    <w:basedOn w:val="661"/>
+    <w:basedOn w:val="882"/>
     <w:uiPriority w:val="99"/>
     <w:pPr>
       <w:pBdr/>
@@ -21432,9 +21428,9 @@
       </w:tcPr>
     </w:tblStylePr>
   </w:style>
-  <w:style w:type="table" w:styleId="101">
+  <w:style w:type="table" w:styleId="787">
     <w:name w:val="List Table 5 Dark - Accent 6"/>
-    <w:basedOn w:val="661"/>
+    <w:basedOn w:val="882"/>
     <w:uiPriority w:val="99"/>
     <w:pPr>
       <w:pBdr/>
@@ -21674,9 +21670,9 @@
       </w:tcPr>
     </w:tblStylePr>
   </w:style>
-  <w:style w:type="table" w:styleId="102">
+  <w:style w:type="table" w:styleId="788">
     <w:name w:val="List Table 6 Colorful"/>
-    <w:basedOn w:val="661"/>
+    <w:basedOn w:val="882"/>
     <w:uiPriority w:val="99"/>
     <w:pPr>
       <w:pBdr/>
@@ -21897,9 +21893,9 @@
       </w:tcPr>
     </w:tblStylePr>
   </w:style>
-  <w:style w:type="table" w:styleId="103">
+  <w:style w:type="table" w:styleId="789">
     <w:name w:val="List Table 6 Colorful - Accent 1"/>
-    <w:basedOn w:val="661"/>
+    <w:basedOn w:val="882"/>
     <w:uiPriority w:val="99"/>
     <w:pPr>
       <w:pBdr/>
@@ -22120,9 +22116,9 @@
       </w:tcPr>
     </w:tblStylePr>
   </w:style>
-  <w:style w:type="table" w:styleId="104">
+  <w:style w:type="table" w:styleId="790">
     <w:name w:val="List Table 6 Colorful - Accent 2"/>
-    <w:basedOn w:val="661"/>
+    <w:basedOn w:val="882"/>
     <w:uiPriority w:val="99"/>
     <w:pPr>
       <w:pBdr/>
@@ -22343,9 +22339,9 @@
       </w:tcPr>
     </w:tblStylePr>
   </w:style>
-  <w:style w:type="table" w:styleId="105">
+  <w:style w:type="table" w:styleId="791">
     <w:name w:val="List Table 6 Colorful - Accent 3"/>
-    <w:basedOn w:val="661"/>
+    <w:basedOn w:val="882"/>
     <w:uiPriority w:val="99"/>
     <w:pPr>
       <w:pBdr/>
@@ -22566,9 +22562,9 @@
       </w:tcPr>
     </w:tblStylePr>
   </w:style>
-  <w:style w:type="table" w:styleId="106">
+  <w:style w:type="table" w:styleId="792">
     <w:name w:val="List Table 6 Colorful - Accent 4"/>
-    <w:basedOn w:val="661"/>
+    <w:basedOn w:val="882"/>
     <w:uiPriority w:val="99"/>
     <w:pPr>
       <w:pBdr/>
@@ -22789,9 +22785,9 @@
       </w:tcPr>
     </w:tblStylePr>
   </w:style>
-  <w:style w:type="table" w:styleId="107">
+  <w:style w:type="table" w:styleId="793">
     <w:name w:val="List Table 6 Colorful - Accent 5"/>
-    <w:basedOn w:val="661"/>
+    <w:basedOn w:val="882"/>
     <w:uiPriority w:val="99"/>
     <w:pPr>
       <w:pBdr/>
@@ -23012,9 +23008,9 @@
       </w:tcPr>
     </w:tblStylePr>
   </w:style>
-  <w:style w:type="table" w:styleId="108">
+  <w:style w:type="table" w:styleId="794">
     <w:name w:val="List Table 6 Colorful - Accent 6"/>
-    <w:basedOn w:val="661"/>
+    <w:basedOn w:val="882"/>
     <w:uiPriority w:val="99"/>
     <w:pPr>
       <w:pBdr/>
@@ -23235,9 +23231,9 @@
       </w:tcPr>
     </w:tblStylePr>
   </w:style>
-  <w:style w:type="table" w:styleId="109">
+  <w:style w:type="table" w:styleId="795">
     <w:name w:val="List Table 7 Colorful"/>
-    <w:basedOn w:val="661"/>
+    <w:basedOn w:val="882"/>
     <w:uiPriority w:val="99"/>
     <w:pPr>
       <w:pBdr/>
@@ -23336,11 +23332,11 @@
         <w:tblBorders/>
       </w:tblPr>
       <w:tcPr>
-        <w:shd w:color="ffffff"/>
+        <w:shd w:val="clear" w:color="ffffff"/>
         <w:tcBorders>
-          <w:top w:val="none"/>
-          <w:left w:val="none"/>
-          <w:bottom w:val="none"/>
+          <w:top w:val="none" w:color="000000" w:sz="4" w:space="0"/>
+          <w:left w:val="none" w:color="000000" w:sz="4" w:space="0"/>
+          <w:bottom w:val="none" w:color="000000" w:sz="4" w:space="0"/>
           <w:right w:val="single" w:color="000000" w:themeColor="text1" w:themeTint="80" w:sz="4" w:space="0"/>
         </w:tcBorders>
       </w:tcPr>
@@ -23363,10 +23359,10 @@
       <w:tcPr>
         <w:shd w:val="clear" w:color="ffffff" w:themeColor="light1" w:fill="ffffff" w:themeFill="light1"/>
         <w:tcBorders>
-          <w:top w:val="none"/>
-          <w:left w:val="none"/>
+          <w:top w:val="none" w:color="000000" w:sz="4" w:space="0"/>
+          <w:left w:val="none" w:color="000000" w:sz="4" w:space="0"/>
           <w:bottom w:val="single" w:color="000000" w:themeColor="text1" w:themeTint="80" w:sz="4" w:space="0"/>
-          <w:right w:val="none"/>
+          <w:right w:val="none" w:color="000000" w:sz="4" w:space="0"/>
         </w:tcBorders>
       </w:tcPr>
     </w:tblStylePr>
@@ -23386,12 +23382,12 @@
         <w:tblBorders/>
       </w:tblPr>
       <w:tcPr>
-        <w:shd w:color="ffffff"/>
+        <w:shd w:val="clear" w:color="ffffff"/>
         <w:tcBorders>
-          <w:top w:val="none"/>
+          <w:top w:val="none" w:color="000000" w:sz="4" w:space="0"/>
           <w:left w:val="single" w:color="000000" w:themeColor="text1" w:themeTint="80" w:sz="4" w:space="0"/>
-          <w:bottom w:val="none"/>
-          <w:right w:val="none"/>
+          <w:bottom w:val="none" w:color="000000" w:sz="4" w:space="0"/>
+          <w:right w:val="none" w:color="000000" w:sz="4" w:space="0"/>
         </w:tcBorders>
       </w:tcPr>
     </w:tblStylePr>
@@ -23414,9 +23410,9 @@
         <w:shd w:val="clear" w:color="ffffff" w:themeColor="light1" w:fill="ffffff" w:themeFill="light1"/>
         <w:tcBorders>
           <w:top w:val="single" w:color="000000" w:themeColor="text1" w:themeTint="80" w:sz="4" w:space="0"/>
-          <w:left w:val="none"/>
-          <w:bottom w:val="none"/>
-          <w:right w:val="none"/>
+          <w:left w:val="none" w:color="000000" w:sz="4" w:space="0"/>
+          <w:bottom w:val="none" w:color="000000" w:sz="4" w:space="0"/>
+          <w:right w:val="none" w:color="000000" w:sz="4" w:space="0"/>
         </w:tcBorders>
       </w:tcPr>
     </w:tblStylePr>
@@ -23491,9 +23487,9 @@
       </w:tcPr>
     </w:tblStylePr>
   </w:style>
-  <w:style w:type="table" w:styleId="110">
+  <w:style w:type="table" w:styleId="796">
     <w:name w:val="List Table 7 Colorful - Accent 1"/>
-    <w:basedOn w:val="661"/>
+    <w:basedOn w:val="882"/>
     <w:uiPriority w:val="99"/>
     <w:pPr>
       <w:pBdr/>
@@ -23592,11 +23588,11 @@
         <w:tblBorders/>
       </w:tblPr>
       <w:tcPr>
-        <w:shd w:color="ffffff"/>
+        <w:shd w:val="clear" w:color="ffffff"/>
         <w:tcBorders>
-          <w:top w:val="none"/>
-          <w:left w:val="none"/>
-          <w:bottom w:val="none"/>
+          <w:top w:val="none" w:color="000000" w:sz="4" w:space="0"/>
+          <w:left w:val="none" w:color="000000" w:sz="4" w:space="0"/>
+          <w:bottom w:val="none" w:color="000000" w:sz="4" w:space="0"/>
           <w:right w:val="single" w:color="000000" w:themeColor="accent1" w:sz="4" w:space="0"/>
         </w:tcBorders>
       </w:tcPr>
@@ -23619,10 +23615,10 @@
       <w:tcPr>
         <w:shd w:val="clear" w:color="ffffff" w:themeColor="light1" w:fill="ffffff" w:themeFill="light1"/>
         <w:tcBorders>
-          <w:top w:val="none"/>
-          <w:left w:val="none"/>
+          <w:top w:val="none" w:color="000000" w:sz="4" w:space="0"/>
+          <w:left w:val="none" w:color="000000" w:sz="4" w:space="0"/>
           <w:bottom w:val="single" w:color="000000" w:themeColor="accent1" w:sz="4" w:space="0"/>
-          <w:right w:val="none"/>
+          <w:right w:val="none" w:color="000000" w:sz="4" w:space="0"/>
         </w:tcBorders>
       </w:tcPr>
     </w:tblStylePr>
@@ -23642,12 +23638,12 @@
         <w:tblBorders/>
       </w:tblPr>
       <w:tcPr>
-        <w:shd w:color="ffffff"/>
+        <w:shd w:val="clear" w:color="ffffff"/>
         <w:tcBorders>
-          <w:top w:val="none"/>
+          <w:top w:val="none" w:color="000000" w:sz="4" w:space="0"/>
           <w:left w:val="single" w:color="000000" w:themeColor="accent1" w:sz="4" w:space="0"/>
-          <w:bottom w:val="none"/>
-          <w:right w:val="none"/>
+          <w:bottom w:val="none" w:color="000000" w:sz="4" w:space="0"/>
+          <w:right w:val="none" w:color="000000" w:sz="4" w:space="0"/>
         </w:tcBorders>
       </w:tcPr>
     </w:tblStylePr>
@@ -23670,9 +23666,9 @@
         <w:shd w:val="clear" w:color="ffffff" w:themeColor="light1" w:fill="ffffff" w:themeFill="light1"/>
         <w:tcBorders>
           <w:top w:val="single" w:color="000000" w:themeColor="accent1" w:sz="4" w:space="0"/>
-          <w:left w:val="none"/>
-          <w:bottom w:val="none"/>
-          <w:right w:val="none"/>
+          <w:left w:val="none" w:color="000000" w:sz="4" w:space="0"/>
+          <w:bottom w:val="none" w:color="000000" w:sz="4" w:space="0"/>
+          <w:right w:val="none" w:color="000000" w:sz="4" w:space="0"/>
         </w:tcBorders>
       </w:tcPr>
     </w:tblStylePr>
@@ -23747,9 +23743,9 @@
       </w:tcPr>
     </w:tblStylePr>
   </w:style>
-  <w:style w:type="table" w:styleId="111">
+  <w:style w:type="table" w:styleId="797">
     <w:name w:val="List Table 7 Colorful - Accent 2"/>
-    <w:basedOn w:val="661"/>
+    <w:basedOn w:val="882"/>
     <w:uiPriority w:val="99"/>
     <w:pPr>
       <w:pBdr/>
@@ -23848,11 +23844,11 @@
         <w:tblBorders/>
       </w:tblPr>
       <w:tcPr>
-        <w:shd w:color="ffffff"/>
+        <w:shd w:val="clear" w:color="ffffff"/>
         <w:tcBorders>
-          <w:top w:val="none"/>
-          <w:left w:val="none"/>
-          <w:bottom w:val="none"/>
+          <w:top w:val="none" w:color="000000" w:sz="4" w:space="0"/>
+          <w:left w:val="none" w:color="000000" w:sz="4" w:space="0"/>
+          <w:bottom w:val="none" w:color="000000" w:sz="4" w:space="0"/>
           <w:right w:val="single" w:color="000000" w:themeColor="accent2" w:themeTint="97" w:sz="4" w:space="0"/>
         </w:tcBorders>
       </w:tcPr>
@@ -23875,10 +23871,10 @@
       <w:tcPr>
         <w:shd w:val="clear" w:color="ffffff" w:themeColor="light1" w:fill="ffffff" w:themeFill="light1"/>
         <w:tcBorders>
-          <w:top w:val="none"/>
-          <w:left w:val="none"/>
+          <w:top w:val="none" w:color="000000" w:sz="4" w:space="0"/>
+          <w:left w:val="none" w:color="000000" w:sz="4" w:space="0"/>
           <w:bottom w:val="single" w:color="000000" w:themeColor="accent2" w:themeTint="97" w:sz="4" w:space="0"/>
-          <w:right w:val="none"/>
+          <w:right w:val="none" w:color="000000" w:sz="4" w:space="0"/>
         </w:tcBorders>
       </w:tcPr>
     </w:tblStylePr>
@@ -23898,12 +23894,12 @@
         <w:tblBorders/>
       </w:tblPr>
       <w:tcPr>
-        <w:shd w:color="ffffff"/>
+        <w:shd w:val="clear" w:color="ffffff"/>
         <w:tcBorders>
-          <w:top w:val="none"/>
+          <w:top w:val="none" w:color="000000" w:sz="4" w:space="0"/>
           <w:left w:val="single" w:color="000000" w:themeColor="accent2" w:themeTint="97" w:sz="4" w:space="0"/>
-          <w:bottom w:val="none"/>
-          <w:right w:val="none"/>
+          <w:bottom w:val="none" w:color="000000" w:sz="4" w:space="0"/>
+          <w:right w:val="none" w:color="000000" w:sz="4" w:space="0"/>
         </w:tcBorders>
       </w:tcPr>
     </w:tblStylePr>
@@ -23926,9 +23922,9 @@
         <w:shd w:val="clear" w:color="ffffff" w:themeColor="light1" w:fill="ffffff" w:themeFill="light1"/>
         <w:tcBorders>
           <w:top w:val="single" w:color="000000" w:themeColor="accent2" w:themeTint="97" w:sz="4" w:space="0"/>
-          <w:left w:val="none"/>
-          <w:bottom w:val="none"/>
-          <w:right w:val="none"/>
+          <w:left w:val="none" w:color="000000" w:sz="4" w:space="0"/>
+          <w:bottom w:val="none" w:color="000000" w:sz="4" w:space="0"/>
+          <w:right w:val="none" w:color="000000" w:sz="4" w:space="0"/>
         </w:tcBorders>
       </w:tcPr>
     </w:tblStylePr>
@@ -24003,9 +23999,9 @@
       </w:tcPr>
     </w:tblStylePr>
   </w:style>
-  <w:style w:type="table" w:styleId="112">
+  <w:style w:type="table" w:styleId="798">
     <w:name w:val="List Table 7 Colorful - Accent 3"/>
-    <w:basedOn w:val="661"/>
+    <w:basedOn w:val="882"/>
     <w:uiPriority w:val="99"/>
     <w:pPr>
       <w:pBdr/>
@@ -24104,11 +24100,11 @@
         <w:tblBorders/>
       </w:tblPr>
       <w:tcPr>
-        <w:shd w:color="ffffff"/>
+        <w:shd w:val="clear" w:color="ffffff"/>
         <w:tcBorders>
-          <w:top w:val="none"/>
-          <w:left w:val="none"/>
-          <w:bottom w:val="none"/>
+          <w:top w:val="none" w:color="000000" w:sz="4" w:space="0"/>
+          <w:left w:val="none" w:color="000000" w:sz="4" w:space="0"/>
+          <w:bottom w:val="none" w:color="000000" w:sz="4" w:space="0"/>
           <w:right w:val="single" w:color="000000" w:themeColor="accent3" w:themeTint="98" w:sz="4" w:space="0"/>
         </w:tcBorders>
       </w:tcPr>
@@ -24131,10 +24127,10 @@
       <w:tcPr>
         <w:shd w:val="clear" w:color="ffffff" w:themeColor="light1" w:fill="ffffff" w:themeFill="light1"/>
         <w:tcBorders>
-          <w:top w:val="none"/>
-          <w:left w:val="none"/>
+          <w:top w:val="none" w:color="000000" w:sz="4" w:space="0"/>
+          <w:left w:val="none" w:color="000000" w:sz="4" w:space="0"/>
           <w:bottom w:val="single" w:color="000000" w:themeColor="accent3" w:themeTint="98" w:sz="4" w:space="0"/>
-          <w:right w:val="none"/>
+          <w:right w:val="none" w:color="000000" w:sz="4" w:space="0"/>
         </w:tcBorders>
       </w:tcPr>
     </w:tblStylePr>
@@ -24154,12 +24150,12 @@
         <w:tblBorders/>
       </w:tblPr>
       <w:tcPr>
-        <w:shd w:color="ffffff"/>
+        <w:shd w:val="clear" w:color="ffffff"/>
         <w:tcBorders>
-          <w:top w:val="none"/>
+          <w:top w:val="none" w:color="000000" w:sz="4" w:space="0"/>
           <w:left w:val="single" w:color="000000" w:themeColor="accent3" w:themeTint="98" w:sz="4" w:space="0"/>
-          <w:bottom w:val="none"/>
-          <w:right w:val="none"/>
+          <w:bottom w:val="none" w:color="000000" w:sz="4" w:space="0"/>
+          <w:right w:val="none" w:color="000000" w:sz="4" w:space="0"/>
         </w:tcBorders>
       </w:tcPr>
     </w:tblStylePr>
@@ -24182,9 +24178,9 @@
         <w:shd w:val="clear" w:color="ffffff" w:themeColor="light1" w:fill="ffffff" w:themeFill="light1"/>
         <w:tcBorders>
           <w:top w:val="single" w:color="000000" w:themeColor="accent3" w:themeTint="98" w:sz="4" w:space="0"/>
-          <w:left w:val="none"/>
-          <w:bottom w:val="none"/>
-          <w:right w:val="none"/>
+          <w:left w:val="none" w:color="000000" w:sz="4" w:space="0"/>
+          <w:bottom w:val="none" w:color="000000" w:sz="4" w:space="0"/>
+          <w:right w:val="none" w:color="000000" w:sz="4" w:space="0"/>
         </w:tcBorders>
       </w:tcPr>
     </w:tblStylePr>
@@ -24259,9 +24255,9 @@
       </w:tcPr>
     </w:tblStylePr>
   </w:style>
-  <w:style w:type="table" w:styleId="113">
+  <w:style w:type="table" w:styleId="799">
     <w:name w:val="List Table 7 Colorful - Accent 4"/>
-    <w:basedOn w:val="661"/>
+    <w:basedOn w:val="882"/>
     <w:uiPriority w:val="99"/>
     <w:pPr>
       <w:pBdr/>
@@ -24360,11 +24356,11 @@
         <w:tblBorders/>
       </w:tblPr>
       <w:tcPr>
-        <w:shd w:color="ffffff"/>
+        <w:shd w:val="clear" w:color="ffffff"/>
         <w:tcBorders>
-          <w:top w:val="none"/>
-          <w:left w:val="none"/>
-          <w:bottom w:val="none"/>
+          <w:top w:val="none" w:color="000000" w:sz="4" w:space="0"/>
+          <w:left w:val="none" w:color="000000" w:sz="4" w:space="0"/>
+          <w:bottom w:val="none" w:color="000000" w:sz="4" w:space="0"/>
           <w:right w:val="single" w:color="000000" w:themeColor="accent4" w:themeTint="9A" w:sz="4" w:space="0"/>
         </w:tcBorders>
       </w:tcPr>
@@ -24387,10 +24383,10 @@
       <w:tcPr>
         <w:shd w:val="clear" w:color="ffffff" w:themeColor="light1" w:fill="ffffff" w:themeFill="light1"/>
         <w:tcBorders>
-          <w:top w:val="none"/>
-          <w:left w:val="none"/>
+          <w:top w:val="none" w:color="000000" w:sz="4" w:space="0"/>
+          <w:left w:val="none" w:color="000000" w:sz="4" w:space="0"/>
           <w:bottom w:val="single" w:color="000000" w:themeColor="accent4" w:themeTint="9A" w:sz="4" w:space="0"/>
-          <w:right w:val="none"/>
+          <w:right w:val="none" w:color="000000" w:sz="4" w:space="0"/>
         </w:tcBorders>
       </w:tcPr>
     </w:tblStylePr>
@@ -24410,12 +24406,12 @@
         <w:tblBorders/>
       </w:tblPr>
       <w:tcPr>
-        <w:shd w:color="ffffff"/>
+        <w:shd w:val="clear" w:color="ffffff"/>
         <w:tcBorders>
-          <w:top w:val="none"/>
+          <w:top w:val="none" w:color="000000" w:sz="4" w:space="0"/>
           <w:left w:val="single" w:color="000000" w:themeColor="accent4" w:themeTint="9A" w:sz="4" w:space="0"/>
-          <w:bottom w:val="none"/>
-          <w:right w:val="none"/>
+          <w:bottom w:val="none" w:color="000000" w:sz="4" w:space="0"/>
+          <w:right w:val="none" w:color="000000" w:sz="4" w:space="0"/>
         </w:tcBorders>
       </w:tcPr>
     </w:tblStylePr>
@@ -24438,9 +24434,9 @@
         <w:shd w:val="clear" w:color="ffffff" w:themeColor="light1" w:fill="ffffff" w:themeFill="light1"/>
         <w:tcBorders>
           <w:top w:val="single" w:color="000000" w:themeColor="accent4" w:themeTint="9A" w:sz="4" w:space="0"/>
-          <w:left w:val="none"/>
-          <w:bottom w:val="none"/>
-          <w:right w:val="none"/>
+          <w:left w:val="none" w:color="000000" w:sz="4" w:space="0"/>
+          <w:bottom w:val="none" w:color="000000" w:sz="4" w:space="0"/>
+          <w:right w:val="none" w:color="000000" w:sz="4" w:space="0"/>
         </w:tcBorders>
       </w:tcPr>
     </w:tblStylePr>
@@ -24515,9 +24511,9 @@
       </w:tcPr>
     </w:tblStylePr>
   </w:style>
-  <w:style w:type="table" w:styleId="114">
+  <w:style w:type="table" w:styleId="800">
     <w:name w:val="List Table 7 Colorful - Accent 5"/>
-    <w:basedOn w:val="661"/>
+    <w:basedOn w:val="882"/>
     <w:uiPriority w:val="99"/>
     <w:pPr>
       <w:pBdr/>
@@ -24616,11 +24612,11 @@
         <w:tblBorders/>
       </w:tblPr>
       <w:tcPr>
-        <w:shd w:color="ffffff"/>
+        <w:shd w:val="clear" w:color="ffffff"/>
         <w:tcBorders>
-          <w:top w:val="none"/>
-          <w:left w:val="none"/>
-          <w:bottom w:val="none"/>
+          <w:top w:val="none" w:color="000000" w:sz="4" w:space="0"/>
+          <w:left w:val="none" w:color="000000" w:sz="4" w:space="0"/>
+          <w:bottom w:val="none" w:color="000000" w:sz="4" w:space="0"/>
           <w:right w:val="single" w:color="000000" w:themeColor="accent5" w:themeTint="9A" w:sz="4" w:space="0"/>
         </w:tcBorders>
       </w:tcPr>
@@ -24643,10 +24639,10 @@
       <w:tcPr>
         <w:shd w:val="clear" w:color="ffffff" w:themeColor="light1" w:fill="ffffff" w:themeFill="light1"/>
         <w:tcBorders>
-          <w:top w:val="none"/>
-          <w:left w:val="none"/>
+          <w:top w:val="none" w:color="000000" w:sz="4" w:space="0"/>
+          <w:left w:val="none" w:color="000000" w:sz="4" w:space="0"/>
           <w:bottom w:val="single" w:color="000000" w:themeColor="accent5" w:themeTint="9A" w:sz="4" w:space="0"/>
-          <w:right w:val="none"/>
+          <w:right w:val="none" w:color="000000" w:sz="4" w:space="0"/>
         </w:tcBorders>
       </w:tcPr>
     </w:tblStylePr>
@@ -24666,12 +24662,12 @@
         <w:tblBorders/>
       </w:tblPr>
       <w:tcPr>
-        <w:shd w:color="ffffff"/>
+        <w:shd w:val="clear" w:color="ffffff"/>
         <w:tcBorders>
-          <w:top w:val="none"/>
+          <w:top w:val="none" w:color="000000" w:sz="4" w:space="0"/>
           <w:left w:val="single" w:color="000000" w:themeColor="accent5" w:themeTint="9A" w:sz="4" w:space="0"/>
-          <w:bottom w:val="none"/>
-          <w:right w:val="none"/>
+          <w:bottom w:val="none" w:color="000000" w:sz="4" w:space="0"/>
+          <w:right w:val="none" w:color="000000" w:sz="4" w:space="0"/>
         </w:tcBorders>
       </w:tcPr>
     </w:tblStylePr>
@@ -24694,9 +24690,9 @@
         <w:shd w:val="clear" w:color="ffffff" w:themeColor="light1" w:fill="ffffff" w:themeFill="light1"/>
         <w:tcBorders>
           <w:top w:val="single" w:color="000000" w:themeColor="accent5" w:themeTint="9A" w:sz="4" w:space="0"/>
-          <w:left w:val="none"/>
-          <w:bottom w:val="none"/>
-          <w:right w:val="none"/>
+          <w:left w:val="none" w:color="000000" w:sz="4" w:space="0"/>
+          <w:bottom w:val="none" w:color="000000" w:sz="4" w:space="0"/>
+          <w:right w:val="none" w:color="000000" w:sz="4" w:space="0"/>
         </w:tcBorders>
       </w:tcPr>
     </w:tblStylePr>
@@ -24771,9 +24767,9 @@
       </w:tcPr>
     </w:tblStylePr>
   </w:style>
-  <w:style w:type="table" w:styleId="115">
+  <w:style w:type="table" w:styleId="801">
     <w:name w:val="List Table 7 Colorful - Accent 6"/>
-    <w:basedOn w:val="661"/>
+    <w:basedOn w:val="882"/>
     <w:uiPriority w:val="99"/>
     <w:pPr>
       <w:pBdr/>
@@ -24872,11 +24868,11 @@
         <w:tblBorders/>
       </w:tblPr>
       <w:tcPr>
-        <w:shd w:color="ffffff"/>
+        <w:shd w:val="clear" w:color="ffffff"/>
         <w:tcBorders>
-          <w:top w:val="none"/>
-          <w:left w:val="none"/>
-          <w:bottom w:val="none"/>
+          <w:top w:val="none" w:color="000000" w:sz="4" w:space="0"/>
+          <w:left w:val="none" w:color="000000" w:sz="4" w:space="0"/>
+          <w:bottom w:val="none" w:color="000000" w:sz="4" w:space="0"/>
           <w:right w:val="single" w:color="000000" w:themeColor="accent6" w:themeTint="98" w:sz="4" w:space="0"/>
         </w:tcBorders>
       </w:tcPr>
@@ -24899,10 +24895,10 @@
       <w:tcPr>
         <w:shd w:val="clear" w:color="ffffff" w:themeColor="light1" w:fill="ffffff" w:themeFill="light1"/>
         <w:tcBorders>
-          <w:top w:val="none"/>
-          <w:left w:val="none"/>
+          <w:top w:val="none" w:color="000000" w:sz="4" w:space="0"/>
+          <w:left w:val="none" w:color="000000" w:sz="4" w:space="0"/>
           <w:bottom w:val="single" w:color="000000" w:themeColor="accent6" w:themeTint="98" w:sz="4" w:space="0"/>
-          <w:right w:val="none"/>
+          <w:right w:val="none" w:color="000000" w:sz="4" w:space="0"/>
         </w:tcBorders>
       </w:tcPr>
     </w:tblStylePr>
@@ -24922,12 +24918,12 @@
         <w:tblBorders/>
       </w:tblPr>
       <w:tcPr>
-        <w:shd w:color="ffffff"/>
+        <w:shd w:val="clear" w:color="ffffff"/>
         <w:tcBorders>
-          <w:top w:val="none"/>
+          <w:top w:val="none" w:color="000000" w:sz="4" w:space="0"/>
           <w:left w:val="single" w:color="000000" w:themeColor="accent6" w:themeTint="98" w:sz="4" w:space="0"/>
-          <w:bottom w:val="none"/>
-          <w:right w:val="none"/>
+          <w:bottom w:val="none" w:color="000000" w:sz="4" w:space="0"/>
+          <w:right w:val="none" w:color="000000" w:sz="4" w:space="0"/>
         </w:tcBorders>
       </w:tcPr>
     </w:tblStylePr>
@@ -24950,9 +24946,9 @@
         <w:shd w:val="clear" w:color="ffffff" w:themeColor="light1" w:fill="ffffff" w:themeFill="light1"/>
         <w:tcBorders>
           <w:top w:val="single" w:color="000000" w:themeColor="accent6" w:themeTint="98" w:sz="4" w:space="0"/>
-          <w:left w:val="none"/>
-          <w:bottom w:val="none"/>
-          <w:right w:val="none"/>
+          <w:left w:val="none" w:color="000000" w:sz="4" w:space="0"/>
+          <w:bottom w:val="none" w:color="000000" w:sz="4" w:space="0"/>
+          <w:right w:val="none" w:color="000000" w:sz="4" w:space="0"/>
         </w:tcBorders>
       </w:tcPr>
     </w:tblStylePr>
@@ -25027,9 +25023,9 @@
       </w:tcPr>
     </w:tblStylePr>
   </w:style>
-  <w:style w:type="table" w:styleId="116">
+  <w:style w:type="table" w:styleId="802">
     <w:name w:val="Lined - Accent"/>
-    <w:basedOn w:val="661"/>
+    <w:basedOn w:val="882"/>
     <w:uiPriority w:val="99"/>
     <w:pPr>
       <w:pBdr/>
@@ -25264,9 +25260,9 @@
       </w:tcPr>
     </w:tblStylePr>
   </w:style>
-  <w:style w:type="table" w:styleId="117">
+  <w:style w:type="table" w:styleId="803">
     <w:name w:val="Lined - Accent 1"/>
-    <w:basedOn w:val="661"/>
+    <w:basedOn w:val="882"/>
     <w:uiPriority w:val="99"/>
     <w:pPr>
       <w:pBdr/>
@@ -25501,9 +25497,9 @@
       </w:tcPr>
     </w:tblStylePr>
   </w:style>
-  <w:style w:type="table" w:styleId="118">
+  <w:style w:type="table" w:styleId="804">
     <w:name w:val="Lined - Accent 2"/>
-    <w:basedOn w:val="661"/>
+    <w:basedOn w:val="882"/>
     <w:uiPriority w:val="99"/>
     <w:pPr>
       <w:pBdr/>
@@ -25738,9 +25734,9 @@
       </w:tcPr>
     </w:tblStylePr>
   </w:style>
-  <w:style w:type="table" w:styleId="119">
+  <w:style w:type="table" w:styleId="805">
     <w:name w:val="Lined - Accent 3"/>
-    <w:basedOn w:val="661"/>
+    <w:basedOn w:val="882"/>
     <w:uiPriority w:val="99"/>
     <w:pPr>
       <w:pBdr/>
@@ -25975,9 +25971,9 @@
       </w:tcPr>
     </w:tblStylePr>
   </w:style>
-  <w:style w:type="table" w:styleId="120">
+  <w:style w:type="table" w:styleId="806">
     <w:name w:val="Lined - Accent 4"/>
-    <w:basedOn w:val="661"/>
+    <w:basedOn w:val="882"/>
     <w:uiPriority w:val="99"/>
     <w:pPr>
       <w:pBdr/>
@@ -26212,9 +26208,9 @@
       </w:tcPr>
     </w:tblStylePr>
   </w:style>
-  <w:style w:type="table" w:styleId="121">
+  <w:style w:type="table" w:styleId="807">
     <w:name w:val="Lined - Accent 5"/>
-    <w:basedOn w:val="661"/>
+    <w:basedOn w:val="882"/>
     <w:uiPriority w:val="99"/>
     <w:pPr>
       <w:pBdr/>
@@ -26449,9 +26445,9 @@
       </w:tcPr>
     </w:tblStylePr>
   </w:style>
-  <w:style w:type="table" w:styleId="122">
+  <w:style w:type="table" w:styleId="808">
     <w:name w:val="Lined - Accent 6"/>
-    <w:basedOn w:val="661"/>
+    <w:basedOn w:val="882"/>
     <w:uiPriority w:val="99"/>
     <w:pPr>
       <w:pBdr/>
@@ -26686,9 +26682,9 @@
       </w:tcPr>
     </w:tblStylePr>
   </w:style>
-  <w:style w:type="table" w:styleId="123">
+  <w:style w:type="table" w:styleId="809">
     <w:name w:val="Bordered &amp; Lined - Accent"/>
-    <w:basedOn w:val="661"/>
+    <w:basedOn w:val="882"/>
     <w:uiPriority w:val="99"/>
     <w:pPr>
       <w:pBdr/>
@@ -26930,9 +26926,9 @@
       </w:tcPr>
     </w:tblStylePr>
   </w:style>
-  <w:style w:type="table" w:styleId="124">
+  <w:style w:type="table" w:styleId="810">
     <w:name w:val="Bordered &amp; Lined - Accent 1"/>
-    <w:basedOn w:val="661"/>
+    <w:basedOn w:val="882"/>
     <w:uiPriority w:val="99"/>
     <w:pPr>
       <w:pBdr/>
@@ -27174,9 +27170,9 @@
       </w:tcPr>
     </w:tblStylePr>
   </w:style>
-  <w:style w:type="table" w:styleId="125">
+  <w:style w:type="table" w:styleId="811">
     <w:name w:val="Bordered &amp; Lined - Accent 2"/>
-    <w:basedOn w:val="661"/>
+    <w:basedOn w:val="882"/>
     <w:uiPriority w:val="99"/>
     <w:pPr>
       <w:pBdr/>
@@ -27418,9 +27414,9 @@
       </w:tcPr>
     </w:tblStylePr>
   </w:style>
-  <w:style w:type="table" w:styleId="126">
+  <w:style w:type="table" w:styleId="812">
     <w:name w:val="Bordered &amp; Lined - Accent 3"/>
-    <w:basedOn w:val="661"/>
+    <w:basedOn w:val="882"/>
     <w:uiPriority w:val="99"/>
     <w:pPr>
       <w:pBdr/>
@@ -27662,9 +27658,9 @@
       </w:tcPr>
     </w:tblStylePr>
   </w:style>
-  <w:style w:type="table" w:styleId="127">
+  <w:style w:type="table" w:styleId="813">
     <w:name w:val="Bordered &amp; Lined - Accent 4"/>
-    <w:basedOn w:val="661"/>
+    <w:basedOn w:val="882"/>
     <w:uiPriority w:val="99"/>
     <w:pPr>
       <w:pBdr/>
@@ -27906,9 +27902,9 @@
       </w:tcPr>
     </w:tblStylePr>
   </w:style>
-  <w:style w:type="table" w:styleId="128">
+  <w:style w:type="table" w:styleId="814">
     <w:name w:val="Bordered &amp; Lined - Accent 5"/>
-    <w:basedOn w:val="661"/>
+    <w:basedOn w:val="882"/>
     <w:uiPriority w:val="99"/>
     <w:pPr>
       <w:pBdr/>
@@ -28150,9 +28146,9 @@
       </w:tcPr>
     </w:tblStylePr>
   </w:style>
-  <w:style w:type="table" w:styleId="129">
+  <w:style w:type="table" w:styleId="815">
     <w:name w:val="Bordered &amp; Lined - Accent 6"/>
-    <w:basedOn w:val="661"/>
+    <w:basedOn w:val="882"/>
     <w:uiPriority w:val="99"/>
     <w:pPr>
       <w:pBdr/>
@@ -28394,9 +28390,9 @@
       </w:tcPr>
     </w:tblStylePr>
   </w:style>
-  <w:style w:type="table" w:styleId="130">
+  <w:style w:type="table" w:styleId="816">
     <w:name w:val="Bordered"/>
-    <w:basedOn w:val="661"/>
+    <w:basedOn w:val="882"/>
     <w:uiPriority w:val="99"/>
     <w:pPr>
       <w:pBdr/>
@@ -28625,9 +28621,9 @@
       </w:tcPr>
     </w:tblStylePr>
   </w:style>
-  <w:style w:type="table" w:styleId="131">
+  <w:style w:type="table" w:styleId="817">
     <w:name w:val="Bordered - Accent 1"/>
-    <w:basedOn w:val="661"/>
+    <w:basedOn w:val="882"/>
     <w:uiPriority w:val="99"/>
     <w:pPr>
       <w:pBdr/>
@@ -28856,9 +28852,9 @@
       </w:tcPr>
     </w:tblStylePr>
   </w:style>
-  <w:style w:type="table" w:styleId="132">
+  <w:style w:type="table" w:styleId="818">
     <w:name w:val="Bordered - Accent 2"/>
-    <w:basedOn w:val="661"/>
+    <w:basedOn w:val="882"/>
     <w:uiPriority w:val="99"/>
     <w:pPr>
       <w:pBdr/>
@@ -29087,9 +29083,9 @@
       </w:tcPr>
     </w:tblStylePr>
   </w:style>
-  <w:style w:type="table" w:styleId="133">
+  <w:style w:type="table" w:styleId="819">
     <w:name w:val="Bordered - Accent 3"/>
-    <w:basedOn w:val="661"/>
+    <w:basedOn w:val="882"/>
     <w:uiPriority w:val="99"/>
     <w:pPr>
       <w:pBdr/>
@@ -29318,9 +29314,9 @@
       </w:tcPr>
     </w:tblStylePr>
   </w:style>
-  <w:style w:type="table" w:styleId="134">
+  <w:style w:type="table" w:styleId="820">
     <w:name w:val="Bordered - Accent 4"/>
-    <w:basedOn w:val="661"/>
+    <w:basedOn w:val="882"/>
     <w:uiPriority w:val="99"/>
     <w:pPr>
       <w:pBdr/>
@@ -29549,9 +29545,9 @@
       </w:tcPr>
     </w:tblStylePr>
   </w:style>
-  <w:style w:type="table" w:styleId="135">
+  <w:style w:type="table" w:styleId="821">
     <w:name w:val="Bordered - Accent 5"/>
-    <w:basedOn w:val="661"/>
+    <w:basedOn w:val="882"/>
     <w:uiPriority w:val="99"/>
     <w:pPr>
       <w:pBdr/>
@@ -29780,9 +29776,9 @@
       </w:tcPr>
     </w:tblStylePr>
   </w:style>
-  <w:style w:type="table" w:styleId="136">
+  <w:style w:type="table" w:styleId="822">
     <w:name w:val="Bordered - Accent 6"/>
-    <w:basedOn w:val="661"/>
+    <w:basedOn w:val="882"/>
     <w:uiPriority w:val="99"/>
     <w:pPr>
       <w:pBdr/>
@@ -30011,11 +30007,11 @@
       </w:tcPr>
     </w:tblStylePr>
   </w:style>
-  <w:style w:type="paragraph" w:styleId="138">
+  <w:style w:type="paragraph" w:styleId="823">
     <w:name w:val="Heading 1"/>
-    <w:basedOn w:val="660"/>
-    <w:next w:val="660"/>
-    <w:link w:val="149"/>
+    <w:basedOn w:val="881"/>
+    <w:next w:val="881"/>
+    <w:link w:val="833"/>
     <w:uiPriority w:val="9"/>
     <w:qFormat/>
     <w:pPr>
@@ -30033,11 +30029,11 @@
       <w:szCs w:val="40"/>
     </w:rPr>
   </w:style>
-  <w:style w:type="paragraph" w:styleId="139">
+  <w:style w:type="paragraph" w:styleId="824">
     <w:name w:val="Heading 2"/>
-    <w:basedOn w:val="660"/>
-    <w:next w:val="660"/>
-    <w:link w:val="150"/>
+    <w:basedOn w:val="881"/>
+    <w:next w:val="881"/>
+    <w:link w:val="834"/>
     <w:uiPriority w:val="9"/>
     <w:unhideWhenUsed/>
     <w:qFormat/>
@@ -30056,11 +30052,11 @@
       <w:szCs w:val="32"/>
     </w:rPr>
   </w:style>
-  <w:style w:type="paragraph" w:styleId="140">
+  <w:style w:type="paragraph" w:styleId="825">
     <w:name w:val="Heading 3"/>
-    <w:basedOn w:val="660"/>
-    <w:next w:val="660"/>
-    <w:link w:val="151"/>
+    <w:basedOn w:val="881"/>
+    <w:next w:val="881"/>
+    <w:link w:val="835"/>
     <w:uiPriority w:val="9"/>
     <w:unhideWhenUsed/>
     <w:qFormat/>
@@ -30079,11 +30075,11 @@
       <w:szCs w:val="28"/>
     </w:rPr>
   </w:style>
-  <w:style w:type="paragraph" w:styleId="141">
+  <w:style w:type="paragraph" w:styleId="826">
     <w:name w:val="Heading 4"/>
-    <w:basedOn w:val="660"/>
-    <w:next w:val="660"/>
-    <w:link w:val="152"/>
+    <w:basedOn w:val="881"/>
+    <w:next w:val="881"/>
+    <w:link w:val="836"/>
     <w:uiPriority w:val="9"/>
     <w:unhideWhenUsed/>
     <w:qFormat/>
@@ -30102,11 +30098,11 @@
       <w:color w:val="0f4761" w:themeColor="accent1" w:themeShade="BF"/>
     </w:rPr>
   </w:style>
-  <w:style w:type="paragraph" w:styleId="142">
+  <w:style w:type="paragraph" w:styleId="827">
     <w:name w:val="Heading 5"/>
-    <w:basedOn w:val="660"/>
-    <w:next w:val="660"/>
-    <w:link w:val="153"/>
+    <w:basedOn w:val="881"/>
+    <w:next w:val="881"/>
+    <w:link w:val="837"/>
     <w:uiPriority w:val="9"/>
     <w:unhideWhenUsed/>
     <w:qFormat/>
@@ -30123,11 +30119,11 @@
       <w:color w:val="0f4761" w:themeColor="accent1" w:themeShade="BF"/>
     </w:rPr>
   </w:style>
-  <w:style w:type="paragraph" w:styleId="143">
+  <w:style w:type="paragraph" w:styleId="828">
     <w:name w:val="Heading 6"/>
-    <w:basedOn w:val="660"/>
-    <w:next w:val="660"/>
-    <w:link w:val="154"/>
+    <w:basedOn w:val="881"/>
+    <w:next w:val="881"/>
+    <w:link w:val="838"/>
     <w:uiPriority w:val="9"/>
     <w:unhideWhenUsed/>
     <w:qFormat/>
@@ -30146,11 +30142,11 @@
       <w:color w:val="595959" w:themeColor="text1" w:themeTint="A6"/>
     </w:rPr>
   </w:style>
-  <w:style w:type="paragraph" w:styleId="144">
+  <w:style w:type="paragraph" w:styleId="829">
     <w:name w:val="Heading 7"/>
-    <w:basedOn w:val="660"/>
-    <w:next w:val="660"/>
-    <w:link w:val="155"/>
+    <w:basedOn w:val="881"/>
+    <w:next w:val="881"/>
+    <w:link w:val="839"/>
     <w:uiPriority w:val="9"/>
     <w:unhideWhenUsed/>
     <w:qFormat/>
@@ -30167,11 +30163,11 @@
       <w:color w:val="595959" w:themeColor="text1" w:themeTint="A6"/>
     </w:rPr>
   </w:style>
-  <w:style w:type="paragraph" w:styleId="145">
+  <w:style w:type="paragraph" w:styleId="830">
     <w:name w:val="Heading 8"/>
-    <w:basedOn w:val="660"/>
-    <w:next w:val="660"/>
-    <w:link w:val="156"/>
+    <w:basedOn w:val="881"/>
+    <w:next w:val="881"/>
+    <w:link w:val="840"/>
     <w:uiPriority w:val="9"/>
     <w:unhideWhenUsed/>
     <w:qFormat/>
@@ -30190,11 +30186,11 @@
       <w:color w:val="272727" w:themeColor="text1" w:themeTint="D8"/>
     </w:rPr>
   </w:style>
-  <w:style w:type="paragraph" w:styleId="146">
+  <w:style w:type="paragraph" w:styleId="831">
     <w:name w:val="Heading 9"/>
-    <w:basedOn w:val="660"/>
-    <w:next w:val="660"/>
-    <w:link w:val="157"/>
+    <w:basedOn w:val="881"/>
+    <w:next w:val="881"/>
+    <w:link w:val="841"/>
     <w:uiPriority w:val="9"/>
     <w:unhideWhenUsed/>
     <w:qFormat/>
@@ -30213,7 +30209,7 @@
       <w:color w:val="272727" w:themeColor="text1" w:themeTint="D8"/>
     </w:rPr>
   </w:style>
-  <w:style w:type="character" w:styleId="147" w:default="1">
+  <w:style w:type="character" w:styleId="832" w:default="1">
     <w:name w:val="Default Paragraph Font"/>
     <w:uiPriority w:val="1"/>
     <w:semiHidden/>
@@ -30224,10 +30220,10 @@
       <w:ind/>
     </w:pPr>
   </w:style>
-  <w:style w:type="character" w:styleId="149">
+  <w:style w:type="character" w:styleId="833">
     <w:name w:val="Heading 1 Char"/>
-    <w:basedOn w:val="147"/>
-    <w:link w:val="138"/>
+    <w:basedOn w:val="832"/>
+    <w:link w:val="823"/>
     <w:uiPriority w:val="9"/>
     <w:pPr>
       <w:pBdr/>
@@ -30241,10 +30237,10 @@
       <w:szCs w:val="40"/>
     </w:rPr>
   </w:style>
-  <w:style w:type="character" w:styleId="150">
+  <w:style w:type="character" w:styleId="834">
     <w:name w:val="Heading 2 Char"/>
-    <w:basedOn w:val="147"/>
-    <w:link w:val="139"/>
+    <w:basedOn w:val="832"/>
+    <w:link w:val="824"/>
     <w:uiPriority w:val="9"/>
     <w:pPr>
       <w:pBdr/>
@@ -30258,10 +30254,10 @@
       <w:szCs w:val="32"/>
     </w:rPr>
   </w:style>
-  <w:style w:type="character" w:styleId="151">
+  <w:style w:type="character" w:styleId="835">
     <w:name w:val="Heading 3 Char"/>
-    <w:basedOn w:val="147"/>
-    <w:link w:val="140"/>
+    <w:basedOn w:val="832"/>
+    <w:link w:val="825"/>
     <w:uiPriority w:val="9"/>
     <w:pPr>
       <w:pBdr/>
@@ -30275,10 +30271,10 @@
       <w:szCs w:val="28"/>
     </w:rPr>
   </w:style>
-  <w:style w:type="character" w:styleId="152">
+  <w:style w:type="character" w:styleId="836">
     <w:name w:val="Heading 4 Char"/>
-    <w:basedOn w:val="147"/>
-    <w:link w:val="141"/>
+    <w:basedOn w:val="832"/>
+    <w:link w:val="826"/>
     <w:uiPriority w:val="9"/>
     <w:pPr>
       <w:pBdr/>
@@ -30292,10 +30288,10 @@
       <w:color w:val="0f4761" w:themeColor="accent1" w:themeShade="BF"/>
     </w:rPr>
   </w:style>
-  <w:style w:type="character" w:styleId="153">
+  <w:style w:type="character" w:styleId="837">
     <w:name w:val="Heading 5 Char"/>
-    <w:basedOn w:val="147"/>
-    <w:link w:val="142"/>
+    <w:basedOn w:val="832"/>
+    <w:link w:val="827"/>
     <w:uiPriority w:val="9"/>
     <w:pPr>
       <w:pBdr/>
@@ -30307,10 +30303,10 @@
       <w:color w:val="0f4761" w:themeColor="accent1" w:themeShade="BF"/>
     </w:rPr>
   </w:style>
-  <w:style w:type="character" w:styleId="154">
+  <w:style w:type="character" w:styleId="838">
     <w:name w:val="Heading 6 Char"/>
-    <w:basedOn w:val="147"/>
-    <w:link w:val="143"/>
+    <w:basedOn w:val="832"/>
+    <w:link w:val="828"/>
     <w:uiPriority w:val="9"/>
     <w:pPr>
       <w:pBdr/>
@@ -30324,10 +30320,10 @@
       <w:color w:val="595959" w:themeColor="text1" w:themeTint="A6"/>
     </w:rPr>
   </w:style>
-  <w:style w:type="character" w:styleId="155">
+  <w:style w:type="character" w:styleId="839">
     <w:name w:val="Heading 7 Char"/>
-    <w:basedOn w:val="147"/>
-    <w:link w:val="144"/>
+    <w:basedOn w:val="832"/>
+    <w:link w:val="829"/>
     <w:uiPriority w:val="9"/>
     <w:pPr>
       <w:pBdr/>
@@ -30339,10 +30335,10 @@
       <w:color w:val="595959" w:themeColor="text1" w:themeTint="A6"/>
     </w:rPr>
   </w:style>
-  <w:style w:type="character" w:styleId="156">
+  <w:style w:type="character" w:styleId="840">
     <w:name w:val="Heading 8 Char"/>
-    <w:basedOn w:val="147"/>
-    <w:link w:val="145"/>
+    <w:basedOn w:val="832"/>
+    <w:link w:val="830"/>
     <w:uiPriority w:val="9"/>
     <w:pPr>
       <w:pBdr/>
@@ -30356,10 +30352,10 @@
       <w:color w:val="272727" w:themeColor="text1" w:themeTint="D8"/>
     </w:rPr>
   </w:style>
-  <w:style w:type="character" w:styleId="157">
+  <w:style w:type="character" w:styleId="841">
     <w:name w:val="Heading 9 Char"/>
-    <w:basedOn w:val="147"/>
-    <w:link w:val="146"/>
+    <w:basedOn w:val="832"/>
+    <w:link w:val="831"/>
     <w:uiPriority w:val="9"/>
     <w:pPr>
       <w:pBdr/>
@@ -30373,11 +30369,11 @@
       <w:color w:val="272727" w:themeColor="text1" w:themeTint="D8"/>
     </w:rPr>
   </w:style>
-  <w:style w:type="paragraph" w:styleId="158">
+  <w:style w:type="paragraph" w:styleId="842">
     <w:name w:val="Title"/>
-    <w:basedOn w:val="660"/>
-    <w:next w:val="660"/>
-    <w:link w:val="159"/>
+    <w:basedOn w:val="881"/>
+    <w:next w:val="881"/>
+    <w:link w:val="843"/>
     <w:uiPriority w:val="10"/>
     <w:qFormat/>
     <w:pPr>
@@ -30393,10 +30389,10 @@
       <w:szCs w:val="56"/>
     </w:rPr>
   </w:style>
-  <w:style w:type="character" w:styleId="159">
+  <w:style w:type="character" w:styleId="843">
     <w:name w:val="Title Char"/>
-    <w:basedOn w:val="147"/>
-    <w:link w:val="158"/>
+    <w:basedOn w:val="832"/>
+    <w:link w:val="842"/>
     <w:uiPriority w:val="10"/>
     <w:pPr>
       <w:pBdr/>
@@ -30410,11 +30406,11 @@
       <w:szCs w:val="56"/>
     </w:rPr>
   </w:style>
-  <w:style w:type="paragraph" w:styleId="160">
+  <w:style w:type="paragraph" w:styleId="844">
     <w:name w:val="Subtitle"/>
-    <w:basedOn w:val="660"/>
-    <w:next w:val="660"/>
-    <w:link w:val="161"/>
+    <w:basedOn w:val="881"/>
+    <w:next w:val="881"/>
+    <w:link w:val="845"/>
     <w:uiPriority w:val="11"/>
     <w:qFormat/>
     <w:pPr>
@@ -30432,10 +30428,10 @@
       <w:szCs w:val="28"/>
     </w:rPr>
   </w:style>
-  <w:style w:type="character" w:styleId="161">
+  <w:style w:type="character" w:styleId="845">
     <w:name w:val="Subtitle Char"/>
-    <w:basedOn w:val="147"/>
-    <w:link w:val="160"/>
+    <w:basedOn w:val="832"/>
+    <w:link w:val="844"/>
     <w:uiPriority w:val="11"/>
     <w:pPr>
       <w:pBdr/>
@@ -30449,11 +30445,11 @@
       <w:szCs w:val="28"/>
     </w:rPr>
   </w:style>
-  <w:style w:type="paragraph" w:styleId="162">
+  <w:style w:type="paragraph" w:styleId="846">
     <w:name w:val="Quote"/>
-    <w:basedOn w:val="660"/>
-    <w:next w:val="660"/>
-    <w:link w:val="163"/>
+    <w:basedOn w:val="881"/>
+    <w:next w:val="881"/>
+    <w:link w:val="847"/>
     <w:uiPriority w:val="29"/>
     <w:qFormat/>
     <w:pPr>
@@ -30468,10 +30464,10 @@
       <w:color w:val="404040" w:themeColor="text1" w:themeTint="BF"/>
     </w:rPr>
   </w:style>
-  <w:style w:type="character" w:styleId="163">
+  <w:style w:type="character" w:styleId="847">
     <w:name w:val="Quote Char"/>
-    <w:basedOn w:val="147"/>
-    <w:link w:val="162"/>
+    <w:basedOn w:val="832"/>
+    <w:link w:val="846"/>
     <w:uiPriority w:val="29"/>
     <w:pPr>
       <w:pBdr/>
@@ -30484,9 +30480,9 @@
       <w:color w:val="404040" w:themeColor="text1" w:themeTint="BF"/>
     </w:rPr>
   </w:style>
-  <w:style w:type="character" w:styleId="165">
+  <w:style w:type="character" w:styleId="848">
     <w:name w:val="Intense Emphasis"/>
-    <w:basedOn w:val="147"/>
+    <w:basedOn w:val="832"/>
     <w:uiPriority w:val="21"/>
     <w:qFormat/>
     <w:pPr>
@@ -30500,11 +30496,11 @@
       <w:color w:val="0f4761" w:themeColor="accent1" w:themeShade="BF"/>
     </w:rPr>
   </w:style>
-  <w:style w:type="paragraph" w:styleId="166">
+  <w:style w:type="paragraph" w:styleId="849">
     <w:name w:val="Intense Quote"/>
-    <w:basedOn w:val="660"/>
-    <w:next w:val="660"/>
-    <w:link w:val="167"/>
+    <w:basedOn w:val="881"/>
+    <w:next w:val="881"/>
+    <w:link w:val="850"/>
     <w:uiPriority w:val="30"/>
     <w:qFormat/>
     <w:pPr>
@@ -30522,10 +30518,10 @@
       <w:color w:val="0f4761" w:themeColor="accent1" w:themeShade="BF"/>
     </w:rPr>
   </w:style>
-  <w:style w:type="character" w:styleId="167">
+  <w:style w:type="character" w:styleId="850">
     <w:name w:val="Intense Quote Char"/>
-    <w:basedOn w:val="147"/>
-    <w:link w:val="166"/>
+    <w:basedOn w:val="832"/>
+    <w:link w:val="849"/>
     <w:uiPriority w:val="30"/>
     <w:pPr>
       <w:pBdr/>
@@ -30538,9 +30534,9 @@
       <w:color w:val="0f4761" w:themeColor="accent1" w:themeShade="BF"/>
     </w:rPr>
   </w:style>
-  <w:style w:type="character" w:styleId="168">
+  <w:style w:type="character" w:styleId="851">
     <w:name w:val="Intense Reference"/>
-    <w:basedOn w:val="147"/>
+    <w:basedOn w:val="832"/>
     <w:uiPriority w:val="32"/>
     <w:qFormat/>
     <w:pPr>
@@ -30556,9 +30552,9 @@
       <w:spacing w:val="5"/>
     </w:rPr>
   </w:style>
-  <w:style w:type="character" w:styleId="170">
+  <w:style w:type="character" w:styleId="852">
     <w:name w:val="Subtle Emphasis"/>
-    <w:basedOn w:val="147"/>
+    <w:basedOn w:val="832"/>
     <w:uiPriority w:val="19"/>
     <w:qFormat/>
     <w:pPr>
@@ -30572,9 +30568,9 @@
       <w:color w:val="404040" w:themeColor="text1" w:themeTint="BF"/>
     </w:rPr>
   </w:style>
-  <w:style w:type="character" w:styleId="171">
+  <w:style w:type="character" w:styleId="853">
     <w:name w:val="Emphasis"/>
-    <w:basedOn w:val="147"/>
+    <w:basedOn w:val="832"/>
     <w:uiPriority w:val="20"/>
     <w:qFormat/>
     <w:pPr>
@@ -30587,9 +30583,9 @@
       <w:iCs/>
     </w:rPr>
   </w:style>
-  <w:style w:type="character" w:styleId="172">
+  <w:style w:type="character" w:styleId="854">
     <w:name w:val="Strong"/>
-    <w:basedOn w:val="147"/>
+    <w:basedOn w:val="832"/>
     <w:uiPriority w:val="22"/>
     <w:qFormat/>
     <w:pPr>
@@ -30602,9 +30598,9 @@
       <w:bCs/>
     </w:rPr>
   </w:style>
-  <w:style w:type="character" w:styleId="173">
+  <w:style w:type="character" w:styleId="855">
     <w:name w:val="Subtle Reference"/>
-    <w:basedOn w:val="147"/>
+    <w:basedOn w:val="832"/>
     <w:uiPriority w:val="31"/>
     <w:qFormat/>
     <w:pPr>
@@ -30617,9 +30613,9 @@
       <w:color w:val="5a5a5a" w:themeColor="text1" w:themeTint="A5"/>
     </w:rPr>
   </w:style>
-  <w:style w:type="character" w:styleId="174">
+  <w:style w:type="character" w:styleId="856">
     <w:name w:val="Book Title"/>
-    <w:basedOn w:val="147"/>
+    <w:basedOn w:val="832"/>
     <w:uiPriority w:val="33"/>
     <w:qFormat/>
     <w:pPr>
@@ -30635,10 +30631,10 @@
       <w:spacing w:val="5"/>
     </w:rPr>
   </w:style>
-  <w:style w:type="paragraph" w:styleId="175">
+  <w:style w:type="paragraph" w:styleId="857">
     <w:name w:val="Header"/>
-    <w:basedOn w:val="660"/>
-    <w:link w:val="176"/>
+    <w:basedOn w:val="881"/>
+    <w:link w:val="858"/>
     <w:uiPriority w:val="99"/>
     <w:unhideWhenUsed/>
     <w:pPr>
@@ -30651,10 +30647,10 @@
       <w:ind/>
     </w:pPr>
   </w:style>
-  <w:style w:type="character" w:styleId="176">
+  <w:style w:type="character" w:styleId="858">
     <w:name w:val="Header Char"/>
-    <w:basedOn w:val="147"/>
-    <w:link w:val="175"/>
+    <w:basedOn w:val="832"/>
+    <w:link w:val="857"/>
     <w:uiPriority w:val="99"/>
     <w:pPr>
       <w:pBdr/>
@@ -30662,10 +30658,10 @@
       <w:ind/>
     </w:pPr>
   </w:style>
-  <w:style w:type="paragraph" w:styleId="177">
+  <w:style w:type="paragraph" w:styleId="859">
     <w:name w:val="Footer"/>
-    <w:basedOn w:val="660"/>
-    <w:link w:val="178"/>
+    <w:basedOn w:val="881"/>
+    <w:link w:val="860"/>
     <w:uiPriority w:val="99"/>
     <w:unhideWhenUsed/>
     <w:pPr>
@@ -30678,10 +30674,10 @@
       <w:ind/>
     </w:pPr>
   </w:style>
-  <w:style w:type="character" w:styleId="178">
+  <w:style w:type="character" w:styleId="860">
     <w:name w:val="Footer Char"/>
-    <w:basedOn w:val="147"/>
-    <w:link w:val="177"/>
+    <w:basedOn w:val="832"/>
+    <w:link w:val="859"/>
     <w:uiPriority w:val="99"/>
     <w:pPr>
       <w:pBdr/>
@@ -30689,10 +30685,10 @@
       <w:ind/>
     </w:pPr>
   </w:style>
-  <w:style w:type="paragraph" w:styleId="179">
+  <w:style w:type="paragraph" w:styleId="861">
     <w:name w:val="Caption"/>
-    <w:basedOn w:val="660"/>
-    <w:next w:val="660"/>
+    <w:basedOn w:val="881"/>
+    <w:next w:val="881"/>
     <w:uiPriority w:val="35"/>
     <w:unhideWhenUsed/>
     <w:qFormat/>
@@ -30709,10 +30705,10 @@
       <w:szCs w:val="18"/>
     </w:rPr>
   </w:style>
-  <w:style w:type="paragraph" w:styleId="180">
+  <w:style w:type="paragraph" w:styleId="862">
     <w:name w:val="footnote text"/>
-    <w:basedOn w:val="660"/>
-    <w:link w:val="181"/>
+    <w:basedOn w:val="881"/>
+    <w:link w:val="863"/>
     <w:uiPriority w:val="99"/>
     <w:semiHidden/>
     <w:unhideWhenUsed/>
@@ -30726,10 +30722,10 @@
       <w:szCs w:val="20"/>
     </w:rPr>
   </w:style>
-  <w:style w:type="character" w:styleId="181">
+  <w:style w:type="character" w:styleId="863">
     <w:name w:val="Footnote Text Char"/>
-    <w:basedOn w:val="147"/>
-    <w:link w:val="180"/>
+    <w:basedOn w:val="832"/>
+    <w:link w:val="862"/>
     <w:uiPriority w:val="99"/>
     <w:semiHidden/>
     <w:pPr>
@@ -30742,9 +30738,9 @@
       <w:szCs w:val="20"/>
     </w:rPr>
   </w:style>
-  <w:style w:type="character" w:styleId="182">
+  <w:style w:type="character" w:styleId="864">
     <w:name w:val="footnote reference"/>
-    <w:basedOn w:val="147"/>
+    <w:basedOn w:val="832"/>
     <w:uiPriority w:val="99"/>
     <w:semiHidden/>
     <w:unhideWhenUsed/>
@@ -30757,10 +30753,10 @@
       <w:vertAlign w:val="superscript"/>
     </w:rPr>
   </w:style>
-  <w:style w:type="paragraph" w:styleId="183">
+  <w:style w:type="paragraph" w:styleId="865">
     <w:name w:val="endnote text"/>
-    <w:basedOn w:val="660"/>
-    <w:link w:val="184"/>
+    <w:basedOn w:val="881"/>
+    <w:link w:val="866"/>
     <w:uiPriority w:val="99"/>
     <w:semiHidden/>
     <w:unhideWhenUsed/>
@@ -30774,10 +30770,10 @@
       <w:szCs w:val="20"/>
     </w:rPr>
   </w:style>
-  <w:style w:type="character" w:styleId="184">
+  <w:style w:type="character" w:styleId="866">
     <w:name w:val="Endnote Text Char"/>
-    <w:basedOn w:val="147"/>
-    <w:link w:val="183"/>
+    <w:basedOn w:val="832"/>
+    <w:link w:val="865"/>
     <w:uiPriority w:val="99"/>
     <w:semiHidden/>
     <w:pPr>
@@ -30790,9 +30786,9 @@
       <w:szCs w:val="20"/>
     </w:rPr>
   </w:style>
-  <w:style w:type="character" w:styleId="185">
+  <w:style w:type="character" w:styleId="867">
     <w:name w:val="endnote reference"/>
-    <w:basedOn w:val="147"/>
+    <w:basedOn w:val="832"/>
     <w:uiPriority w:val="99"/>
     <w:semiHidden/>
     <w:unhideWhenUsed/>
@@ -30805,9 +30801,9 @@
       <w:vertAlign w:val="superscript"/>
     </w:rPr>
   </w:style>
-  <w:style w:type="character" w:styleId="186">
+  <w:style w:type="character" w:styleId="868">
     <w:name w:val="Hyperlink"/>
-    <w:basedOn w:val="147"/>
+    <w:basedOn w:val="832"/>
     <w:uiPriority w:val="99"/>
     <w:unhideWhenUsed/>
     <w:pPr>
@@ -30820,9 +30816,9 @@
       <w:u w:val="single"/>
     </w:rPr>
   </w:style>
-  <w:style w:type="character" w:styleId="187">
+  <w:style w:type="character" w:styleId="869">
     <w:name w:val="FollowedHyperlink"/>
-    <w:basedOn w:val="147"/>
+    <w:basedOn w:val="832"/>
     <w:uiPriority w:val="99"/>
     <w:semiHidden/>
     <w:unhideWhenUsed/>
@@ -30836,10 +30832,10 @@
       <w:u w:val="single"/>
     </w:rPr>
   </w:style>
-  <w:style w:type="paragraph" w:styleId="188">
+  <w:style w:type="paragraph" w:styleId="870">
     <w:name w:val="toc 1"/>
-    <w:basedOn w:val="660"/>
-    <w:next w:val="660"/>
+    <w:basedOn w:val="881"/>
+    <w:next w:val="881"/>
     <w:uiPriority w:val="39"/>
     <w:unhideWhenUsed/>
     <w:pPr>
@@ -30848,10 +30844,10 @@
       <w:ind/>
     </w:pPr>
   </w:style>
-  <w:style w:type="paragraph" w:styleId="189">
+  <w:style w:type="paragraph" w:styleId="871">
     <w:name w:val="toc 2"/>
-    <w:basedOn w:val="660"/>
-    <w:next w:val="660"/>
+    <w:basedOn w:val="881"/>
+    <w:next w:val="881"/>
     <w:uiPriority w:val="39"/>
     <w:unhideWhenUsed/>
     <w:pPr>
@@ -30860,10 +30856,10 @@
       <w:ind w:left="220"/>
     </w:pPr>
   </w:style>
-  <w:style w:type="paragraph" w:styleId="190">
+  <w:style w:type="paragraph" w:styleId="872">
     <w:name w:val="toc 3"/>
-    <w:basedOn w:val="660"/>
-    <w:next w:val="660"/>
+    <w:basedOn w:val="881"/>
+    <w:next w:val="881"/>
     <w:uiPriority w:val="39"/>
     <w:unhideWhenUsed/>
     <w:pPr>
@@ -30872,10 +30868,10 @@
       <w:ind w:left="440"/>
     </w:pPr>
   </w:style>
-  <w:style w:type="paragraph" w:styleId="191">
+  <w:style w:type="paragraph" w:styleId="873">
     <w:name w:val="toc 4"/>
-    <w:basedOn w:val="660"/>
-    <w:next w:val="660"/>
+    <w:basedOn w:val="881"/>
+    <w:next w:val="881"/>
     <w:uiPriority w:val="39"/>
     <w:unhideWhenUsed/>
     <w:pPr>
@@ -30884,10 +30880,10 @@
       <w:ind w:left="660"/>
     </w:pPr>
   </w:style>
-  <w:style w:type="paragraph" w:styleId="192">
+  <w:style w:type="paragraph" w:styleId="874">
     <w:name w:val="toc 5"/>
-    <w:basedOn w:val="660"/>
-    <w:next w:val="660"/>
+    <w:basedOn w:val="881"/>
+    <w:next w:val="881"/>
     <w:uiPriority w:val="39"/>
     <w:unhideWhenUsed/>
     <w:pPr>
@@ -30896,10 +30892,10 @@
       <w:ind w:left="880"/>
     </w:pPr>
   </w:style>
-  <w:style w:type="paragraph" w:styleId="193">
+  <w:style w:type="paragraph" w:styleId="875">
     <w:name w:val="toc 6"/>
-    <w:basedOn w:val="660"/>
-    <w:next w:val="660"/>
+    <w:basedOn w:val="881"/>
+    <w:next w:val="881"/>
     <w:uiPriority w:val="39"/>
     <w:unhideWhenUsed/>
     <w:pPr>
@@ -30908,10 +30904,10 @@
       <w:ind w:left="1100"/>
     </w:pPr>
   </w:style>
-  <w:style w:type="paragraph" w:styleId="194">
+  <w:style w:type="paragraph" w:styleId="876">
     <w:name w:val="toc 7"/>
-    <w:basedOn w:val="660"/>
-    <w:next w:val="660"/>
+    <w:basedOn w:val="881"/>
+    <w:next w:val="881"/>
     <w:uiPriority w:val="39"/>
     <w:unhideWhenUsed/>
     <w:pPr>
@@ -30920,10 +30916,10 @@
       <w:ind w:left="1320"/>
     </w:pPr>
   </w:style>
-  <w:style w:type="paragraph" w:styleId="195">
+  <w:style w:type="paragraph" w:styleId="877">
     <w:name w:val="toc 8"/>
-    <w:basedOn w:val="660"/>
-    <w:next w:val="660"/>
+    <w:basedOn w:val="881"/>
+    <w:next w:val="881"/>
     <w:uiPriority w:val="39"/>
     <w:unhideWhenUsed/>
     <w:pPr>
@@ -30932,10 +30928,10 @@
       <w:ind w:left="1540"/>
     </w:pPr>
   </w:style>
-  <w:style w:type="paragraph" w:styleId="196">
+  <w:style w:type="paragraph" w:styleId="878">
     <w:name w:val="toc 9"/>
-    <w:basedOn w:val="660"/>
-    <w:next w:val="660"/>
+    <w:basedOn w:val="881"/>
+    <w:next w:val="881"/>
     <w:uiPriority w:val="39"/>
     <w:unhideWhenUsed/>
     <w:pPr>
@@ -30944,7 +30940,7 @@
       <w:ind w:left="1760"/>
     </w:pPr>
   </w:style>
-  <w:style w:type="paragraph" w:styleId="206">
+  <w:style w:type="paragraph" w:styleId="879">
     <w:name w:val="TOC Heading"/>
     <w:uiPriority w:val="39"/>
     <w:unhideWhenUsed/>
@@ -30954,10 +30950,10 @@
       <w:ind/>
     </w:pPr>
   </w:style>
-  <w:style w:type="paragraph" w:styleId="207">
+  <w:style w:type="paragraph" w:styleId="880">
     <w:name w:val="table of figures"/>
-    <w:basedOn w:val="660"/>
-    <w:next w:val="660"/>
+    <w:basedOn w:val="881"/>
+    <w:next w:val="881"/>
     <w:uiPriority w:val="99"/>
     <w:unhideWhenUsed/>
     <w:pPr>
@@ -30966,7 +30962,7 @@
       <w:ind/>
     </w:pPr>
   </w:style>
-  <w:style w:type="paragraph" w:styleId="660" w:default="1">
+  <w:style w:type="paragraph" w:styleId="881" w:default="1">
     <w:name w:val="Normal"/>
     <w:qFormat/>
     <w:pPr>
@@ -30975,7 +30971,7 @@
       <w:ind/>
     </w:pPr>
   </w:style>
-  <w:style w:type="table" w:styleId="661" w:default="1">
+  <w:style w:type="table" w:styleId="882" w:default="1">
     <w:name w:val="Normal Table"/>
     <w:uiPriority w:val="99"/>
     <w:semiHidden/>
@@ -31168,7 +31164,7 @@
       </w:tcPr>
     </w:tblStylePr>
   </w:style>
-  <w:style w:type="numbering" w:styleId="662" w:default="1">
+  <w:style w:type="numbering" w:styleId="883" w:default="1">
     <w:name w:val="No List"/>
     <w:uiPriority w:val="99"/>
     <w:semiHidden/>
@@ -31179,9 +31175,9 @@
       <w:ind/>
     </w:pPr>
   </w:style>
-  <w:style w:type="paragraph" w:styleId="663">
+  <w:style w:type="paragraph" w:styleId="884">
     <w:name w:val="No Spacing"/>
-    <w:basedOn w:val="660"/>
+    <w:basedOn w:val="881"/>
     <w:uiPriority w:val="1"/>
     <w:qFormat/>
     <w:pPr>
@@ -31190,9 +31186,9 @@
       <w:ind/>
     </w:pPr>
   </w:style>
-  <w:style w:type="paragraph" w:styleId="664">
+  <w:style w:type="paragraph" w:styleId="885">
     <w:name w:val="List Paragraph"/>
-    <w:basedOn w:val="660"/>
+    <w:basedOn w:val="881"/>
     <w:uiPriority w:val="34"/>
     <w:qFormat/>
     <w:pPr>

</xml_diff>

<commit_message>
Just some very minor changes to testing
</commit_message>
<xml_diff>
--- a/Testing.docx
+++ b/Testing.docx
@@ -2716,7 +2716,9 @@
               <w:ind/>
               <w:rPr/>
             </w:pPr>
-            <w:r/>
+            <w:r>
+              <w:t xml:space="preserve">16</w:t>
+            </w:r>
             <w:r/>
           </w:p>
         </w:tc>
@@ -2871,7 +2873,9 @@
               <w:ind/>
               <w:rPr/>
             </w:pPr>
-            <w:r/>
+            <w:r>
+              <w:t xml:space="preserve">17</w:t>
+            </w:r>
             <w:r/>
           </w:p>
         </w:tc>

</xml_diff>

<commit_message>
Wrote a lot more test!
</commit_message>
<xml_diff>
--- a/Testing.docx
+++ b/Testing.docx
@@ -10,7 +10,7 @@
         <w:rPr/>
       </w:pPr>
       <w:r>
-        <w:t xml:space="preserve">Objectives 1aii and 5 will require separate files, the functions in these files should be tested independently of the main program to ensure that they work.</w:t>
+        <w:t xml:space="preserve">Objectives 1aii and 5 will require separate files, the functions in these files should be tested independently of the main program.</w:t>
       </w:r>
       <w:r/>
     </w:p>
@@ -26,7 +26,7 @@
     </w:p>
     <w:tbl>
       <w:tblPr>
-        <w:tblStyle w:val="697"/>
+        <w:tblStyle w:val="654"/>
         <w:tblW w:w="0" w:type="auto"/>
         <w:tblInd w:w="-1418" w:type="dxa"/>
         <w:tblBorders/>
@@ -36,10 +36,10 @@
       <w:tblGrid>
         <w:gridCol w:w="992"/>
         <w:gridCol w:w="1843"/>
-        <w:gridCol w:w="1417"/>
+        <w:gridCol w:w="1843"/>
         <w:gridCol w:w="992"/>
-        <w:gridCol w:w="1984"/>
-        <w:gridCol w:w="1701"/>
+        <w:gridCol w:w="2268"/>
+        <w:gridCol w:w="992"/>
         <w:gridCol w:w="1417"/>
         <w:gridCol w:w="1133"/>
       </w:tblGrid>
@@ -90,7 +90,7 @@
         <w:tc>
           <w:tcPr>
             <w:tcBorders/>
-            <w:tcW w:w="1417" w:type="dxa"/>
+            <w:tcW w:w="1843" w:type="dxa"/>
             <w:textDirection w:val="lrTb"/>
             <w:noWrap w:val="false"/>
           </w:tcPr>
@@ -130,7 +130,7 @@
         <w:tc>
           <w:tcPr>
             <w:tcBorders/>
-            <w:tcW w:w="1984" w:type="dxa"/>
+            <w:tcW w:w="2268" w:type="dxa"/>
             <w:textDirection w:val="lrTb"/>
             <w:noWrap w:val="false"/>
           </w:tcPr>
@@ -150,7 +150,7 @@
         <w:tc>
           <w:tcPr>
             <w:tcBorders/>
-            <w:tcW w:w="1701" w:type="dxa"/>
+            <w:tcW w:w="992" w:type="dxa"/>
             <w:textDirection w:val="lrTb"/>
             <w:noWrap w:val="false"/>
           </w:tcPr>
@@ -253,7 +253,7 @@
         <w:tc>
           <w:tcPr>
             <w:tcBorders/>
-            <w:tcW w:w="1417" w:type="dxa"/>
+            <w:tcW w:w="1843" w:type="dxa"/>
             <w:textDirection w:val="lrTb"/>
             <w:noWrap w:val="false"/>
           </w:tcPr>
@@ -293,7 +293,7 @@
         <w:tc>
           <w:tcPr>
             <w:tcBorders/>
-            <w:tcW w:w="1984" w:type="dxa"/>
+            <w:tcW w:w="2268" w:type="dxa"/>
             <w:textDirection w:val="lrTb"/>
             <w:noWrap w:val="false"/>
           </w:tcPr>
@@ -313,7 +313,7 @@
         <w:tc>
           <w:tcPr>
             <w:tcBorders/>
-            <w:tcW w:w="1701" w:type="dxa"/>
+            <w:tcW w:w="992" w:type="dxa"/>
             <w:textDirection w:val="lrTb"/>
             <w:noWrap w:val="false"/>
           </w:tcPr>
@@ -412,7 +412,7 @@
         <w:tc>
           <w:tcPr>
             <w:tcBorders/>
-            <w:tcW w:w="1417" w:type="dxa"/>
+            <w:tcW w:w="1843" w:type="dxa"/>
             <w:vMerge w:val="restart"/>
             <w:textDirection w:val="lrTb"/>
             <w:noWrap w:val="false"/>
@@ -454,7 +454,7 @@
         <w:tc>
           <w:tcPr>
             <w:tcBorders/>
-            <w:tcW w:w="1984" w:type="dxa"/>
+            <w:tcW w:w="2268" w:type="dxa"/>
             <w:vMerge w:val="restart"/>
             <w:textDirection w:val="lrTb"/>
             <w:noWrap w:val="false"/>
@@ -475,7 +475,7 @@
         <w:tc>
           <w:tcPr>
             <w:tcBorders/>
-            <w:tcW w:w="1701" w:type="dxa"/>
+            <w:tcW w:w="992" w:type="dxa"/>
             <w:vMerge w:val="restart"/>
             <w:textDirection w:val="lrTb"/>
             <w:noWrap w:val="false"/>
@@ -579,7 +579,7 @@
         <w:tc>
           <w:tcPr>
             <w:tcBorders/>
-            <w:tcW w:w="1417" w:type="dxa"/>
+            <w:tcW w:w="1843" w:type="dxa"/>
             <w:vMerge w:val="restart"/>
             <w:textDirection w:val="lrTb"/>
             <w:noWrap w:val="false"/>
@@ -595,11 +595,9 @@
               <w:rPr/>
             </w:pPr>
             <w:r>
-              <w:t xml:space="preserve">Energy and momentum should be calculated and displayed, total energy and momentum should not change.</w:t>
+              <w:t xml:space="preserve">Energy and momentum should be calculated and displayed, total energy and momentum should not change. Conservation is the single most important part of astrodynamics, if energy and momentum are conserved in my program this is a very, very strong indication that the physics is correct.</w:t>
             </w:r>
-            <w:r>
-              <w:tab/>
-            </w:r>
+            <w:r/>
             <w:r/>
           </w:p>
         </w:tc>
@@ -627,7 +625,7 @@
         <w:tc>
           <w:tcPr>
             <w:tcBorders/>
-            <w:tcW w:w="1984" w:type="dxa"/>
+            <w:tcW w:w="2268" w:type="dxa"/>
             <w:vMerge w:val="restart"/>
             <w:textDirection w:val="lrTb"/>
             <w:noWrap w:val="false"/>
@@ -648,7 +646,7 @@
         <w:tc>
           <w:tcPr>
             <w:tcBorders/>
-            <w:tcW w:w="1701" w:type="dxa"/>
+            <w:tcW w:w="992" w:type="dxa"/>
             <w:vMerge w:val="restart"/>
             <w:textDirection w:val="lrTb"/>
             <w:noWrap w:val="false"/>
@@ -742,7 +740,7 @@
               <w:rPr/>
             </w:pPr>
             <w:r>
-              <w:t xml:space="preserve">2cii – information about planet from a reliable source should be shown, 2ciii – the information should be stored as attributes of a class (if 2cii is successful that menas 2ciii works as 2cii is displayed using getter methods of the class)</w:t>
+              <w:t xml:space="preserve">2cii – information about planet from a reliable source should be shown, 2ciii – the information should be stored as attributes of a class (if 2cii is successful that means 2ciii works as 2cii is displayed using getter methods of the class)</w:t>
             </w:r>
             <w:r/>
           </w:p>
@@ -750,7 +748,7 @@
         <w:tc>
           <w:tcPr>
             <w:tcBorders/>
-            <w:tcW w:w="1417" w:type="dxa"/>
+            <w:tcW w:w="1843" w:type="dxa"/>
             <w:vMerge w:val="restart"/>
             <w:textDirection w:val="lrTb"/>
             <w:noWrap w:val="false"/>
@@ -792,7 +790,7 @@
         <w:tc>
           <w:tcPr>
             <w:tcBorders/>
-            <w:tcW w:w="1984" w:type="dxa"/>
+            <w:tcW w:w="2268" w:type="dxa"/>
             <w:vMerge w:val="restart"/>
             <w:textDirection w:val="lrTb"/>
             <w:noWrap w:val="false"/>
@@ -813,7 +811,7 @@
         <w:tc>
           <w:tcPr>
             <w:tcBorders/>
-            <w:tcW w:w="1701" w:type="dxa"/>
+            <w:tcW w:w="992" w:type="dxa"/>
             <w:vMerge w:val="restart"/>
             <w:textDirection w:val="lrTb"/>
             <w:noWrap w:val="false"/>
@@ -915,7 +913,7 @@
         <w:tc>
           <w:tcPr>
             <w:tcBorders/>
-            <w:tcW w:w="1417" w:type="dxa"/>
+            <w:tcW w:w="1843" w:type="dxa"/>
             <w:vMerge w:val="restart"/>
             <w:textDirection w:val="lrTb"/>
             <w:noWrap w:val="false"/>
@@ -957,7 +955,7 @@
         <w:tc>
           <w:tcPr>
             <w:tcBorders/>
-            <w:tcW w:w="1984" w:type="dxa"/>
+            <w:tcW w:w="2268" w:type="dxa"/>
             <w:vMerge w:val="restart"/>
             <w:textDirection w:val="lrTb"/>
             <w:noWrap w:val="false"/>
@@ -978,7 +976,7 @@
         <w:tc>
           <w:tcPr>
             <w:tcBorders/>
-            <w:tcW w:w="1701" w:type="dxa"/>
+            <w:tcW w:w="992" w:type="dxa"/>
             <w:vMerge w:val="restart"/>
             <w:textDirection w:val="lrTb"/>
             <w:noWrap w:val="false"/>
@@ -1054,7 +1052,6 @@
               <w:t xml:space="preserve">06</w:t>
             </w:r>
             <w:r/>
-            <w:r/>
           </w:p>
         </w:tc>
         <w:tc>
@@ -1076,13 +1073,12 @@
               <w:t xml:space="preserve">2civ – Users should be able to press A to edit attributes, 2civ1 – Users should be able to edit the value of G</w:t>
             </w:r>
             <w:r/>
-            <w:r/>
           </w:p>
         </w:tc>
         <w:tc>
           <w:tcPr>
             <w:tcBorders/>
-            <w:tcW w:w="1417" w:type="dxa"/>
+            <w:tcW w:w="1843" w:type="dxa"/>
             <w:vMerge w:val="restart"/>
             <w:textDirection w:val="lrTb"/>
             <w:noWrap w:val="false"/>
@@ -1097,7 +1093,6 @@
             <w:r>
               <w:t xml:space="preserve">Making G bigger should have a visible effect</w:t>
             </w:r>
-            <w:r/>
             <w:r/>
           </w:p>
         </w:tc>
@@ -1120,13 +1115,12 @@
               <w:t xml:space="preserve">A, W x10</w:t>
             </w:r>
             <w:r/>
-            <w:r/>
           </w:p>
         </w:tc>
         <w:tc>
           <w:tcPr>
             <w:tcBorders/>
-            <w:tcW w:w="1984" w:type="dxa"/>
+            <w:tcW w:w="2268" w:type="dxa"/>
             <w:vMerge w:val="restart"/>
             <w:textDirection w:val="lrTb"/>
             <w:noWrap w:val="false"/>
@@ -1142,13 +1136,12 @@
               <w:t xml:space="preserve">Pressing A followed by pressing W should increase the value of G. Pressing W 10 times should make gravity substantially stronger, which would cause planets to enter more elliptical orbits or fall into the sun and get flung out of the solar system.</w:t>
             </w:r>
             <w:r/>
-            <w:r/>
           </w:p>
         </w:tc>
         <w:tc>
           <w:tcPr>
             <w:tcBorders/>
-            <w:tcW w:w="1701" w:type="dxa"/>
+            <w:tcW w:w="992" w:type="dxa"/>
             <w:vMerge w:val="restart"/>
             <w:textDirection w:val="lrTb"/>
             <w:noWrap w:val="false"/>
@@ -1250,7 +1243,7 @@
         <w:tc>
           <w:tcPr>
             <w:tcBorders/>
-            <w:tcW w:w="1417" w:type="dxa"/>
+            <w:tcW w:w="1843" w:type="dxa"/>
             <w:vMerge w:val="restart"/>
             <w:textDirection w:val="lrTb"/>
             <w:noWrap w:val="false"/>
@@ -1292,7 +1285,7 @@
         <w:tc>
           <w:tcPr>
             <w:tcBorders/>
-            <w:tcW w:w="1984" w:type="dxa"/>
+            <w:tcW w:w="2268" w:type="dxa"/>
             <w:vMerge w:val="restart"/>
             <w:textDirection w:val="lrTb"/>
             <w:noWrap w:val="false"/>
@@ -1313,7 +1306,7 @@
         <w:tc>
           <w:tcPr>
             <w:tcBorders/>
-            <w:tcW w:w="1701" w:type="dxa"/>
+            <w:tcW w:w="992" w:type="dxa"/>
             <w:vMerge w:val="restart"/>
             <w:textDirection w:val="lrTb"/>
             <w:noWrap w:val="false"/>
@@ -1417,7 +1410,7 @@
         <w:tc>
           <w:tcPr>
             <w:tcBorders/>
-            <w:tcW w:w="1417" w:type="dxa"/>
+            <w:tcW w:w="1843" w:type="dxa"/>
             <w:vMerge w:val="restart"/>
             <w:textDirection w:val="lrTb"/>
             <w:noWrap w:val="false"/>
@@ -1459,7 +1452,7 @@
         <w:tc>
           <w:tcPr>
             <w:tcBorders/>
-            <w:tcW w:w="1984" w:type="dxa"/>
+            <w:tcW w:w="2268" w:type="dxa"/>
             <w:vMerge w:val="restart"/>
             <w:textDirection w:val="lrTb"/>
             <w:noWrap w:val="false"/>
@@ -1480,7 +1473,7 @@
         <w:tc>
           <w:tcPr>
             <w:tcBorders/>
-            <w:tcW w:w="1701" w:type="dxa"/>
+            <w:tcW w:w="992" w:type="dxa"/>
             <w:vMerge w:val="restart"/>
             <w:textDirection w:val="lrTb"/>
             <w:noWrap w:val="false"/>
@@ -1582,7 +1575,7 @@
         <w:tc>
           <w:tcPr>
             <w:tcBorders/>
-            <w:tcW w:w="1417" w:type="dxa"/>
+            <w:tcW w:w="1843" w:type="dxa"/>
             <w:vMerge w:val="restart"/>
             <w:textDirection w:val="lrTb"/>
             <w:noWrap w:val="false"/>
@@ -1616,7 +1609,7 @@
               <w:rPr/>
             </w:pPr>
             <w:r>
-              <w:t xml:space="preserve">Right arrow x3, A, Ex5</w:t>
+              <w:t xml:space="preserve">Right arrow x11, A, then too many E presses to count</w:t>
             </w:r>
             <w:r/>
           </w:p>
@@ -1624,7 +1617,105 @@
         <w:tc>
           <w:tcPr>
             <w:tcBorders/>
-            <w:tcW w:w="1984" w:type="dxa"/>
+            <w:tcW w:w="2268" w:type="dxa"/>
+            <w:vMerge w:val="restart"/>
+            <w:textDirection w:val="lrTb"/>
+            <w:noWrap w:val="false"/>
+          </w:tcPr>
+          <w:p>
+            <w:pPr>
+              <w:pBdr/>
+              <w:spacing/>
+              <w:ind/>
+              <w:rPr>
+                <w:highlight w:val="none"/>
+              </w:rPr>
+            </w:pPr>
+            <w:r>
+              <w:t xml:space="preserve">I will select Saturn and increase its mass until its mass is around that of the sun. This should cause the inner solar system to drift towards Saturn, and should significantly disturb the orbit of the other planets.</w:t>
+            </w:r>
+            <w:r/>
+            <w:r>
+              <w:rPr>
+                <w:highlight w:val="none"/>
+              </w:rPr>
+            </w:r>
+            <w:r>
+              <w:rPr>
+                <w:highlight w:val="none"/>
+              </w:rPr>
+            </w:r>
+            <w:r>
+              <w:rPr>
+                <w:highlight w:val="none"/>
+              </w:rPr>
+            </w:r>
+          </w:p>
+        </w:tc>
+        <w:tc>
+          <w:tcPr>
+            <w:tcBorders/>
+            <w:tcW w:w="992" w:type="dxa"/>
+            <w:vMerge w:val="restart"/>
+            <w:textDirection w:val="lrTb"/>
+            <w:noWrap w:val="false"/>
+          </w:tcPr>
+          <w:p>
+            <w:pPr>
+              <w:pBdr/>
+              <w:spacing/>
+              <w:ind/>
+              <w:rPr/>
+            </w:pPr>
+            <w:r/>
+            <w:r/>
+          </w:p>
+        </w:tc>
+        <w:tc>
+          <w:tcPr>
+            <w:tcBorders/>
+            <w:tcW w:w="1417" w:type="dxa"/>
+            <w:vMerge w:val="restart"/>
+            <w:textDirection w:val="lrTb"/>
+            <w:noWrap w:val="false"/>
+          </w:tcPr>
+          <w:p>
+            <w:pPr>
+              <w:pBdr/>
+              <w:spacing/>
+              <w:ind/>
+              <w:rPr/>
+            </w:pPr>
+            <w:r/>
+            <w:r/>
+          </w:p>
+        </w:tc>
+        <w:tc>
+          <w:tcPr>
+            <w:tcBorders/>
+            <w:tcW w:w="1133" w:type="dxa"/>
+            <w:vMerge w:val="restart"/>
+            <w:textDirection w:val="lrTb"/>
+            <w:noWrap w:val="false"/>
+          </w:tcPr>
+          <w:p>
+            <w:pPr>
+              <w:pBdr/>
+              <w:spacing/>
+              <w:ind/>
+              <w:rPr/>
+            </w:pPr>
+            <w:r/>
+            <w:r/>
+          </w:p>
+        </w:tc>
+      </w:tr>
+      <w:tr>
+        <w:trPr/>
+        <w:tc>
+          <w:tcPr>
+            <w:tcBorders/>
+            <w:tcW w:w="992" w:type="dxa"/>
             <w:vMerge w:val="restart"/>
             <w:textDirection w:val="lrTb"/>
             <w:noWrap w:val="false"/>
@@ -1637,7 +1728,7 @@
               <w:rPr/>
             </w:pPr>
             <w:r>
-              <w:t xml:space="preserve">I will select Earth and increase its mass. This should cause the moon’s orbit to become tighter and closer to Earth.</w:t>
+              <w:t xml:space="preserve">10</w:t>
             </w:r>
             <w:r/>
           </w:p>
@@ -1645,7 +1736,91 @@
         <w:tc>
           <w:tcPr>
             <w:tcBorders/>
-            <w:tcW w:w="1701" w:type="dxa"/>
+            <w:tcW w:w="1843" w:type="dxa"/>
+            <w:vMerge w:val="restart"/>
+            <w:textDirection w:val="lrTb"/>
+            <w:noWrap w:val="false"/>
+          </w:tcPr>
+          <w:p>
+            <w:pPr>
+              <w:pBdr/>
+              <w:spacing/>
+              <w:ind/>
+              <w:rPr/>
+            </w:pPr>
+            <w:r>
+              <w:t xml:space="preserve">3c – The user should be able to focus the camera on any planet of their choosing, or on the center of mass</w:t>
+            </w:r>
+            <w:r/>
+          </w:p>
+        </w:tc>
+        <w:tc>
+          <w:tcPr>
+            <w:tcBorders/>
+            <w:tcW w:w="1843" w:type="dxa"/>
+            <w:vMerge w:val="restart"/>
+            <w:textDirection w:val="lrTb"/>
+            <w:noWrap w:val="false"/>
+          </w:tcPr>
+          <w:p>
+            <w:pPr>
+              <w:pBdr/>
+              <w:spacing/>
+              <w:ind/>
+              <w:rPr/>
+            </w:pPr>
+            <w:r>
+              <w:t xml:space="preserve">With the mass of Saturn having been significantly increased, the center of mass of the solar system should now be roughly half way inbetween the Sun and Saturn, so pressing space should put the camera inbetween them.</w:t>
+            </w:r>
+            <w:r/>
+          </w:p>
+        </w:tc>
+        <w:tc>
+          <w:tcPr>
+            <w:tcBorders/>
+            <w:tcW w:w="992" w:type="dxa"/>
+            <w:vMerge w:val="restart"/>
+            <w:textDirection w:val="lrTb"/>
+            <w:noWrap w:val="false"/>
+          </w:tcPr>
+          <w:p>
+            <w:pPr>
+              <w:pBdr/>
+              <w:spacing/>
+              <w:ind/>
+              <w:rPr/>
+            </w:pPr>
+            <w:r>
+              <w:t xml:space="preserve">Space x2</w:t>
+            </w:r>
+            <w:r/>
+          </w:p>
+        </w:tc>
+        <w:tc>
+          <w:tcPr>
+            <w:tcBorders/>
+            <w:tcW w:w="2268" w:type="dxa"/>
+            <w:vMerge w:val="restart"/>
+            <w:textDirection w:val="lrTb"/>
+            <w:noWrap w:val="false"/>
+          </w:tcPr>
+          <w:p>
+            <w:pPr>
+              <w:pBdr/>
+              <w:spacing/>
+              <w:ind/>
+              <w:rPr/>
+            </w:pPr>
+            <w:r>
+              <w:t xml:space="preserve">Pressing space once should toggle the focus to be on the center of mass, and it should be inbetween Saturn and the Sun. Pressing space again should change the focus to be back on a planet.</w:t>
+            </w:r>
+            <w:r/>
+          </w:p>
+        </w:tc>
+        <w:tc>
+          <w:tcPr>
+            <w:tcBorders/>
+            <w:tcW w:w="992" w:type="dxa"/>
             <w:vMerge w:val="restart"/>
             <w:textDirection w:val="lrTb"/>
             <w:noWrap w:val="false"/>
@@ -1747,7 +1922,7 @@
         <w:tc>
           <w:tcPr>
             <w:tcBorders/>
-            <w:tcW w:w="1417" w:type="dxa"/>
+            <w:tcW w:w="1843" w:type="dxa"/>
             <w:vMerge w:val="restart"/>
             <w:textDirection w:val="lrTb"/>
             <w:noWrap w:val="false"/>
@@ -1781,7 +1956,7 @@
               <w:rPr/>
             </w:pPr>
             <w:r>
-              <w:t xml:space="preserve">Dx10</w:t>
+              <w:t xml:space="preserve">Right arrow x3, A, Dx10</w:t>
             </w:r>
             <w:r/>
           </w:p>
@@ -1789,7 +1964,7 @@
         <w:tc>
           <w:tcPr>
             <w:tcBorders/>
-            <w:tcW w:w="1984" w:type="dxa"/>
+            <w:tcW w:w="2268" w:type="dxa"/>
             <w:vMerge w:val="restart"/>
             <w:textDirection w:val="lrTb"/>
             <w:noWrap w:val="false"/>
@@ -1802,7 +1977,7 @@
               <w:rPr/>
             </w:pPr>
             <w:r>
-              <w:t xml:space="preserve">After having increased the mass of Earth I will then decrease its mass, this should cause the moon’s orbit to become wider until Earth loses hold of the moon and the moon is flung out of its orbit.</w:t>
+              <w:t xml:space="preserve">I will decrease the Earth’s mass, this should cause the moon’s orbit to become wider until Earth loses hold of the moon and the moon is flung out of its orbit.</w:t>
             </w:r>
             <w:r/>
           </w:p>
@@ -1810,7 +1985,7 @@
         <w:tc>
           <w:tcPr>
             <w:tcBorders/>
-            <w:tcW w:w="1701" w:type="dxa"/>
+            <w:tcW w:w="992" w:type="dxa"/>
             <w:vMerge w:val="restart"/>
             <w:textDirection w:val="lrTb"/>
             <w:noWrap w:val="false"/>
@@ -1914,7 +2089,7 @@
         <w:tc>
           <w:tcPr>
             <w:tcBorders/>
-            <w:tcW w:w="1417" w:type="dxa"/>
+            <w:tcW w:w="1843" w:type="dxa"/>
             <w:vMerge w:val="restart"/>
             <w:textDirection w:val="lrTb"/>
             <w:noWrap w:val="false"/>
@@ -1956,7 +2131,7 @@
         <w:tc>
           <w:tcPr>
             <w:tcBorders/>
-            <w:tcW w:w="1984" w:type="dxa"/>
+            <w:tcW w:w="2268" w:type="dxa"/>
             <w:vMerge w:val="restart"/>
             <w:textDirection w:val="lrTb"/>
             <w:noWrap w:val="false"/>
@@ -1977,7 +2152,7 @@
         <w:tc>
           <w:tcPr>
             <w:tcBorders/>
-            <w:tcW w:w="1701" w:type="dxa"/>
+            <w:tcW w:w="992" w:type="dxa"/>
             <w:vMerge w:val="restart"/>
             <w:textDirection w:val="lrTb"/>
             <w:noWrap w:val="false"/>
@@ -2081,7 +2256,7 @@
         <w:tc>
           <w:tcPr>
             <w:tcBorders/>
-            <w:tcW w:w="1417" w:type="dxa"/>
+            <w:tcW w:w="1843" w:type="dxa"/>
             <w:vMerge w:val="restart"/>
             <w:textDirection w:val="lrTb"/>
             <w:noWrap w:val="false"/>
@@ -2115,7 +2290,7 @@
               <w:rPr/>
             </w:pPr>
             <w:r>
-              <w:t xml:space="preserve">F, Right arrow x3</w:t>
+              <w:t xml:space="preserve">F, Right arrow x6</w:t>
             </w:r>
             <w:r/>
           </w:p>
@@ -2123,7 +2298,7 @@
         <w:tc>
           <w:tcPr>
             <w:tcBorders/>
-            <w:tcW w:w="1984" w:type="dxa"/>
+            <w:tcW w:w="2268" w:type="dxa"/>
             <w:vMerge w:val="restart"/>
             <w:textDirection w:val="lrTb"/>
             <w:noWrap w:val="false"/>
@@ -2136,7 +2311,10 @@
               <w:rPr/>
             </w:pPr>
             <w:r>
-              <w:t xml:space="preserve">Arrows should appear on one planet and point towards the other planets, for most planets the resultant arrow (the one that’s the colour of the planet) should point towards the Sun. I will turn on arrows then press the right arrow key a few times to show the arrows working on different planets.</w:t>
+              <w:t xml:space="preserve">Arrows should appear on one planet and</w:t>
+            </w:r>
+            <w:r>
+              <w:t xml:space="preserve"> point towards the other planets, for most planets the resultant arrow (the one that’s the colour of the planet) should point towards the Sun. I will turn on arrows then press the right arrow key a few times to show the arrows working on different planets.</w:t>
             </w:r>
             <w:r/>
           </w:p>
@@ -2144,7 +2322,7 @@
         <w:tc>
           <w:tcPr>
             <w:tcBorders/>
-            <w:tcW w:w="1701" w:type="dxa"/>
+            <w:tcW w:w="992" w:type="dxa"/>
             <w:vMerge w:val="restart"/>
             <w:textDirection w:val="lrTb"/>
             <w:noWrap w:val="false"/>
@@ -2246,7 +2424,7 @@
         <w:tc>
           <w:tcPr>
             <w:tcBorders/>
-            <w:tcW w:w="1417" w:type="dxa"/>
+            <w:tcW w:w="1843" w:type="dxa"/>
             <w:vMerge w:val="restart"/>
             <w:textDirection w:val="lrTb"/>
             <w:noWrap w:val="false"/>
@@ -2288,7 +2466,7 @@
         <w:tc>
           <w:tcPr>
             <w:tcBorders/>
-            <w:tcW w:w="1984" w:type="dxa"/>
+            <w:tcW w:w="2268" w:type="dxa"/>
             <w:vMerge w:val="restart"/>
             <w:textDirection w:val="lrTb"/>
             <w:noWrap w:val="false"/>
@@ -2301,7 +2479,10 @@
               <w:rPr/>
             </w:pPr>
             <w:r>
-              <w:t xml:space="preserve">When pressing the up arrow key the simulation should speed up, when pressing the down arrow key the simulation should slow down. After pressing the down arrow key 5 times the simulation should be paused. Trying to press it again should do nothing, the simulation should not enter negative time as that is nonsense.</w:t>
+              <w:t xml:space="preserve">When pressing the up arrow key the simulation should speed</w:t>
+            </w:r>
+            <w:r>
+              <w:t xml:space="preserve"> up, when pressing the down arrow key the simulation should slow down. After pressing the down arrow key 5 times the simulation should be paused. Trying to press it again should do nothing, the simulation should not enter negative time as that is nonsense.</w:t>
             </w:r>
             <w:r/>
           </w:p>
@@ -2309,7 +2490,7 @@
         <w:tc>
           <w:tcPr>
             <w:tcBorders/>
-            <w:tcW w:w="1701" w:type="dxa"/>
+            <w:tcW w:w="992" w:type="dxa"/>
             <w:vMerge w:val="restart"/>
             <w:textDirection w:val="lrTb"/>
             <w:noWrap w:val="false"/>
@@ -2411,7 +2592,7 @@
         <w:tc>
           <w:tcPr>
             <w:tcBorders/>
-            <w:tcW w:w="1417" w:type="dxa"/>
+            <w:tcW w:w="1843" w:type="dxa"/>
             <w:vMerge w:val="restart"/>
             <w:textDirection w:val="lrTb"/>
             <w:noWrap w:val="false"/>
@@ -2453,7 +2634,7 @@
         <w:tc>
           <w:tcPr>
             <w:tcBorders/>
-            <w:tcW w:w="1984" w:type="dxa"/>
+            <w:tcW w:w="2268" w:type="dxa"/>
             <w:vMerge w:val="restart"/>
             <w:textDirection w:val="lrTb"/>
             <w:noWrap w:val="false"/>
@@ -2474,7 +2655,7 @@
         <w:tc>
           <w:tcPr>
             <w:tcBorders/>
-            <w:tcW w:w="1701" w:type="dxa"/>
+            <w:tcW w:w="992" w:type="dxa"/>
             <w:vMerge w:val="restart"/>
             <w:textDirection w:val="lrTb"/>
             <w:noWrap w:val="false"/>
@@ -2550,7 +2731,6 @@
               <w:t xml:space="preserve">15</w:t>
             </w:r>
             <w:r/>
-            <w:r/>
           </w:p>
         </w:tc>
         <w:tc>
@@ -2572,13 +2752,12 @@
               <w:t xml:space="preserve">4 – Include the ability to compare sizes of planets</w:t>
             </w:r>
             <w:r/>
-            <w:r/>
           </w:p>
         </w:tc>
         <w:tc>
           <w:tcPr>
             <w:tcBorders/>
-            <w:tcW w:w="1417" w:type="dxa"/>
+            <w:tcW w:w="1843" w:type="dxa"/>
             <w:vMerge w:val="restart"/>
             <w:textDirection w:val="lrTb"/>
             <w:noWrap w:val="false"/>
@@ -2593,7 +2772,6 @@
             <w:r>
               <w:t xml:space="preserve">The comparsion mode should show planets side by side at their correct relative sizes</w:t>
             </w:r>
-            <w:r/>
             <w:r/>
           </w:p>
         </w:tc>
@@ -2616,13 +2794,12 @@
               <w:t xml:space="preserve">C, left arrow, right arrow x5, left arrow x5</w:t>
             </w:r>
             <w:r/>
-            <w:r/>
           </w:p>
         </w:tc>
         <w:tc>
           <w:tcPr>
             <w:tcBorders/>
-            <w:tcW w:w="1984" w:type="dxa"/>
+            <w:tcW w:w="2268" w:type="dxa"/>
             <w:vMerge w:val="restart"/>
             <w:textDirection w:val="lrTb"/>
             <w:noWrap w:val="false"/>
@@ -2638,13 +2815,12 @@
               <w:t xml:space="preserve">Upon pressing C the sun and Jupiter should be in comparison. Pressing the left and right arrows should cycle through the planets to compare different bodies.</w:t>
             </w:r>
             <w:r/>
-            <w:r/>
           </w:p>
         </w:tc>
         <w:tc>
           <w:tcPr>
             <w:tcBorders/>
-            <w:tcW w:w="1701" w:type="dxa"/>
+            <w:tcW w:w="992" w:type="dxa"/>
             <w:vMerge w:val="restart"/>
             <w:textDirection w:val="lrTb"/>
             <w:noWrap w:val="false"/>
@@ -2700,7 +2876,9 @@
         </w:tc>
       </w:tr>
       <w:tr>
-        <w:trPr/>
+        <w:trPr>
+          <w:trHeight w:val="162"/>
+        </w:trPr>
         <w:tc>
           <w:tcPr>
             <w:tcBorders/>
@@ -2737,14 +2915,16 @@
               <w:ind/>
               <w:rPr/>
             </w:pPr>
-            <w:r/>
+            <w:r>
+              <w:t xml:space="preserve">1a – Model the effects of gravity using Newton’s laws of motion, 1ai – Laws should be implemented as methods in the celestialBodies class, 1b – Calculate the motion of objects using verlet integration, 1bi – Verlet integration should be implemented as methods in the celestialBodies class</w:t>
+            </w:r>
             <w:r/>
           </w:p>
         </w:tc>
         <w:tc>
           <w:tcPr>
             <w:tcBorders/>
-            <w:tcW w:w="1417" w:type="dxa"/>
+            <w:tcW w:w="1843" w:type="dxa"/>
             <w:vMerge w:val="restart"/>
             <w:textDirection w:val="lrTb"/>
             <w:noWrap w:val="false"/>
@@ -2756,7 +2936,9 @@
               <w:ind/>
               <w:rPr/>
             </w:pPr>
-            <w:r/>
+            <w:r>
+              <w:t xml:space="preserve">The paths of planets should look sensible and match physical intuition, i.e. They should be roughly circular / elliptical around the sun, and moons should orbit their hosts. Multiple planets should be selected to ensure they all have sensible orbits.</w:t>
+            </w:r>
             <w:r/>
           </w:p>
         </w:tc>
@@ -2775,14 +2957,16 @@
               <w:ind/>
               <w:rPr/>
             </w:pPr>
-            <w:r/>
+            <w:r>
+              <w:t xml:space="preserve">Right arrow key x8</w:t>
+            </w:r>
             <w:r/>
           </w:p>
         </w:tc>
         <w:tc>
           <w:tcPr>
             <w:tcBorders/>
-            <w:tcW w:w="1984" w:type="dxa"/>
+            <w:tcW w:w="2268" w:type="dxa"/>
             <w:vMerge w:val="restart"/>
             <w:textDirection w:val="lrTb"/>
             <w:noWrap w:val="false"/>
@@ -2794,14 +2978,16 @@
               <w:ind/>
               <w:rPr/>
             </w:pPr>
-            <w:r/>
+            <w:r>
+              <w:t xml:space="preserve">Planets should orbit the sun in ellipses, moons should orbit their host planets. The motion of planets should be smooth and not jittery, and it should look believable. If all this happens, then that is an indication that the methods implementing physical laws are accurate.</w:t>
+            </w:r>
             <w:r/>
           </w:p>
         </w:tc>
         <w:tc>
           <w:tcPr>
             <w:tcBorders/>
-            <w:tcW w:w="1701" w:type="dxa"/>
+            <w:tcW w:w="992" w:type="dxa"/>
             <w:vMerge w:val="restart"/>
             <w:textDirection w:val="lrTb"/>
             <w:noWrap w:val="false"/>
@@ -2894,6 +3080,90 @@
               <w:ind/>
               <w:rPr/>
             </w:pPr>
+            <w:r>
+              <w:t xml:space="preserve">3a – Accurately display the solar system with a scale model</w:t>
+            </w:r>
+            <w:r/>
+          </w:p>
+        </w:tc>
+        <w:tc>
+          <w:tcPr>
+            <w:tcBorders/>
+            <w:tcW w:w="1843" w:type="dxa"/>
+            <w:vMerge w:val="restart"/>
+            <w:textDirection w:val="lrTb"/>
+            <w:noWrap w:val="false"/>
+          </w:tcPr>
+          <w:p>
+            <w:pPr>
+              <w:pBdr/>
+              <w:spacing/>
+              <w:ind/>
+              <w:rPr/>
+            </w:pPr>
+            <w:r>
+              <w:t xml:space="preserve">Compare my solar system side by side with NASA’s Eyes model, to ensure that the model is accurate. If they look similar this shows my model is accurate.</w:t>
+            </w:r>
+            <w:r/>
+          </w:p>
+        </w:tc>
+        <w:tc>
+          <w:tcPr>
+            <w:tcBorders/>
+            <w:tcW w:w="992" w:type="dxa"/>
+            <w:vMerge w:val="restart"/>
+            <w:textDirection w:val="lrTb"/>
+            <w:noWrap w:val="false"/>
+          </w:tcPr>
+          <w:p>
+            <w:pPr>
+              <w:pBdr/>
+              <w:spacing/>
+              <w:ind/>
+              <w:rPr/>
+            </w:pPr>
+            <w:r>
+              <w:t xml:space="preserve">N/A</w:t>
+            </w:r>
+            <w:r/>
+          </w:p>
+        </w:tc>
+        <w:tc>
+          <w:tcPr>
+            <w:tcBorders/>
+            <w:tcW w:w="2268" w:type="dxa"/>
+            <w:vMerge w:val="restart"/>
+            <w:textDirection w:val="lrTb"/>
+            <w:noWrap w:val="false"/>
+          </w:tcPr>
+          <w:p>
+            <w:pPr>
+              <w:pBdr/>
+              <w:spacing/>
+              <w:ind/>
+              <w:rPr/>
+            </w:pPr>
+            <w:r>
+              <w:t xml:space="preserve">My program should match what is shown my NASA in terms of scale (note that NASA uses different colours than my model does, e.g. Mercury is purple in their model but grey in mine, this has no effect on the accuracy of the model).</w:t>
+            </w:r>
+            <w:r/>
+          </w:p>
+        </w:tc>
+        <w:tc>
+          <w:tcPr>
+            <w:tcBorders/>
+            <w:tcW w:w="992" w:type="dxa"/>
+            <w:vMerge w:val="restart"/>
+            <w:textDirection w:val="lrTb"/>
+            <w:noWrap w:val="false"/>
+          </w:tcPr>
+          <w:p>
+            <w:pPr>
+              <w:pBdr/>
+              <w:spacing/>
+              <w:ind/>
+              <w:rPr/>
+            </w:pPr>
             <w:r/>
             <w:r/>
           </w:p>
@@ -2920,6 +3190,133 @@
         <w:tc>
           <w:tcPr>
             <w:tcBorders/>
+            <w:tcW w:w="1133" w:type="dxa"/>
+            <w:vMerge w:val="restart"/>
+            <w:textDirection w:val="lrTb"/>
+            <w:noWrap w:val="false"/>
+          </w:tcPr>
+          <w:p>
+            <w:pPr>
+              <w:pBdr/>
+              <w:spacing/>
+              <w:ind/>
+              <w:rPr/>
+            </w:pPr>
+            <w:r/>
+            <w:r/>
+          </w:p>
+        </w:tc>
+      </w:tr>
+      <w:tr>
+        <w:trPr/>
+        <w:tc>
+          <w:tcPr>
+            <w:tcBorders/>
+            <w:tcW w:w="992" w:type="dxa"/>
+            <w:vMerge w:val="restart"/>
+            <w:textDirection w:val="lrTb"/>
+            <w:noWrap w:val="false"/>
+          </w:tcPr>
+          <w:p>
+            <w:pPr>
+              <w:pBdr/>
+              <w:spacing/>
+              <w:ind/>
+              <w:rPr/>
+            </w:pPr>
+            <w:r>
+              <w:t xml:space="preserve">18</w:t>
+            </w:r>
+            <w:r/>
+          </w:p>
+        </w:tc>
+        <w:tc>
+          <w:tcPr>
+            <w:tcBorders/>
+            <w:tcW w:w="1843" w:type="dxa"/>
+            <w:vMerge w:val="restart"/>
+            <w:textDirection w:val="lrTb"/>
+            <w:noWrap w:val="false"/>
+          </w:tcPr>
+          <w:p>
+            <w:pPr>
+              <w:pBdr/>
+              <w:spacing/>
+              <w:ind/>
+              <w:rPr/>
+            </w:pPr>
+            <w:r>
+              <w:t xml:space="preserve">3b – Orbital lines should be shown to demonstrate the path of the planets</w:t>
+            </w:r>
+            <w:r/>
+          </w:p>
+        </w:tc>
+        <w:tc>
+          <w:tcPr>
+            <w:tcBorders/>
+            <w:tcW w:w="1843" w:type="dxa"/>
+            <w:vMerge w:val="restart"/>
+            <w:textDirection w:val="lrTb"/>
+            <w:noWrap w:val="false"/>
+          </w:tcPr>
+          <w:p>
+            <w:pPr>
+              <w:pBdr/>
+              <w:spacing/>
+              <w:ind/>
+              <w:rPr/>
+            </w:pPr>
+            <w:r>
+              <w:t xml:space="preserve">The path of planets should be traced out by a line matching their colour.</w:t>
+            </w:r>
+            <w:r/>
+          </w:p>
+        </w:tc>
+        <w:tc>
+          <w:tcPr>
+            <w:tcBorders/>
+            <w:tcW w:w="992" w:type="dxa"/>
+            <w:vMerge w:val="restart"/>
+            <w:textDirection w:val="lrTb"/>
+            <w:noWrap w:val="false"/>
+          </w:tcPr>
+          <w:p>
+            <w:pPr>
+              <w:pBdr/>
+              <w:spacing/>
+              <w:ind/>
+              <w:rPr/>
+            </w:pPr>
+            <w:r>
+              <w:t xml:space="preserve">N/A</w:t>
+            </w:r>
+            <w:r/>
+          </w:p>
+        </w:tc>
+        <w:tc>
+          <w:tcPr>
+            <w:tcBorders/>
+            <w:tcW w:w="2268" w:type="dxa"/>
+            <w:vMerge w:val="restart"/>
+            <w:textDirection w:val="lrTb"/>
+            <w:noWrap w:val="false"/>
+          </w:tcPr>
+          <w:p>
+            <w:pPr>
+              <w:pBdr/>
+              <w:spacing/>
+              <w:ind/>
+              <w:rPr/>
+            </w:pPr>
+            <w:r>
+              <w:t xml:space="preserve">Ensure that planets trace out a path.</w:t>
+            </w:r>
+            <w:r/>
+          </w:p>
+        </w:tc>
+        <w:tc>
+          <w:tcPr>
+            <w:tcBorders/>
             <w:tcW w:w="992" w:type="dxa"/>
             <w:vMerge w:val="restart"/>
             <w:textDirection w:val="lrTb"/>
@@ -2939,7 +3336,7 @@
         <w:tc>
           <w:tcPr>
             <w:tcBorders/>
-            <w:tcW w:w="1984" w:type="dxa"/>
+            <w:tcW w:w="1417" w:type="dxa"/>
             <w:vMerge w:val="restart"/>
             <w:textDirection w:val="lrTb"/>
             <w:noWrap w:val="false"/>
@@ -2958,7 +3355,299 @@
         <w:tc>
           <w:tcPr>
             <w:tcBorders/>
-            <w:tcW w:w="1701" w:type="dxa"/>
+            <w:tcW w:w="1133" w:type="dxa"/>
+            <w:vMerge w:val="restart"/>
+            <w:textDirection w:val="lrTb"/>
+            <w:noWrap w:val="false"/>
+          </w:tcPr>
+          <w:p>
+            <w:pPr>
+              <w:pBdr/>
+              <w:spacing/>
+              <w:ind/>
+              <w:rPr/>
+            </w:pPr>
+            <w:r/>
+            <w:r/>
+          </w:p>
+        </w:tc>
+      </w:tr>
+      <w:tr>
+        <w:trPr/>
+        <w:tc>
+          <w:tcPr>
+            <w:tcBorders/>
+            <w:tcW w:w="992" w:type="dxa"/>
+            <w:vMerge w:val="restart"/>
+            <w:textDirection w:val="lrTb"/>
+            <w:noWrap w:val="false"/>
+          </w:tcPr>
+          <w:p>
+            <w:pPr>
+              <w:pBdr/>
+              <w:spacing/>
+              <w:ind/>
+              <w:rPr/>
+            </w:pPr>
+            <w:r>
+              <w:t xml:space="preserve">19</w:t>
+            </w:r>
+            <w:r/>
+          </w:p>
+        </w:tc>
+        <w:tc>
+          <w:tcPr>
+            <w:tcBorders/>
+            <w:tcW w:w="1843" w:type="dxa"/>
+            <w:vMerge w:val="restart"/>
+            <w:textDirection w:val="lrTb"/>
+            <w:noWrap w:val="false"/>
+          </w:tcPr>
+          <w:p>
+            <w:pPr>
+              <w:pBdr/>
+              <w:spacing/>
+              <w:ind/>
+              <w:rPr/>
+            </w:pPr>
+            <w:r>
+              <w:t xml:space="preserve">3c – The user should be able to focus the camera on any planet of their choosing or the center of mass</w:t>
+            </w:r>
+            <w:r/>
+          </w:p>
+        </w:tc>
+        <w:tc>
+          <w:tcPr>
+            <w:tcBorders/>
+            <w:tcW w:w="1843" w:type="dxa"/>
+            <w:vMerge w:val="restart"/>
+            <w:textDirection w:val="lrTb"/>
+            <w:noWrap w:val="false"/>
+          </w:tcPr>
+          <w:p>
+            <w:pPr>
+              <w:pBdr/>
+              <w:spacing/>
+              <w:ind/>
+              <w:rPr/>
+            </w:pPr>
+            <w:r>
+              <w:t xml:space="preserve">Should be able to switch focus by pressing the arrow keys and focus on the c.o.m. by pressing space.</w:t>
+            </w:r>
+            <w:r/>
+          </w:p>
+        </w:tc>
+        <w:tc>
+          <w:tcPr>
+            <w:tcBorders/>
+            <w:tcW w:w="992" w:type="dxa"/>
+            <w:vMerge w:val="restart"/>
+            <w:textDirection w:val="lrTb"/>
+            <w:noWrap w:val="false"/>
+          </w:tcPr>
+          <w:p>
+            <w:pPr>
+              <w:pBdr/>
+              <w:spacing/>
+              <w:ind/>
+              <w:rPr/>
+            </w:pPr>
+            <w:r>
+              <w:t xml:space="preserve">Right arrow key x20, left arrow key x3</w:t>
+            </w:r>
+            <w:r/>
+          </w:p>
+        </w:tc>
+        <w:tc>
+          <w:tcPr>
+            <w:tcBorders/>
+            <w:tcW w:w="2268" w:type="dxa"/>
+            <w:vMerge w:val="restart"/>
+            <w:textDirection w:val="lrTb"/>
+            <w:noWrap w:val="false"/>
+          </w:tcPr>
+          <w:p>
+            <w:pPr>
+              <w:pBdr/>
+              <w:spacing/>
+              <w:ind/>
+              <w:rPr/>
+            </w:pPr>
+            <w:r>
+              <w:t xml:space="preserve">Pressing the right arrow key should cycle through the planets and eventually loop back to the sun when pressed enough times. Pressing the left arrow key should cycle in the other direction.</w:t>
+            </w:r>
+            <w:r/>
+          </w:p>
+        </w:tc>
+        <w:tc>
+          <w:tcPr>
+            <w:tcBorders/>
+            <w:tcW w:w="992" w:type="dxa"/>
+            <w:vMerge w:val="restart"/>
+            <w:textDirection w:val="lrTb"/>
+            <w:noWrap w:val="false"/>
+          </w:tcPr>
+          <w:p>
+            <w:pPr>
+              <w:pBdr/>
+              <w:spacing/>
+              <w:ind/>
+              <w:rPr/>
+            </w:pPr>
+            <w:r/>
+            <w:r/>
+          </w:p>
+        </w:tc>
+        <w:tc>
+          <w:tcPr>
+            <w:tcBorders/>
+            <w:tcW w:w="1417" w:type="dxa"/>
+            <w:vMerge w:val="restart"/>
+            <w:textDirection w:val="lrTb"/>
+            <w:noWrap w:val="false"/>
+          </w:tcPr>
+          <w:p>
+            <w:pPr>
+              <w:pBdr/>
+              <w:spacing/>
+              <w:ind/>
+              <w:rPr/>
+            </w:pPr>
+            <w:r/>
+            <w:r/>
+          </w:p>
+        </w:tc>
+        <w:tc>
+          <w:tcPr>
+            <w:tcBorders/>
+            <w:tcW w:w="1133" w:type="dxa"/>
+            <w:vMerge w:val="restart"/>
+            <w:textDirection w:val="lrTb"/>
+            <w:noWrap w:val="false"/>
+          </w:tcPr>
+          <w:p>
+            <w:pPr>
+              <w:pBdr/>
+              <w:spacing/>
+              <w:ind/>
+              <w:rPr/>
+            </w:pPr>
+            <w:r/>
+            <w:r/>
+          </w:p>
+        </w:tc>
+      </w:tr>
+      <w:tr>
+        <w:trPr/>
+        <w:tc>
+          <w:tcPr>
+            <w:tcBorders/>
+            <w:tcW w:w="992" w:type="dxa"/>
+            <w:vMerge w:val="restart"/>
+            <w:textDirection w:val="lrTb"/>
+            <w:noWrap w:val="false"/>
+          </w:tcPr>
+          <w:p>
+            <w:pPr>
+              <w:pBdr/>
+              <w:spacing/>
+              <w:ind/>
+              <w:rPr/>
+            </w:pPr>
+            <w:r>
+              <w:t xml:space="preserve">20</w:t>
+            </w:r>
+            <w:r/>
+          </w:p>
+        </w:tc>
+        <w:tc>
+          <w:tcPr>
+            <w:tcBorders/>
+            <w:tcW w:w="1843" w:type="dxa"/>
+            <w:vMerge w:val="restart"/>
+            <w:textDirection w:val="lrTb"/>
+            <w:noWrap w:val="false"/>
+          </w:tcPr>
+          <w:p>
+            <w:pPr>
+              <w:pBdr/>
+              <w:spacing/>
+              <w:ind/>
+              <w:rPr/>
+            </w:pPr>
+            <w:r>
+              <w:t xml:space="preserve">3d – The user should be able to zoom in and out</w:t>
+            </w:r>
+            <w:r/>
+          </w:p>
+        </w:tc>
+        <w:tc>
+          <w:tcPr>
+            <w:tcBorders/>
+            <w:tcW w:w="1843" w:type="dxa"/>
+            <w:vMerge w:val="restart"/>
+            <w:textDirection w:val="lrTb"/>
+            <w:noWrap w:val="false"/>
+          </w:tcPr>
+          <w:p>
+            <w:pPr>
+              <w:pBdr/>
+              <w:spacing/>
+              <w:ind/>
+              <w:rPr/>
+            </w:pPr>
+            <w:r>
+              <w:t xml:space="preserve">It should be possible to zoom in and out of the solar system to see more of it or to get a more detailed view of one specific part of it</w:t>
+            </w:r>
+            <w:r/>
+          </w:p>
+        </w:tc>
+        <w:tc>
+          <w:tcPr>
+            <w:tcBorders/>
+            <w:tcW w:w="992" w:type="dxa"/>
+            <w:vMerge w:val="restart"/>
+            <w:textDirection w:val="lrTb"/>
+            <w:noWrap w:val="false"/>
+          </w:tcPr>
+          <w:p>
+            <w:pPr>
+              <w:pBdr/>
+              <w:spacing/>
+              <w:ind/>
+              <w:rPr/>
+            </w:pPr>
+            <w:r>
+              <w:t xml:space="preserve">Right arrow key x3, scroll up, scroll down</w:t>
+            </w:r>
+            <w:r/>
+          </w:p>
+        </w:tc>
+        <w:tc>
+          <w:tcPr>
+            <w:tcBorders/>
+            <w:tcW w:w="2268" w:type="dxa"/>
+            <w:vMerge w:val="restart"/>
+            <w:textDirection w:val="lrTb"/>
+            <w:noWrap w:val="false"/>
+          </w:tcPr>
+          <w:p>
+            <w:pPr>
+              <w:pBdr/>
+              <w:spacing/>
+              <w:ind/>
+              <w:rPr/>
+            </w:pPr>
+            <w:r>
+              <w:t xml:space="preserve">Select Earth with right arrow key, scrolling up should zoom in and make the Earth-Moon system visible, scrolling down should zoom out and make the rest of the solar system visible.</w:t>
+            </w:r>
+            <w:r/>
+          </w:p>
+        </w:tc>
+        <w:tc>
+          <w:tcPr>
+            <w:tcBorders/>
+            <w:tcW w:w="992" w:type="dxa"/>
             <w:vMerge w:val="restart"/>
             <w:textDirection w:val="lrTb"/>
             <w:noWrap w:val="false"/>
@@ -3056,7 +3745,7 @@
         <w:tc>
           <w:tcPr>
             <w:tcBorders/>
-            <w:tcW w:w="1417" w:type="dxa"/>
+            <w:tcW w:w="1843" w:type="dxa"/>
             <w:vMerge w:val="restart"/>
             <w:textDirection w:val="lrTb"/>
             <w:noWrap w:val="false"/>
@@ -3094,124 +3783,7 @@
         <w:tc>
           <w:tcPr>
             <w:tcBorders/>
-            <w:tcW w:w="1984" w:type="dxa"/>
-            <w:vMerge w:val="restart"/>
-            <w:textDirection w:val="lrTb"/>
-            <w:noWrap w:val="false"/>
-          </w:tcPr>
-          <w:p>
-            <w:pPr>
-              <w:pBdr/>
-              <w:spacing/>
-              <w:ind/>
-              <w:rPr/>
-            </w:pPr>
-            <w:r/>
-            <w:r/>
-          </w:p>
-        </w:tc>
-        <w:tc>
-          <w:tcPr>
-            <w:tcBorders/>
-            <w:tcW w:w="1701" w:type="dxa"/>
-            <w:vMerge w:val="restart"/>
-            <w:textDirection w:val="lrTb"/>
-            <w:noWrap w:val="false"/>
-          </w:tcPr>
-          <w:p>
-            <w:pPr>
-              <w:pBdr/>
-              <w:spacing/>
-              <w:ind/>
-              <w:rPr/>
-            </w:pPr>
-            <w:r/>
-            <w:r/>
-          </w:p>
-        </w:tc>
-        <w:tc>
-          <w:tcPr>
-            <w:tcBorders/>
-            <w:tcW w:w="1417" w:type="dxa"/>
-            <w:vMerge w:val="restart"/>
-            <w:textDirection w:val="lrTb"/>
-            <w:noWrap w:val="false"/>
-          </w:tcPr>
-          <w:p>
-            <w:pPr>
-              <w:pBdr/>
-              <w:spacing/>
-              <w:ind/>
-              <w:rPr/>
-            </w:pPr>
-            <w:r/>
-            <w:r/>
-          </w:p>
-        </w:tc>
-        <w:tc>
-          <w:tcPr>
-            <w:tcBorders/>
-            <w:tcW w:w="1133" w:type="dxa"/>
-            <w:vMerge w:val="restart"/>
-            <w:textDirection w:val="lrTb"/>
-            <w:noWrap w:val="false"/>
-          </w:tcPr>
-          <w:p>
-            <w:pPr>
-              <w:pBdr/>
-              <w:spacing/>
-              <w:ind/>
-              <w:rPr/>
-            </w:pPr>
-            <w:r/>
-            <w:r/>
-          </w:p>
-        </w:tc>
-      </w:tr>
-      <w:tr>
-        <w:trPr/>
-        <w:tc>
-          <w:tcPr>
-            <w:tcBorders/>
-            <w:tcW w:w="992" w:type="dxa"/>
-            <w:vMerge w:val="restart"/>
-            <w:textDirection w:val="lrTb"/>
-            <w:noWrap w:val="false"/>
-          </w:tcPr>
-          <w:p>
-            <w:pPr>
-              <w:pBdr/>
-              <w:spacing/>
-              <w:ind/>
-              <w:rPr/>
-            </w:pPr>
-            <w:r/>
-            <w:r/>
-          </w:p>
-        </w:tc>
-        <w:tc>
-          <w:tcPr>
-            <w:tcBorders/>
-            <w:tcW w:w="1843" w:type="dxa"/>
-            <w:vMerge w:val="restart"/>
-            <w:textDirection w:val="lrTb"/>
-            <w:noWrap w:val="false"/>
-          </w:tcPr>
-          <w:p>
-            <w:pPr>
-              <w:pBdr/>
-              <w:spacing/>
-              <w:ind/>
-              <w:rPr/>
-            </w:pPr>
-            <w:r/>
-            <w:r/>
-          </w:p>
-        </w:tc>
-        <w:tc>
-          <w:tcPr>
-            <w:tcBorders/>
-            <w:tcW w:w="1417" w:type="dxa"/>
+            <w:tcW w:w="2268" w:type="dxa"/>
             <w:vMerge w:val="restart"/>
             <w:textDirection w:val="lrTb"/>
             <w:noWrap w:val="false"/>
@@ -3231,354 +3803,6 @@
           <w:tcPr>
             <w:tcBorders/>
             <w:tcW w:w="992" w:type="dxa"/>
-            <w:vMerge w:val="restart"/>
-            <w:textDirection w:val="lrTb"/>
-            <w:noWrap w:val="false"/>
-          </w:tcPr>
-          <w:p>
-            <w:pPr>
-              <w:pBdr/>
-              <w:spacing/>
-              <w:ind/>
-              <w:rPr/>
-            </w:pPr>
-            <w:r/>
-            <w:r/>
-          </w:p>
-        </w:tc>
-        <w:tc>
-          <w:tcPr>
-            <w:tcBorders/>
-            <w:tcW w:w="1984" w:type="dxa"/>
-            <w:vMerge w:val="restart"/>
-            <w:textDirection w:val="lrTb"/>
-            <w:noWrap w:val="false"/>
-          </w:tcPr>
-          <w:p>
-            <w:pPr>
-              <w:pBdr/>
-              <w:spacing/>
-              <w:ind/>
-              <w:rPr/>
-            </w:pPr>
-            <w:r/>
-            <w:r/>
-          </w:p>
-        </w:tc>
-        <w:tc>
-          <w:tcPr>
-            <w:tcBorders/>
-            <w:tcW w:w="1701" w:type="dxa"/>
-            <w:vMerge w:val="restart"/>
-            <w:textDirection w:val="lrTb"/>
-            <w:noWrap w:val="false"/>
-          </w:tcPr>
-          <w:p>
-            <w:pPr>
-              <w:pBdr/>
-              <w:spacing/>
-              <w:ind/>
-              <w:rPr/>
-            </w:pPr>
-            <w:r/>
-            <w:r/>
-          </w:p>
-        </w:tc>
-        <w:tc>
-          <w:tcPr>
-            <w:tcBorders/>
-            <w:tcW w:w="1417" w:type="dxa"/>
-            <w:vMerge w:val="restart"/>
-            <w:textDirection w:val="lrTb"/>
-            <w:noWrap w:val="false"/>
-          </w:tcPr>
-          <w:p>
-            <w:pPr>
-              <w:pBdr/>
-              <w:spacing/>
-              <w:ind/>
-              <w:rPr/>
-            </w:pPr>
-            <w:r/>
-            <w:r/>
-          </w:p>
-        </w:tc>
-        <w:tc>
-          <w:tcPr>
-            <w:tcBorders/>
-            <w:tcW w:w="1133" w:type="dxa"/>
-            <w:vMerge w:val="restart"/>
-            <w:textDirection w:val="lrTb"/>
-            <w:noWrap w:val="false"/>
-          </w:tcPr>
-          <w:p>
-            <w:pPr>
-              <w:pBdr/>
-              <w:spacing/>
-              <w:ind/>
-              <w:rPr/>
-            </w:pPr>
-            <w:r/>
-            <w:r/>
-          </w:p>
-        </w:tc>
-      </w:tr>
-      <w:tr>
-        <w:trPr/>
-        <w:tc>
-          <w:tcPr>
-            <w:tcBorders/>
-            <w:tcW w:w="992" w:type="dxa"/>
-            <w:vMerge w:val="restart"/>
-            <w:textDirection w:val="lrTb"/>
-            <w:noWrap w:val="false"/>
-          </w:tcPr>
-          <w:p>
-            <w:pPr>
-              <w:pBdr/>
-              <w:spacing/>
-              <w:ind/>
-              <w:rPr/>
-            </w:pPr>
-            <w:r/>
-            <w:r/>
-          </w:p>
-        </w:tc>
-        <w:tc>
-          <w:tcPr>
-            <w:tcBorders/>
-            <w:tcW w:w="1843" w:type="dxa"/>
-            <w:vMerge w:val="restart"/>
-            <w:textDirection w:val="lrTb"/>
-            <w:noWrap w:val="false"/>
-          </w:tcPr>
-          <w:p>
-            <w:pPr>
-              <w:pBdr/>
-              <w:spacing/>
-              <w:ind/>
-              <w:rPr/>
-            </w:pPr>
-            <w:r/>
-            <w:r/>
-          </w:p>
-        </w:tc>
-        <w:tc>
-          <w:tcPr>
-            <w:tcBorders/>
-            <w:tcW w:w="1417" w:type="dxa"/>
-            <w:vMerge w:val="restart"/>
-            <w:textDirection w:val="lrTb"/>
-            <w:noWrap w:val="false"/>
-          </w:tcPr>
-          <w:p>
-            <w:pPr>
-              <w:pBdr/>
-              <w:spacing/>
-              <w:ind/>
-              <w:rPr/>
-            </w:pPr>
-            <w:r/>
-            <w:r/>
-          </w:p>
-        </w:tc>
-        <w:tc>
-          <w:tcPr>
-            <w:tcBorders/>
-            <w:tcW w:w="992" w:type="dxa"/>
-            <w:vMerge w:val="restart"/>
-            <w:textDirection w:val="lrTb"/>
-            <w:noWrap w:val="false"/>
-          </w:tcPr>
-          <w:p>
-            <w:pPr>
-              <w:pBdr/>
-              <w:spacing/>
-              <w:ind/>
-              <w:rPr/>
-            </w:pPr>
-            <w:r/>
-            <w:r/>
-          </w:p>
-        </w:tc>
-        <w:tc>
-          <w:tcPr>
-            <w:tcBorders/>
-            <w:tcW w:w="1984" w:type="dxa"/>
-            <w:vMerge w:val="restart"/>
-            <w:textDirection w:val="lrTb"/>
-            <w:noWrap w:val="false"/>
-          </w:tcPr>
-          <w:p>
-            <w:pPr>
-              <w:pBdr/>
-              <w:spacing/>
-              <w:ind/>
-              <w:rPr/>
-            </w:pPr>
-            <w:r/>
-            <w:r/>
-          </w:p>
-        </w:tc>
-        <w:tc>
-          <w:tcPr>
-            <w:tcBorders/>
-            <w:tcW w:w="1701" w:type="dxa"/>
-            <w:vMerge w:val="restart"/>
-            <w:textDirection w:val="lrTb"/>
-            <w:noWrap w:val="false"/>
-          </w:tcPr>
-          <w:p>
-            <w:pPr>
-              <w:pBdr/>
-              <w:spacing/>
-              <w:ind/>
-              <w:rPr/>
-            </w:pPr>
-            <w:r/>
-            <w:r/>
-          </w:p>
-        </w:tc>
-        <w:tc>
-          <w:tcPr>
-            <w:tcBorders/>
-            <w:tcW w:w="1417" w:type="dxa"/>
-            <w:vMerge w:val="restart"/>
-            <w:textDirection w:val="lrTb"/>
-            <w:noWrap w:val="false"/>
-          </w:tcPr>
-          <w:p>
-            <w:pPr>
-              <w:pBdr/>
-              <w:spacing/>
-              <w:ind/>
-              <w:rPr/>
-            </w:pPr>
-            <w:r/>
-            <w:r/>
-          </w:p>
-        </w:tc>
-        <w:tc>
-          <w:tcPr>
-            <w:tcBorders/>
-            <w:tcW w:w="1133" w:type="dxa"/>
-            <w:vMerge w:val="restart"/>
-            <w:textDirection w:val="lrTb"/>
-            <w:noWrap w:val="false"/>
-          </w:tcPr>
-          <w:p>
-            <w:pPr>
-              <w:pBdr/>
-              <w:spacing/>
-              <w:ind/>
-              <w:rPr/>
-            </w:pPr>
-            <w:r/>
-            <w:r/>
-          </w:p>
-        </w:tc>
-      </w:tr>
-      <w:tr>
-        <w:trPr/>
-        <w:tc>
-          <w:tcPr>
-            <w:tcBorders/>
-            <w:tcW w:w="992" w:type="dxa"/>
-            <w:vMerge w:val="restart"/>
-            <w:textDirection w:val="lrTb"/>
-            <w:noWrap w:val="false"/>
-          </w:tcPr>
-          <w:p>
-            <w:pPr>
-              <w:pBdr/>
-              <w:spacing/>
-              <w:ind/>
-              <w:rPr/>
-            </w:pPr>
-            <w:r/>
-            <w:r/>
-          </w:p>
-        </w:tc>
-        <w:tc>
-          <w:tcPr>
-            <w:tcBorders/>
-            <w:tcW w:w="1843" w:type="dxa"/>
-            <w:vMerge w:val="restart"/>
-            <w:textDirection w:val="lrTb"/>
-            <w:noWrap w:val="false"/>
-          </w:tcPr>
-          <w:p>
-            <w:pPr>
-              <w:pBdr/>
-              <w:spacing/>
-              <w:ind/>
-              <w:rPr/>
-            </w:pPr>
-            <w:r/>
-            <w:r/>
-          </w:p>
-        </w:tc>
-        <w:tc>
-          <w:tcPr>
-            <w:tcBorders/>
-            <w:tcW w:w="1417" w:type="dxa"/>
-            <w:vMerge w:val="restart"/>
-            <w:textDirection w:val="lrTb"/>
-            <w:noWrap w:val="false"/>
-          </w:tcPr>
-          <w:p>
-            <w:pPr>
-              <w:pBdr/>
-              <w:spacing/>
-              <w:ind/>
-              <w:rPr/>
-            </w:pPr>
-            <w:r/>
-            <w:r/>
-          </w:p>
-        </w:tc>
-        <w:tc>
-          <w:tcPr>
-            <w:tcBorders/>
-            <w:tcW w:w="992" w:type="dxa"/>
-            <w:vMerge w:val="restart"/>
-            <w:textDirection w:val="lrTb"/>
-            <w:noWrap w:val="false"/>
-          </w:tcPr>
-          <w:p>
-            <w:pPr>
-              <w:pBdr/>
-              <w:spacing/>
-              <w:ind/>
-              <w:rPr/>
-            </w:pPr>
-            <w:r/>
-            <w:r/>
-          </w:p>
-        </w:tc>
-        <w:tc>
-          <w:tcPr>
-            <w:tcBorders/>
-            <w:tcW w:w="1984" w:type="dxa"/>
-            <w:vMerge w:val="restart"/>
-            <w:textDirection w:val="lrTb"/>
-            <w:noWrap w:val="false"/>
-          </w:tcPr>
-          <w:p>
-            <w:pPr>
-              <w:pBdr/>
-              <w:spacing/>
-              <w:ind/>
-              <w:rPr/>
-            </w:pPr>
-            <w:r/>
-            <w:r/>
-          </w:p>
-        </w:tc>
-        <w:tc>
-          <w:tcPr>
-            <w:tcBorders/>
-            <w:tcW w:w="1701" w:type="dxa"/>
             <w:vMerge w:val="restart"/>
             <w:textDirection w:val="lrTb"/>
             <w:noWrap w:val="false"/>
@@ -3648,7 +3872,7 @@
       <w:footnotePr/>
       <w:endnotePr/>
       <w:type w:val="nextPage"/>
-      <w:pgSz w:h="16838" w:orient="portrait" w:w="11906"/>
+      <w:pgSz w:h="16838" w:orient="landscape" w:w="11906"/>
       <w:pgMar w:top="1134" w:right="850" w:bottom="1134" w:left="1701" w:header="709" w:footer="709" w:gutter="0"/>
       <w:cols w:num="1" w:sep="0" w:space="708" w:equalWidth="1"/>
     </w:sectPr>
@@ -3880,9 +4104,20 @@
     <w:lsdException w:name="Bibliography" w:uiPriority="37"/>
     <w:lsdException w:name="TOC Heading" w:uiPriority="39" w:qFormat="1"/>
   </w:latentStyles>
-  <w:style w:type="table" w:styleId="697">
+  <w:style w:type="character" w:styleId="47">
+    <w:name w:val="Caption Char"/>
+    <w:basedOn w:val="818"/>
+    <w:link w:val="816"/>
+    <w:uiPriority w:val="99"/>
+    <w:pPr>
+      <w:pBdr/>
+      <w:spacing/>
+      <w:ind/>
+    </w:pPr>
+  </w:style>
+  <w:style w:type="table" w:styleId="654">
     <w:name w:val="Table Grid"/>
-    <w:basedOn w:val="882"/>
+    <w:basedOn w:val="839"/>
     <w:uiPriority w:val="59"/>
     <w:pPr>
       <w:pBdr/>
@@ -4079,9 +4314,9 @@
       </w:tcPr>
     </w:tblStylePr>
   </w:style>
-  <w:style w:type="table" w:styleId="698">
+  <w:style w:type="table" w:styleId="655">
     <w:name w:val="Table Grid Light"/>
-    <w:basedOn w:val="882"/>
+    <w:basedOn w:val="839"/>
     <w:uiPriority w:val="59"/>
     <w:pPr>
       <w:pBdr/>
@@ -4278,9 +4513,9 @@
       </w:tcPr>
     </w:tblStylePr>
   </w:style>
-  <w:style w:type="table" w:styleId="699">
+  <w:style w:type="table" w:styleId="656">
     <w:name w:val="Plain Table 1"/>
-    <w:basedOn w:val="882"/>
+    <w:basedOn w:val="839"/>
     <w:uiPriority w:val="59"/>
     <w:pPr>
       <w:pBdr/>
@@ -4503,9 +4738,9 @@
       </w:tcPr>
     </w:tblStylePr>
   </w:style>
-  <w:style w:type="table" w:styleId="700">
+  <w:style w:type="table" w:styleId="657">
     <w:name w:val="Plain Table 2"/>
-    <w:basedOn w:val="882"/>
+    <w:basedOn w:val="839"/>
     <w:uiPriority w:val="59"/>
     <w:pPr>
       <w:pBdr/>
@@ -4736,9 +4971,9 @@
       </w:tcPr>
     </w:tblStylePr>
   </w:style>
-  <w:style w:type="table" w:styleId="701">
+  <w:style w:type="table" w:styleId="658">
     <w:name w:val="Plain Table 3"/>
-    <w:basedOn w:val="882"/>
+    <w:basedOn w:val="839"/>
     <w:uiPriority w:val="99"/>
     <w:pPr>
       <w:pBdr/>
@@ -4966,9 +5201,9 @@
       </w:tcPr>
     </w:tblStylePr>
   </w:style>
-  <w:style w:type="table" w:styleId="702">
+  <w:style w:type="table" w:styleId="659">
     <w:name w:val="Plain Table 4"/>
-    <w:basedOn w:val="882"/>
+    <w:basedOn w:val="839"/>
     <w:uiPriority w:val="99"/>
     <w:pPr>
       <w:pBdr/>
@@ -5182,9 +5417,9 @@
       </w:tcPr>
     </w:tblStylePr>
   </w:style>
-  <w:style w:type="table" w:styleId="703">
+  <w:style w:type="table" w:styleId="660">
     <w:name w:val="Plain Table 5"/>
-    <w:basedOn w:val="882"/>
+    <w:basedOn w:val="839"/>
     <w:uiPriority w:val="99"/>
     <w:pPr>
       <w:pBdr/>
@@ -5415,9 +5650,9 @@
       </w:tcPr>
     </w:tblStylePr>
   </w:style>
-  <w:style w:type="table" w:styleId="704">
+  <w:style w:type="table" w:styleId="661">
     <w:name w:val="Grid Table 1 Light"/>
-    <w:basedOn w:val="882"/>
+    <w:basedOn w:val="839"/>
     <w:uiPriority w:val="99"/>
     <w:pPr>
       <w:pBdr/>
@@ -5638,9 +5873,9 @@
       </w:tcPr>
     </w:tblStylePr>
   </w:style>
-  <w:style w:type="table" w:styleId="705">
+  <w:style w:type="table" w:styleId="662">
     <w:name w:val="Grid Table 1 Light - Accent 1"/>
-    <w:basedOn w:val="882"/>
+    <w:basedOn w:val="839"/>
     <w:uiPriority w:val="99"/>
     <w:pPr>
       <w:pBdr/>
@@ -5861,9 +6096,9 @@
       </w:tcPr>
     </w:tblStylePr>
   </w:style>
-  <w:style w:type="table" w:styleId="706">
+  <w:style w:type="table" w:styleId="663">
     <w:name w:val="Grid Table 1 Light - Accent 2"/>
-    <w:basedOn w:val="882"/>
+    <w:basedOn w:val="839"/>
     <w:uiPriority w:val="99"/>
     <w:pPr>
       <w:pBdr/>
@@ -6084,9 +6319,9 @@
       </w:tcPr>
     </w:tblStylePr>
   </w:style>
-  <w:style w:type="table" w:styleId="707">
+  <w:style w:type="table" w:styleId="664">
     <w:name w:val="Grid Table 1 Light - Accent 3"/>
-    <w:basedOn w:val="882"/>
+    <w:basedOn w:val="839"/>
     <w:uiPriority w:val="99"/>
     <w:pPr>
       <w:pBdr/>
@@ -6307,9 +6542,9 @@
       </w:tcPr>
     </w:tblStylePr>
   </w:style>
-  <w:style w:type="table" w:styleId="708">
+  <w:style w:type="table" w:styleId="665">
     <w:name w:val="Grid Table 1 Light - Accent 4"/>
-    <w:basedOn w:val="882"/>
+    <w:basedOn w:val="839"/>
     <w:uiPriority w:val="99"/>
     <w:pPr>
       <w:pBdr/>
@@ -6530,9 +6765,9 @@
       </w:tcPr>
     </w:tblStylePr>
   </w:style>
-  <w:style w:type="table" w:styleId="709">
+  <w:style w:type="table" w:styleId="666">
     <w:name w:val="Grid Table 1 Light - Accent 5"/>
-    <w:basedOn w:val="882"/>
+    <w:basedOn w:val="839"/>
     <w:uiPriority w:val="99"/>
     <w:pPr>
       <w:pBdr/>
@@ -6753,9 +6988,9 @@
       </w:tcPr>
     </w:tblStylePr>
   </w:style>
-  <w:style w:type="table" w:styleId="710">
+  <w:style w:type="table" w:styleId="667">
     <w:name w:val="Grid Table 1 Light - Accent 6"/>
-    <w:basedOn w:val="882"/>
+    <w:basedOn w:val="839"/>
     <w:uiPriority w:val="99"/>
     <w:pPr>
       <w:pBdr/>
@@ -6976,9 +7211,9 @@
       </w:tcPr>
     </w:tblStylePr>
   </w:style>
-  <w:style w:type="table" w:styleId="711">
+  <w:style w:type="table" w:styleId="668">
     <w:name w:val="Grid Table 2"/>
-    <w:basedOn w:val="882"/>
+    <w:basedOn w:val="839"/>
     <w:uiPriority w:val="99"/>
     <w:pPr>
       <w:pBdr/>
@@ -7208,9 +7443,9 @@
       </w:tcPr>
     </w:tblStylePr>
   </w:style>
-  <w:style w:type="table" w:styleId="712">
+  <w:style w:type="table" w:styleId="669">
     <w:name w:val="Grid Table 2 - Accent 1"/>
-    <w:basedOn w:val="882"/>
+    <w:basedOn w:val="839"/>
     <w:uiPriority w:val="99"/>
     <w:pPr>
       <w:pBdr/>
@@ -7440,9 +7675,9 @@
       </w:tcPr>
     </w:tblStylePr>
   </w:style>
-  <w:style w:type="table" w:styleId="713">
+  <w:style w:type="table" w:styleId="670">
     <w:name w:val="Grid Table 2 - Accent 2"/>
-    <w:basedOn w:val="882"/>
+    <w:basedOn w:val="839"/>
     <w:uiPriority w:val="99"/>
     <w:pPr>
       <w:pBdr/>
@@ -7672,9 +7907,9 @@
       </w:tcPr>
     </w:tblStylePr>
   </w:style>
-  <w:style w:type="table" w:styleId="714">
+  <w:style w:type="table" w:styleId="671">
     <w:name w:val="Grid Table 2 - Accent 3"/>
-    <w:basedOn w:val="882"/>
+    <w:basedOn w:val="839"/>
     <w:uiPriority w:val="99"/>
     <w:pPr>
       <w:pBdr/>
@@ -7904,9 +8139,9 @@
       </w:tcPr>
     </w:tblStylePr>
   </w:style>
-  <w:style w:type="table" w:styleId="715">
+  <w:style w:type="table" w:styleId="672">
     <w:name w:val="Grid Table 2 - Accent 4"/>
-    <w:basedOn w:val="882"/>
+    <w:basedOn w:val="839"/>
     <w:uiPriority w:val="99"/>
     <w:pPr>
       <w:pBdr/>
@@ -8136,9 +8371,9 @@
       </w:tcPr>
     </w:tblStylePr>
   </w:style>
-  <w:style w:type="table" w:styleId="716">
+  <w:style w:type="table" w:styleId="673">
     <w:name w:val="Grid Table 2 - Accent 5"/>
-    <w:basedOn w:val="882"/>
+    <w:basedOn w:val="839"/>
     <w:uiPriority w:val="99"/>
     <w:pPr>
       <w:pBdr/>
@@ -8368,9 +8603,9 @@
       </w:tcPr>
     </w:tblStylePr>
   </w:style>
-  <w:style w:type="table" w:styleId="717">
+  <w:style w:type="table" w:styleId="674">
     <w:name w:val="Grid Table 2 - Accent 6"/>
-    <w:basedOn w:val="882"/>
+    <w:basedOn w:val="839"/>
     <w:uiPriority w:val="99"/>
     <w:pPr>
       <w:pBdr/>
@@ -8600,9 +8835,9 @@
       </w:tcPr>
     </w:tblStylePr>
   </w:style>
-  <w:style w:type="table" w:styleId="718">
+  <w:style w:type="table" w:styleId="675">
     <w:name w:val="Grid Table 3"/>
-    <w:basedOn w:val="882"/>
+    <w:basedOn w:val="839"/>
     <w:uiPriority w:val="99"/>
     <w:pPr>
       <w:pBdr/>
@@ -8845,9 +9080,9 @@
       </w:tcPr>
     </w:tblStylePr>
   </w:style>
-  <w:style w:type="table" w:styleId="719">
+  <w:style w:type="table" w:styleId="676">
     <w:name w:val="Grid Table 3 - Accent 1"/>
-    <w:basedOn w:val="882"/>
+    <w:basedOn w:val="839"/>
     <w:uiPriority w:val="99"/>
     <w:pPr>
       <w:pBdr/>
@@ -9090,9 +9325,9 @@
       </w:tcPr>
     </w:tblStylePr>
   </w:style>
-  <w:style w:type="table" w:styleId="720">
+  <w:style w:type="table" w:styleId="677">
     <w:name w:val="Grid Table 3 - Accent 2"/>
-    <w:basedOn w:val="882"/>
+    <w:basedOn w:val="839"/>
     <w:uiPriority w:val="99"/>
     <w:pPr>
       <w:pBdr/>
@@ -9335,9 +9570,9 @@
       </w:tcPr>
     </w:tblStylePr>
   </w:style>
-  <w:style w:type="table" w:styleId="721">
+  <w:style w:type="table" w:styleId="678">
     <w:name w:val="Grid Table 3 - Accent 3"/>
-    <w:basedOn w:val="882"/>
+    <w:basedOn w:val="839"/>
     <w:uiPriority w:val="99"/>
     <w:pPr>
       <w:pBdr/>
@@ -9580,9 +9815,9 @@
       </w:tcPr>
     </w:tblStylePr>
   </w:style>
-  <w:style w:type="table" w:styleId="722">
+  <w:style w:type="table" w:styleId="679">
     <w:name w:val="Grid Table 3 - Accent 4"/>
-    <w:basedOn w:val="882"/>
+    <w:basedOn w:val="839"/>
     <w:uiPriority w:val="99"/>
     <w:pPr>
       <w:pBdr/>
@@ -9825,9 +10060,9 @@
       </w:tcPr>
     </w:tblStylePr>
   </w:style>
-  <w:style w:type="table" w:styleId="723">
+  <w:style w:type="table" w:styleId="680">
     <w:name w:val="Grid Table 3 - Accent 5"/>
-    <w:basedOn w:val="882"/>
+    <w:basedOn w:val="839"/>
     <w:uiPriority w:val="99"/>
     <w:pPr>
       <w:pBdr/>
@@ -10070,9 +10305,9 @@
       </w:tcPr>
     </w:tblStylePr>
   </w:style>
-  <w:style w:type="table" w:styleId="724">
+  <w:style w:type="table" w:styleId="681">
     <w:name w:val="Grid Table 3 - Accent 6"/>
-    <w:basedOn w:val="882"/>
+    <w:basedOn w:val="839"/>
     <w:uiPriority w:val="99"/>
     <w:pPr>
       <w:pBdr/>
@@ -10315,9 +10550,9 @@
       </w:tcPr>
     </w:tblStylePr>
   </w:style>
-  <w:style w:type="table" w:styleId="725">
+  <w:style w:type="table" w:styleId="682">
     <w:name w:val="Grid Table 4"/>
-    <w:basedOn w:val="882"/>
+    <w:basedOn w:val="839"/>
     <w:uiPriority w:val="59"/>
     <w:pPr>
       <w:pBdr/>
@@ -10548,9 +10783,9 @@
       </w:tcPr>
     </w:tblStylePr>
   </w:style>
-  <w:style w:type="table" w:styleId="726">
+  <w:style w:type="table" w:styleId="683">
     <w:name w:val="Grid Table 4 - Accent 1"/>
-    <w:basedOn w:val="882"/>
+    <w:basedOn w:val="839"/>
     <w:uiPriority w:val="59"/>
     <w:pPr>
       <w:pBdr/>
@@ -10781,9 +11016,9 @@
       </w:tcPr>
     </w:tblStylePr>
   </w:style>
-  <w:style w:type="table" w:styleId="727">
+  <w:style w:type="table" w:styleId="684">
     <w:name w:val="Grid Table 4 - Accent 2"/>
-    <w:basedOn w:val="882"/>
+    <w:basedOn w:val="839"/>
     <w:uiPriority w:val="59"/>
     <w:pPr>
       <w:pBdr/>
@@ -11014,9 +11249,9 @@
       </w:tcPr>
     </w:tblStylePr>
   </w:style>
-  <w:style w:type="table" w:styleId="728">
+  <w:style w:type="table" w:styleId="685">
     <w:name w:val="Grid Table 4 - Accent 3"/>
-    <w:basedOn w:val="882"/>
+    <w:basedOn w:val="839"/>
     <w:uiPriority w:val="59"/>
     <w:pPr>
       <w:pBdr/>
@@ -11247,9 +11482,9 @@
       </w:tcPr>
     </w:tblStylePr>
   </w:style>
-  <w:style w:type="table" w:styleId="729">
+  <w:style w:type="table" w:styleId="686">
     <w:name w:val="Grid Table 4 - Accent 4"/>
-    <w:basedOn w:val="882"/>
+    <w:basedOn w:val="839"/>
     <w:uiPriority w:val="59"/>
     <w:pPr>
       <w:pBdr/>
@@ -11480,9 +11715,9 @@
       </w:tcPr>
     </w:tblStylePr>
   </w:style>
-  <w:style w:type="table" w:styleId="730">
+  <w:style w:type="table" w:styleId="687">
     <w:name w:val="Grid Table 4 - Accent 5"/>
-    <w:basedOn w:val="882"/>
+    <w:basedOn w:val="839"/>
     <w:uiPriority w:val="59"/>
     <w:pPr>
       <w:pBdr/>
@@ -11713,9 +11948,9 @@
       </w:tcPr>
     </w:tblStylePr>
   </w:style>
-  <w:style w:type="table" w:styleId="731">
+  <w:style w:type="table" w:styleId="688">
     <w:name w:val="Grid Table 4 - Accent 6"/>
-    <w:basedOn w:val="882"/>
+    <w:basedOn w:val="839"/>
     <w:uiPriority w:val="59"/>
     <w:pPr>
       <w:pBdr/>
@@ -11946,9 +12181,9 @@
       </w:tcPr>
     </w:tblStylePr>
   </w:style>
-  <w:style w:type="table" w:styleId="732">
+  <w:style w:type="table" w:styleId="689">
     <w:name w:val="Grid Table 5 Dark"/>
-    <w:basedOn w:val="882"/>
+    <w:basedOn w:val="839"/>
     <w:uiPriority w:val="99"/>
     <w:pPr>
       <w:pBdr/>
@@ -12174,9 +12409,9 @@
       </w:tcPr>
     </w:tblStylePr>
   </w:style>
-  <w:style w:type="table" w:styleId="733">
+  <w:style w:type="table" w:styleId="690">
     <w:name w:val="Grid Table 5 Dark- Accent 1"/>
-    <w:basedOn w:val="882"/>
+    <w:basedOn w:val="839"/>
     <w:uiPriority w:val="99"/>
     <w:pPr>
       <w:pBdr/>
@@ -12402,9 +12637,9 @@
       </w:tcPr>
     </w:tblStylePr>
   </w:style>
-  <w:style w:type="table" w:styleId="734">
+  <w:style w:type="table" w:styleId="691">
     <w:name w:val="Grid Table 5 Dark - Accent 2"/>
-    <w:basedOn w:val="882"/>
+    <w:basedOn w:val="839"/>
     <w:uiPriority w:val="99"/>
     <w:pPr>
       <w:pBdr/>
@@ -12630,9 +12865,9 @@
       </w:tcPr>
     </w:tblStylePr>
   </w:style>
-  <w:style w:type="table" w:styleId="735">
+  <w:style w:type="table" w:styleId="692">
     <w:name w:val="Grid Table 5 Dark - Accent 3"/>
-    <w:basedOn w:val="882"/>
+    <w:basedOn w:val="839"/>
     <w:uiPriority w:val="99"/>
     <w:pPr>
       <w:pBdr/>
@@ -12858,9 +13093,9 @@
       </w:tcPr>
     </w:tblStylePr>
   </w:style>
-  <w:style w:type="table" w:styleId="736">
+  <w:style w:type="table" w:styleId="693">
     <w:name w:val="Grid Table 5 Dark- Accent 4"/>
-    <w:basedOn w:val="882"/>
+    <w:basedOn w:val="839"/>
     <w:uiPriority w:val="99"/>
     <w:pPr>
       <w:pBdr/>
@@ -13086,9 +13321,9 @@
       </w:tcPr>
     </w:tblStylePr>
   </w:style>
-  <w:style w:type="table" w:styleId="737">
+  <w:style w:type="table" w:styleId="694">
     <w:name w:val="Grid Table 5 Dark - Accent 5"/>
-    <w:basedOn w:val="882"/>
+    <w:basedOn w:val="839"/>
     <w:uiPriority w:val="99"/>
     <w:pPr>
       <w:pBdr/>
@@ -13314,9 +13549,9 @@
       </w:tcPr>
     </w:tblStylePr>
   </w:style>
-  <w:style w:type="table" w:styleId="738">
+  <w:style w:type="table" w:styleId="695">
     <w:name w:val="Grid Table 5 Dark - Accent 6"/>
-    <w:basedOn w:val="882"/>
+    <w:basedOn w:val="839"/>
     <w:uiPriority w:val="99"/>
     <w:pPr>
       <w:pBdr/>
@@ -13542,9 +13777,9 @@
       </w:tcPr>
     </w:tblStylePr>
   </w:style>
-  <w:style w:type="table" w:styleId="739">
+  <w:style w:type="table" w:styleId="696">
     <w:name w:val="Grid Table 6 Colorful"/>
-    <w:basedOn w:val="882"/>
+    <w:basedOn w:val="839"/>
     <w:uiPriority w:val="99"/>
     <w:pPr>
       <w:pBdr/>
@@ -13772,9 +14007,9 @@
       </w:tcPr>
     </w:tblStylePr>
   </w:style>
-  <w:style w:type="table" w:styleId="740">
+  <w:style w:type="table" w:styleId="697">
     <w:name w:val="Grid Table 6 Colorful - Accent 1"/>
-    <w:basedOn w:val="882"/>
+    <w:basedOn w:val="839"/>
     <w:uiPriority w:val="99"/>
     <w:pPr>
       <w:pBdr/>
@@ -14002,9 +14237,9 @@
       </w:tcPr>
     </w:tblStylePr>
   </w:style>
-  <w:style w:type="table" w:styleId="741">
+  <w:style w:type="table" w:styleId="698">
     <w:name w:val="Grid Table 6 Colorful - Accent 2"/>
-    <w:basedOn w:val="882"/>
+    <w:basedOn w:val="839"/>
     <w:uiPriority w:val="99"/>
     <w:pPr>
       <w:pBdr/>
@@ -14232,9 +14467,9 @@
       </w:tcPr>
     </w:tblStylePr>
   </w:style>
-  <w:style w:type="table" w:styleId="742">
+  <w:style w:type="table" w:styleId="699">
     <w:name w:val="Grid Table 6 Colorful - Accent 3"/>
-    <w:basedOn w:val="882"/>
+    <w:basedOn w:val="839"/>
     <w:uiPriority w:val="99"/>
     <w:pPr>
       <w:pBdr/>
@@ -14462,9 +14697,9 @@
       </w:tcPr>
     </w:tblStylePr>
   </w:style>
-  <w:style w:type="table" w:styleId="743">
+  <w:style w:type="table" w:styleId="700">
     <w:name w:val="Grid Table 6 Colorful - Accent 4"/>
-    <w:basedOn w:val="882"/>
+    <w:basedOn w:val="839"/>
     <w:uiPriority w:val="99"/>
     <w:pPr>
       <w:pBdr/>
@@ -14692,9 +14927,9 @@
       </w:tcPr>
     </w:tblStylePr>
   </w:style>
-  <w:style w:type="table" w:styleId="744">
+  <w:style w:type="table" w:styleId="701">
     <w:name w:val="Grid Table 6 Colorful - Accent 5"/>
-    <w:basedOn w:val="882"/>
+    <w:basedOn w:val="839"/>
     <w:uiPriority w:val="99"/>
     <w:pPr>
       <w:pBdr/>
@@ -14922,9 +15157,9 @@
       </w:tcPr>
     </w:tblStylePr>
   </w:style>
-  <w:style w:type="table" w:styleId="745">
+  <w:style w:type="table" w:styleId="702">
     <w:name w:val="Grid Table 6 Colorful - Accent 6"/>
-    <w:basedOn w:val="882"/>
+    <w:basedOn w:val="839"/>
     <w:uiPriority w:val="99"/>
     <w:pPr>
       <w:pBdr/>
@@ -15152,9 +15387,9 @@
       </w:tcPr>
     </w:tblStylePr>
   </w:style>
-  <w:style w:type="table" w:styleId="746">
+  <w:style w:type="table" w:styleId="703">
     <w:name w:val="Grid Table 7 Colorful"/>
-    <w:basedOn w:val="882"/>
+    <w:basedOn w:val="839"/>
     <w:uiPriority w:val="99"/>
     <w:pPr>
       <w:pBdr/>
@@ -15406,9 +15641,9 @@
       </w:tcPr>
     </w:tblStylePr>
   </w:style>
-  <w:style w:type="table" w:styleId="747">
+  <w:style w:type="table" w:styleId="704">
     <w:name w:val="Grid Table 7 Colorful - Accent 1"/>
-    <w:basedOn w:val="882"/>
+    <w:basedOn w:val="839"/>
     <w:uiPriority w:val="99"/>
     <w:pPr>
       <w:pBdr/>
@@ -15660,9 +15895,9 @@
       </w:tcPr>
     </w:tblStylePr>
   </w:style>
-  <w:style w:type="table" w:styleId="748">
+  <w:style w:type="table" w:styleId="705">
     <w:name w:val="Grid Table 7 Colorful - Accent 2"/>
-    <w:basedOn w:val="882"/>
+    <w:basedOn w:val="839"/>
     <w:uiPriority w:val="99"/>
     <w:pPr>
       <w:pBdr/>
@@ -15914,9 +16149,9 @@
       </w:tcPr>
     </w:tblStylePr>
   </w:style>
-  <w:style w:type="table" w:styleId="749">
+  <w:style w:type="table" w:styleId="706">
     <w:name w:val="Grid Table 7 Colorful - Accent 3"/>
-    <w:basedOn w:val="882"/>
+    <w:basedOn w:val="839"/>
     <w:uiPriority w:val="99"/>
     <w:pPr>
       <w:pBdr/>
@@ -16168,9 +16403,9 @@
       </w:tcPr>
     </w:tblStylePr>
   </w:style>
-  <w:style w:type="table" w:styleId="750">
+  <w:style w:type="table" w:styleId="707">
     <w:name w:val="Grid Table 7 Colorful - Accent 4"/>
-    <w:basedOn w:val="882"/>
+    <w:basedOn w:val="839"/>
     <w:uiPriority w:val="99"/>
     <w:pPr>
       <w:pBdr/>
@@ -16422,9 +16657,9 @@
       </w:tcPr>
     </w:tblStylePr>
   </w:style>
-  <w:style w:type="table" w:styleId="751">
+  <w:style w:type="table" w:styleId="708">
     <w:name w:val="Grid Table 7 Colorful - Accent 5"/>
-    <w:basedOn w:val="882"/>
+    <w:basedOn w:val="839"/>
     <w:uiPriority w:val="99"/>
     <w:pPr>
       <w:pBdr/>
@@ -16676,9 +16911,9 @@
       </w:tcPr>
     </w:tblStylePr>
   </w:style>
-  <w:style w:type="table" w:styleId="752">
+  <w:style w:type="table" w:styleId="709">
     <w:name w:val="Grid Table 7 Colorful - Accent 6"/>
-    <w:basedOn w:val="882"/>
+    <w:basedOn w:val="839"/>
     <w:uiPriority w:val="99"/>
     <w:pPr>
       <w:pBdr/>
@@ -16930,9 +17165,9 @@
       </w:tcPr>
     </w:tblStylePr>
   </w:style>
-  <w:style w:type="table" w:styleId="753">
+  <w:style w:type="table" w:styleId="710">
     <w:name w:val="List Table 1 Light"/>
-    <w:basedOn w:val="882"/>
+    <w:basedOn w:val="839"/>
     <w:uiPriority w:val="99"/>
     <w:pPr>
       <w:pBdr/>
@@ -17146,9 +17381,9 @@
       </w:tcPr>
     </w:tblStylePr>
   </w:style>
-  <w:style w:type="table" w:styleId="754">
+  <w:style w:type="table" w:styleId="711">
     <w:name w:val="List Table 1 Light - Accent 1"/>
-    <w:basedOn w:val="882"/>
+    <w:basedOn w:val="839"/>
     <w:uiPriority w:val="99"/>
     <w:pPr>
       <w:pBdr/>
@@ -17362,9 +17597,9 @@
       </w:tcPr>
     </w:tblStylePr>
   </w:style>
-  <w:style w:type="table" w:styleId="755">
+  <w:style w:type="table" w:styleId="712">
     <w:name w:val="List Table 1 Light - Accent 2"/>
-    <w:basedOn w:val="882"/>
+    <w:basedOn w:val="839"/>
     <w:uiPriority w:val="99"/>
     <w:pPr>
       <w:pBdr/>
@@ -17578,9 +17813,9 @@
       </w:tcPr>
     </w:tblStylePr>
   </w:style>
-  <w:style w:type="table" w:styleId="756">
+  <w:style w:type="table" w:styleId="713">
     <w:name w:val="List Table 1 Light - Accent 3"/>
-    <w:basedOn w:val="882"/>
+    <w:basedOn w:val="839"/>
     <w:uiPriority w:val="99"/>
     <w:pPr>
       <w:pBdr/>
@@ -17794,9 +18029,9 @@
       </w:tcPr>
     </w:tblStylePr>
   </w:style>
-  <w:style w:type="table" w:styleId="757">
+  <w:style w:type="table" w:styleId="714">
     <w:name w:val="List Table 1 Light - Accent 4"/>
-    <w:basedOn w:val="882"/>
+    <w:basedOn w:val="839"/>
     <w:uiPriority w:val="99"/>
     <w:pPr>
       <w:pBdr/>
@@ -18010,9 +18245,9 @@
       </w:tcPr>
     </w:tblStylePr>
   </w:style>
-  <w:style w:type="table" w:styleId="758">
+  <w:style w:type="table" w:styleId="715">
     <w:name w:val="List Table 1 Light - Accent 5"/>
-    <w:basedOn w:val="882"/>
+    <w:basedOn w:val="839"/>
     <w:uiPriority w:val="99"/>
     <w:pPr>
       <w:pBdr/>
@@ -18226,9 +18461,9 @@
       </w:tcPr>
     </w:tblStylePr>
   </w:style>
-  <w:style w:type="table" w:styleId="759">
+  <w:style w:type="table" w:styleId="716">
     <w:name w:val="List Table 1 Light - Accent 6"/>
-    <w:basedOn w:val="882"/>
+    <w:basedOn w:val="839"/>
     <w:uiPriority w:val="99"/>
     <w:pPr>
       <w:pBdr/>
@@ -18442,9 +18677,9 @@
       </w:tcPr>
     </w:tblStylePr>
   </w:style>
-  <w:style w:type="table" w:styleId="760">
+  <w:style w:type="table" w:styleId="717">
     <w:name w:val="List Table 2"/>
-    <w:basedOn w:val="882"/>
+    <w:basedOn w:val="839"/>
     <w:uiPriority w:val="99"/>
     <w:pPr>
       <w:pBdr/>
@@ -18680,9 +18915,9 @@
       </w:tcPr>
     </w:tblStylePr>
   </w:style>
-  <w:style w:type="table" w:styleId="761">
+  <w:style w:type="table" w:styleId="718">
     <w:name w:val="List Table 2 - Accent 1"/>
-    <w:basedOn w:val="882"/>
+    <w:basedOn w:val="839"/>
     <w:uiPriority w:val="99"/>
     <w:pPr>
       <w:pBdr/>
@@ -18918,9 +19153,9 @@
       </w:tcPr>
     </w:tblStylePr>
   </w:style>
-  <w:style w:type="table" w:styleId="762">
+  <w:style w:type="table" w:styleId="719">
     <w:name w:val="List Table 2 - Accent 2"/>
-    <w:basedOn w:val="882"/>
+    <w:basedOn w:val="839"/>
     <w:uiPriority w:val="99"/>
     <w:pPr>
       <w:pBdr/>
@@ -19156,9 +19391,9 @@
       </w:tcPr>
     </w:tblStylePr>
   </w:style>
-  <w:style w:type="table" w:styleId="763">
+  <w:style w:type="table" w:styleId="720">
     <w:name w:val="List Table 2 - Accent 3"/>
-    <w:basedOn w:val="882"/>
+    <w:basedOn w:val="839"/>
     <w:uiPriority w:val="99"/>
     <w:pPr>
       <w:pBdr/>
@@ -19394,9 +19629,9 @@
       </w:tcPr>
     </w:tblStylePr>
   </w:style>
-  <w:style w:type="table" w:styleId="764">
+  <w:style w:type="table" w:styleId="721">
     <w:name w:val="List Table 2 - Accent 4"/>
-    <w:basedOn w:val="882"/>
+    <w:basedOn w:val="839"/>
     <w:uiPriority w:val="99"/>
     <w:pPr>
       <w:pBdr/>
@@ -19632,9 +19867,9 @@
       </w:tcPr>
     </w:tblStylePr>
   </w:style>
-  <w:style w:type="table" w:styleId="765">
+  <w:style w:type="table" w:styleId="722">
     <w:name w:val="List Table 2 - Accent 5"/>
-    <w:basedOn w:val="882"/>
+    <w:basedOn w:val="839"/>
     <w:uiPriority w:val="99"/>
     <w:pPr>
       <w:pBdr/>
@@ -19870,9 +20105,9 @@
       </w:tcPr>
     </w:tblStylePr>
   </w:style>
-  <w:style w:type="table" w:styleId="766">
+  <w:style w:type="table" w:styleId="723">
     <w:name w:val="List Table 2 - Accent 6"/>
-    <w:basedOn w:val="882"/>
+    <w:basedOn w:val="839"/>
     <w:uiPriority w:val="99"/>
     <w:pPr>
       <w:pBdr/>
@@ -20108,9 +20343,9 @@
       </w:tcPr>
     </w:tblStylePr>
   </w:style>
-  <w:style w:type="table" w:styleId="767">
+  <w:style w:type="table" w:styleId="724">
     <w:name w:val="List Table 3"/>
-    <w:basedOn w:val="882"/>
+    <w:basedOn w:val="839"/>
     <w:uiPriority w:val="99"/>
     <w:pPr>
       <w:pBdr/>
@@ -20336,9 +20571,9 @@
       </w:tcPr>
     </w:tblStylePr>
   </w:style>
-  <w:style w:type="table" w:styleId="768">
+  <w:style w:type="table" w:styleId="725">
     <w:name w:val="List Table 3 - Accent 1"/>
-    <w:basedOn w:val="882"/>
+    <w:basedOn w:val="839"/>
     <w:uiPriority w:val="99"/>
     <w:pPr>
       <w:pBdr/>
@@ -20564,9 +20799,9 @@
       </w:tcPr>
     </w:tblStylePr>
   </w:style>
-  <w:style w:type="table" w:styleId="769">
+  <w:style w:type="table" w:styleId="726">
     <w:name w:val="List Table 3 - Accent 2"/>
-    <w:basedOn w:val="882"/>
+    <w:basedOn w:val="839"/>
     <w:uiPriority w:val="99"/>
     <w:pPr>
       <w:pBdr/>
@@ -20792,9 +21027,9 @@
       </w:tcPr>
     </w:tblStylePr>
   </w:style>
-  <w:style w:type="table" w:styleId="770">
+  <w:style w:type="table" w:styleId="727">
     <w:name w:val="List Table 3 - Accent 3"/>
-    <w:basedOn w:val="882"/>
+    <w:basedOn w:val="839"/>
     <w:uiPriority w:val="99"/>
     <w:pPr>
       <w:pBdr/>
@@ -21020,9 +21255,9 @@
       </w:tcPr>
     </w:tblStylePr>
   </w:style>
-  <w:style w:type="table" w:styleId="771">
+  <w:style w:type="table" w:styleId="728">
     <w:name w:val="List Table 3 - Accent 4"/>
-    <w:basedOn w:val="882"/>
+    <w:basedOn w:val="839"/>
     <w:uiPriority w:val="99"/>
     <w:pPr>
       <w:pBdr/>
@@ -21248,9 +21483,9 @@
       </w:tcPr>
     </w:tblStylePr>
   </w:style>
-  <w:style w:type="table" w:styleId="772">
+  <w:style w:type="table" w:styleId="729">
     <w:name w:val="List Table 3 - Accent 5"/>
-    <w:basedOn w:val="882"/>
+    <w:basedOn w:val="839"/>
     <w:uiPriority w:val="99"/>
     <w:pPr>
       <w:pBdr/>
@@ -21476,9 +21711,9 @@
       </w:tcPr>
     </w:tblStylePr>
   </w:style>
-  <w:style w:type="table" w:styleId="773">
+  <w:style w:type="table" w:styleId="730">
     <w:name w:val="List Table 3 - Accent 6"/>
-    <w:basedOn w:val="882"/>
+    <w:basedOn w:val="839"/>
     <w:uiPriority w:val="99"/>
     <w:pPr>
       <w:pBdr/>
@@ -21704,9 +21939,9 @@
       </w:tcPr>
     </w:tblStylePr>
   </w:style>
-  <w:style w:type="table" w:styleId="774">
+  <w:style w:type="table" w:styleId="731">
     <w:name w:val="List Table 4"/>
-    <w:basedOn w:val="882"/>
+    <w:basedOn w:val="839"/>
     <w:uiPriority w:val="99"/>
     <w:pPr>
       <w:pBdr/>
@@ -21929,9 +22164,9 @@
       </w:tcPr>
     </w:tblStylePr>
   </w:style>
-  <w:style w:type="table" w:styleId="775">
+  <w:style w:type="table" w:styleId="732">
     <w:name w:val="List Table 4 - Accent 1"/>
-    <w:basedOn w:val="882"/>
+    <w:basedOn w:val="839"/>
     <w:uiPriority w:val="99"/>
     <w:pPr>
       <w:pBdr/>
@@ -22154,9 +22389,9 @@
       </w:tcPr>
     </w:tblStylePr>
   </w:style>
-  <w:style w:type="table" w:styleId="776">
+  <w:style w:type="table" w:styleId="733">
     <w:name w:val="List Table 4 - Accent 2"/>
-    <w:basedOn w:val="882"/>
+    <w:basedOn w:val="839"/>
     <w:uiPriority w:val="99"/>
     <w:pPr>
       <w:pBdr/>
@@ -22379,9 +22614,9 @@
       </w:tcPr>
     </w:tblStylePr>
   </w:style>
-  <w:style w:type="table" w:styleId="777">
+  <w:style w:type="table" w:styleId="734">
     <w:name w:val="List Table 4 - Accent 3"/>
-    <w:basedOn w:val="882"/>
+    <w:basedOn w:val="839"/>
     <w:uiPriority w:val="99"/>
     <w:pPr>
       <w:pBdr/>
@@ -22604,9 +22839,9 @@
       </w:tcPr>
     </w:tblStylePr>
   </w:style>
-  <w:style w:type="table" w:styleId="778">
+  <w:style w:type="table" w:styleId="735">
     <w:name w:val="List Table 4 - Accent 4"/>
-    <w:basedOn w:val="882"/>
+    <w:basedOn w:val="839"/>
     <w:uiPriority w:val="99"/>
     <w:pPr>
       <w:pBdr/>
@@ -22829,9 +23064,9 @@
       </w:tcPr>
     </w:tblStylePr>
   </w:style>
-  <w:style w:type="table" w:styleId="779">
+  <w:style w:type="table" w:styleId="736">
     <w:name w:val="List Table 4 - Accent 5"/>
-    <w:basedOn w:val="882"/>
+    <w:basedOn w:val="839"/>
     <w:uiPriority w:val="99"/>
     <w:pPr>
       <w:pBdr/>
@@ -23054,9 +23289,9 @@
       </w:tcPr>
     </w:tblStylePr>
   </w:style>
-  <w:style w:type="table" w:styleId="780">
+  <w:style w:type="table" w:styleId="737">
     <w:name w:val="List Table 4 - Accent 6"/>
-    <w:basedOn w:val="882"/>
+    <w:basedOn w:val="839"/>
     <w:uiPriority w:val="99"/>
     <w:pPr>
       <w:pBdr/>
@@ -23279,9 +23514,9 @@
       </w:tcPr>
     </w:tblStylePr>
   </w:style>
-  <w:style w:type="table" w:styleId="781">
+  <w:style w:type="table" w:styleId="738">
     <w:name w:val="List Table 5 Dark"/>
-    <w:basedOn w:val="882"/>
+    <w:basedOn w:val="839"/>
     <w:uiPriority w:val="99"/>
     <w:pPr>
       <w:pBdr/>
@@ -23521,9 +23756,9 @@
       </w:tcPr>
     </w:tblStylePr>
   </w:style>
-  <w:style w:type="table" w:styleId="782">
+  <w:style w:type="table" w:styleId="739">
     <w:name w:val="List Table 5 Dark - Accent 1"/>
-    <w:basedOn w:val="882"/>
+    <w:basedOn w:val="839"/>
     <w:uiPriority w:val="99"/>
     <w:pPr>
       <w:pBdr/>
@@ -23763,9 +23998,9 @@
       </w:tcPr>
     </w:tblStylePr>
   </w:style>
-  <w:style w:type="table" w:styleId="783">
+  <w:style w:type="table" w:styleId="740">
     <w:name w:val="List Table 5 Dark - Accent 2"/>
-    <w:basedOn w:val="882"/>
+    <w:basedOn w:val="839"/>
     <w:uiPriority w:val="99"/>
     <w:pPr>
       <w:pBdr/>
@@ -24005,9 +24240,9 @@
       </w:tcPr>
     </w:tblStylePr>
   </w:style>
-  <w:style w:type="table" w:styleId="784">
+  <w:style w:type="table" w:styleId="741">
     <w:name w:val="List Table 5 Dark - Accent 3"/>
-    <w:basedOn w:val="882"/>
+    <w:basedOn w:val="839"/>
     <w:uiPriority w:val="99"/>
     <w:pPr>
       <w:pBdr/>
@@ -24247,9 +24482,9 @@
       </w:tcPr>
     </w:tblStylePr>
   </w:style>
-  <w:style w:type="table" w:styleId="785">
+  <w:style w:type="table" w:styleId="742">
     <w:name w:val="List Table 5 Dark - Accent 4"/>
-    <w:basedOn w:val="882"/>
+    <w:basedOn w:val="839"/>
     <w:uiPriority w:val="99"/>
     <w:pPr>
       <w:pBdr/>
@@ -24489,9 +24724,9 @@
       </w:tcPr>
     </w:tblStylePr>
   </w:style>
-  <w:style w:type="table" w:styleId="786">
+  <w:style w:type="table" w:styleId="743">
     <w:name w:val="List Table 5 Dark - Accent 5"/>
-    <w:basedOn w:val="882"/>
+    <w:basedOn w:val="839"/>
     <w:uiPriority w:val="99"/>
     <w:pPr>
       <w:pBdr/>
@@ -24731,9 +24966,9 @@
       </w:tcPr>
     </w:tblStylePr>
   </w:style>
-  <w:style w:type="table" w:styleId="787">
+  <w:style w:type="table" w:styleId="744">
     <w:name w:val="List Table 5 Dark - Accent 6"/>
-    <w:basedOn w:val="882"/>
+    <w:basedOn w:val="839"/>
     <w:uiPriority w:val="99"/>
     <w:pPr>
       <w:pBdr/>
@@ -24973,9 +25208,9 @@
       </w:tcPr>
     </w:tblStylePr>
   </w:style>
-  <w:style w:type="table" w:styleId="788">
+  <w:style w:type="table" w:styleId="745">
     <w:name w:val="List Table 6 Colorful"/>
-    <w:basedOn w:val="882"/>
+    <w:basedOn w:val="839"/>
     <w:uiPriority w:val="99"/>
     <w:pPr>
       <w:pBdr/>
@@ -25196,9 +25431,9 @@
       </w:tcPr>
     </w:tblStylePr>
   </w:style>
-  <w:style w:type="table" w:styleId="789">
+  <w:style w:type="table" w:styleId="746">
     <w:name w:val="List Table 6 Colorful - Accent 1"/>
-    <w:basedOn w:val="882"/>
+    <w:basedOn w:val="839"/>
     <w:uiPriority w:val="99"/>
     <w:pPr>
       <w:pBdr/>
@@ -25419,9 +25654,9 @@
       </w:tcPr>
     </w:tblStylePr>
   </w:style>
-  <w:style w:type="table" w:styleId="790">
+  <w:style w:type="table" w:styleId="747">
     <w:name w:val="List Table 6 Colorful - Accent 2"/>
-    <w:basedOn w:val="882"/>
+    <w:basedOn w:val="839"/>
     <w:uiPriority w:val="99"/>
     <w:pPr>
       <w:pBdr/>
@@ -25642,9 +25877,9 @@
       </w:tcPr>
     </w:tblStylePr>
   </w:style>
-  <w:style w:type="table" w:styleId="791">
+  <w:style w:type="table" w:styleId="748">
     <w:name w:val="List Table 6 Colorful - Accent 3"/>
-    <w:basedOn w:val="882"/>
+    <w:basedOn w:val="839"/>
     <w:uiPriority w:val="99"/>
     <w:pPr>
       <w:pBdr/>
@@ -25865,9 +26100,9 @@
       </w:tcPr>
     </w:tblStylePr>
   </w:style>
-  <w:style w:type="table" w:styleId="792">
+  <w:style w:type="table" w:styleId="749">
     <w:name w:val="List Table 6 Colorful - Accent 4"/>
-    <w:basedOn w:val="882"/>
+    <w:basedOn w:val="839"/>
     <w:uiPriority w:val="99"/>
     <w:pPr>
       <w:pBdr/>
@@ -26088,9 +26323,9 @@
       </w:tcPr>
     </w:tblStylePr>
   </w:style>
-  <w:style w:type="table" w:styleId="793">
+  <w:style w:type="table" w:styleId="750">
     <w:name w:val="List Table 6 Colorful - Accent 5"/>
-    <w:basedOn w:val="882"/>
+    <w:basedOn w:val="839"/>
     <w:uiPriority w:val="99"/>
     <w:pPr>
       <w:pBdr/>
@@ -26311,9 +26546,9 @@
       </w:tcPr>
     </w:tblStylePr>
   </w:style>
-  <w:style w:type="table" w:styleId="794">
+  <w:style w:type="table" w:styleId="751">
     <w:name w:val="List Table 6 Colorful - Accent 6"/>
-    <w:basedOn w:val="882"/>
+    <w:basedOn w:val="839"/>
     <w:uiPriority w:val="99"/>
     <w:pPr>
       <w:pBdr/>
@@ -26534,9 +26769,9 @@
       </w:tcPr>
     </w:tblStylePr>
   </w:style>
-  <w:style w:type="table" w:styleId="795">
+  <w:style w:type="table" w:styleId="752">
     <w:name w:val="List Table 7 Colorful"/>
-    <w:basedOn w:val="882"/>
+    <w:basedOn w:val="839"/>
     <w:uiPriority w:val="99"/>
     <w:pPr>
       <w:pBdr/>
@@ -26790,9 +27025,9 @@
       </w:tcPr>
     </w:tblStylePr>
   </w:style>
-  <w:style w:type="table" w:styleId="796">
+  <w:style w:type="table" w:styleId="753">
     <w:name w:val="List Table 7 Colorful - Accent 1"/>
-    <w:basedOn w:val="882"/>
+    <w:basedOn w:val="839"/>
     <w:uiPriority w:val="99"/>
     <w:pPr>
       <w:pBdr/>
@@ -27046,9 +27281,9 @@
       </w:tcPr>
     </w:tblStylePr>
   </w:style>
-  <w:style w:type="table" w:styleId="797">
+  <w:style w:type="table" w:styleId="754">
     <w:name w:val="List Table 7 Colorful - Accent 2"/>
-    <w:basedOn w:val="882"/>
+    <w:basedOn w:val="839"/>
     <w:uiPriority w:val="99"/>
     <w:pPr>
       <w:pBdr/>
@@ -27302,9 +27537,9 @@
       </w:tcPr>
     </w:tblStylePr>
   </w:style>
-  <w:style w:type="table" w:styleId="798">
+  <w:style w:type="table" w:styleId="755">
     <w:name w:val="List Table 7 Colorful - Accent 3"/>
-    <w:basedOn w:val="882"/>
+    <w:basedOn w:val="839"/>
     <w:uiPriority w:val="99"/>
     <w:pPr>
       <w:pBdr/>
@@ -27558,9 +27793,9 @@
       </w:tcPr>
     </w:tblStylePr>
   </w:style>
-  <w:style w:type="table" w:styleId="799">
+  <w:style w:type="table" w:styleId="756">
     <w:name w:val="List Table 7 Colorful - Accent 4"/>
-    <w:basedOn w:val="882"/>
+    <w:basedOn w:val="839"/>
     <w:uiPriority w:val="99"/>
     <w:pPr>
       <w:pBdr/>
@@ -27814,9 +28049,9 @@
       </w:tcPr>
     </w:tblStylePr>
   </w:style>
-  <w:style w:type="table" w:styleId="800">
+  <w:style w:type="table" w:styleId="757">
     <w:name w:val="List Table 7 Colorful - Accent 5"/>
-    <w:basedOn w:val="882"/>
+    <w:basedOn w:val="839"/>
     <w:uiPriority w:val="99"/>
     <w:pPr>
       <w:pBdr/>
@@ -28070,9 +28305,9 @@
       </w:tcPr>
     </w:tblStylePr>
   </w:style>
-  <w:style w:type="table" w:styleId="801">
+  <w:style w:type="table" w:styleId="758">
     <w:name w:val="List Table 7 Colorful - Accent 6"/>
-    <w:basedOn w:val="882"/>
+    <w:basedOn w:val="839"/>
     <w:uiPriority w:val="99"/>
     <w:pPr>
       <w:pBdr/>
@@ -28326,9 +28561,9 @@
       </w:tcPr>
     </w:tblStylePr>
   </w:style>
-  <w:style w:type="table" w:styleId="802">
+  <w:style w:type="table" w:styleId="759">
     <w:name w:val="Lined - Accent"/>
-    <w:basedOn w:val="882"/>
+    <w:basedOn w:val="839"/>
     <w:uiPriority w:val="99"/>
     <w:pPr>
       <w:pBdr/>
@@ -28563,9 +28798,9 @@
       </w:tcPr>
     </w:tblStylePr>
   </w:style>
-  <w:style w:type="table" w:styleId="803">
+  <w:style w:type="table" w:styleId="760">
     <w:name w:val="Lined - Accent 1"/>
-    <w:basedOn w:val="882"/>
+    <w:basedOn w:val="839"/>
     <w:uiPriority w:val="99"/>
     <w:pPr>
       <w:pBdr/>
@@ -28800,9 +29035,9 @@
       </w:tcPr>
     </w:tblStylePr>
   </w:style>
-  <w:style w:type="table" w:styleId="804">
+  <w:style w:type="table" w:styleId="761">
     <w:name w:val="Lined - Accent 2"/>
-    <w:basedOn w:val="882"/>
+    <w:basedOn w:val="839"/>
     <w:uiPriority w:val="99"/>
     <w:pPr>
       <w:pBdr/>
@@ -29037,9 +29272,9 @@
       </w:tcPr>
     </w:tblStylePr>
   </w:style>
-  <w:style w:type="table" w:styleId="805">
+  <w:style w:type="table" w:styleId="762">
     <w:name w:val="Lined - Accent 3"/>
-    <w:basedOn w:val="882"/>
+    <w:basedOn w:val="839"/>
     <w:uiPriority w:val="99"/>
     <w:pPr>
       <w:pBdr/>
@@ -29274,9 +29509,9 @@
       </w:tcPr>
     </w:tblStylePr>
   </w:style>
-  <w:style w:type="table" w:styleId="806">
+  <w:style w:type="table" w:styleId="763">
     <w:name w:val="Lined - Accent 4"/>
-    <w:basedOn w:val="882"/>
+    <w:basedOn w:val="839"/>
     <w:uiPriority w:val="99"/>
     <w:pPr>
       <w:pBdr/>
@@ -29511,9 +29746,9 @@
       </w:tcPr>
     </w:tblStylePr>
   </w:style>
-  <w:style w:type="table" w:styleId="807">
+  <w:style w:type="table" w:styleId="764">
     <w:name w:val="Lined - Accent 5"/>
-    <w:basedOn w:val="882"/>
+    <w:basedOn w:val="839"/>
     <w:uiPriority w:val="99"/>
     <w:pPr>
       <w:pBdr/>
@@ -29748,9 +29983,9 @@
       </w:tcPr>
     </w:tblStylePr>
   </w:style>
-  <w:style w:type="table" w:styleId="808">
+  <w:style w:type="table" w:styleId="765">
     <w:name w:val="Lined - Accent 6"/>
-    <w:basedOn w:val="882"/>
+    <w:basedOn w:val="839"/>
     <w:uiPriority w:val="99"/>
     <w:pPr>
       <w:pBdr/>
@@ -29985,9 +30220,9 @@
       </w:tcPr>
     </w:tblStylePr>
   </w:style>
-  <w:style w:type="table" w:styleId="809">
+  <w:style w:type="table" w:styleId="766">
     <w:name w:val="Bordered &amp; Lined - Accent"/>
-    <w:basedOn w:val="882"/>
+    <w:basedOn w:val="839"/>
     <w:uiPriority w:val="99"/>
     <w:pPr>
       <w:pBdr/>
@@ -30229,9 +30464,9 @@
       </w:tcPr>
     </w:tblStylePr>
   </w:style>
-  <w:style w:type="table" w:styleId="810">
+  <w:style w:type="table" w:styleId="767">
     <w:name w:val="Bordered &amp; Lined - Accent 1"/>
-    <w:basedOn w:val="882"/>
+    <w:basedOn w:val="839"/>
     <w:uiPriority w:val="99"/>
     <w:pPr>
       <w:pBdr/>
@@ -30473,9 +30708,9 @@
       </w:tcPr>
     </w:tblStylePr>
   </w:style>
-  <w:style w:type="table" w:styleId="811">
+  <w:style w:type="table" w:styleId="768">
     <w:name w:val="Bordered &amp; Lined - Accent 2"/>
-    <w:basedOn w:val="882"/>
+    <w:basedOn w:val="839"/>
     <w:uiPriority w:val="99"/>
     <w:pPr>
       <w:pBdr/>
@@ -30717,9 +30952,9 @@
       </w:tcPr>
     </w:tblStylePr>
   </w:style>
-  <w:style w:type="table" w:styleId="812">
+  <w:style w:type="table" w:styleId="769">
     <w:name w:val="Bordered &amp; Lined - Accent 3"/>
-    <w:basedOn w:val="882"/>
+    <w:basedOn w:val="839"/>
     <w:uiPriority w:val="99"/>
     <w:pPr>
       <w:pBdr/>
@@ -30961,9 +31196,9 @@
       </w:tcPr>
     </w:tblStylePr>
   </w:style>
-  <w:style w:type="table" w:styleId="813">
+  <w:style w:type="table" w:styleId="770">
     <w:name w:val="Bordered &amp; Lined - Accent 4"/>
-    <w:basedOn w:val="882"/>
+    <w:basedOn w:val="839"/>
     <w:uiPriority w:val="99"/>
     <w:pPr>
       <w:pBdr/>
@@ -31205,9 +31440,9 @@
       </w:tcPr>
     </w:tblStylePr>
   </w:style>
-  <w:style w:type="table" w:styleId="814">
+  <w:style w:type="table" w:styleId="771">
     <w:name w:val="Bordered &amp; Lined - Accent 5"/>
-    <w:basedOn w:val="882"/>
+    <w:basedOn w:val="839"/>
     <w:uiPriority w:val="99"/>
     <w:pPr>
       <w:pBdr/>
@@ -31449,9 +31684,9 @@
       </w:tcPr>
     </w:tblStylePr>
   </w:style>
-  <w:style w:type="table" w:styleId="815">
+  <w:style w:type="table" w:styleId="772">
     <w:name w:val="Bordered &amp; Lined - Accent 6"/>
-    <w:basedOn w:val="882"/>
+    <w:basedOn w:val="839"/>
     <w:uiPriority w:val="99"/>
     <w:pPr>
       <w:pBdr/>
@@ -31693,9 +31928,9 @@
       </w:tcPr>
     </w:tblStylePr>
   </w:style>
-  <w:style w:type="table" w:styleId="816">
+  <w:style w:type="table" w:styleId="773">
     <w:name w:val="Bordered"/>
-    <w:basedOn w:val="882"/>
+    <w:basedOn w:val="839"/>
     <w:uiPriority w:val="99"/>
     <w:pPr>
       <w:pBdr/>
@@ -31924,9 +32159,9 @@
       </w:tcPr>
     </w:tblStylePr>
   </w:style>
-  <w:style w:type="table" w:styleId="817">
+  <w:style w:type="table" w:styleId="774">
     <w:name w:val="Bordered - Accent 1"/>
-    <w:basedOn w:val="882"/>
+    <w:basedOn w:val="839"/>
     <w:uiPriority w:val="99"/>
     <w:pPr>
       <w:pBdr/>
@@ -32155,9 +32390,9 @@
       </w:tcPr>
     </w:tblStylePr>
   </w:style>
-  <w:style w:type="table" w:styleId="818">
+  <w:style w:type="table" w:styleId="775">
     <w:name w:val="Bordered - Accent 2"/>
-    <w:basedOn w:val="882"/>
+    <w:basedOn w:val="839"/>
     <w:uiPriority w:val="99"/>
     <w:pPr>
       <w:pBdr/>
@@ -32386,9 +32621,9 @@
       </w:tcPr>
     </w:tblStylePr>
   </w:style>
-  <w:style w:type="table" w:styleId="819">
+  <w:style w:type="table" w:styleId="776">
     <w:name w:val="Bordered - Accent 3"/>
-    <w:basedOn w:val="882"/>
+    <w:basedOn w:val="839"/>
     <w:uiPriority w:val="99"/>
     <w:pPr>
       <w:pBdr/>
@@ -32617,9 +32852,9 @@
       </w:tcPr>
     </w:tblStylePr>
   </w:style>
-  <w:style w:type="table" w:styleId="820">
+  <w:style w:type="table" w:styleId="777">
     <w:name w:val="Bordered - Accent 4"/>
-    <w:basedOn w:val="882"/>
+    <w:basedOn w:val="839"/>
     <w:uiPriority w:val="99"/>
     <w:pPr>
       <w:pBdr/>
@@ -32848,9 +33083,9 @@
       </w:tcPr>
     </w:tblStylePr>
   </w:style>
-  <w:style w:type="table" w:styleId="821">
+  <w:style w:type="table" w:styleId="778">
     <w:name w:val="Bordered - Accent 5"/>
-    <w:basedOn w:val="882"/>
+    <w:basedOn w:val="839"/>
     <w:uiPriority w:val="99"/>
     <w:pPr>
       <w:pBdr/>
@@ -33079,9 +33314,9 @@
       </w:tcPr>
     </w:tblStylePr>
   </w:style>
-  <w:style w:type="table" w:styleId="822">
+  <w:style w:type="table" w:styleId="779">
     <w:name w:val="Bordered - Accent 6"/>
-    <w:basedOn w:val="882"/>
+    <w:basedOn w:val="839"/>
     <w:uiPriority w:val="99"/>
     <w:pPr>
       <w:pBdr/>
@@ -33310,11 +33545,11 @@
       </w:tcPr>
     </w:tblStylePr>
   </w:style>
-  <w:style w:type="paragraph" w:styleId="823">
+  <w:style w:type="paragraph" w:styleId="780">
     <w:name w:val="Heading 1"/>
-    <w:basedOn w:val="881"/>
-    <w:next w:val="881"/>
-    <w:link w:val="833"/>
+    <w:basedOn w:val="838"/>
+    <w:next w:val="838"/>
+    <w:link w:val="790"/>
     <w:uiPriority w:val="9"/>
     <w:qFormat/>
     <w:pPr>
@@ -33332,11 +33567,11 @@
       <w:szCs w:val="40"/>
     </w:rPr>
   </w:style>
-  <w:style w:type="paragraph" w:styleId="824">
+  <w:style w:type="paragraph" w:styleId="781">
     <w:name w:val="Heading 2"/>
-    <w:basedOn w:val="881"/>
-    <w:next w:val="881"/>
-    <w:link w:val="834"/>
+    <w:basedOn w:val="838"/>
+    <w:next w:val="838"/>
+    <w:link w:val="791"/>
     <w:uiPriority w:val="9"/>
     <w:unhideWhenUsed/>
     <w:qFormat/>
@@ -33355,11 +33590,11 @@
       <w:szCs w:val="32"/>
     </w:rPr>
   </w:style>
-  <w:style w:type="paragraph" w:styleId="825">
+  <w:style w:type="paragraph" w:styleId="782">
     <w:name w:val="Heading 3"/>
-    <w:basedOn w:val="881"/>
-    <w:next w:val="881"/>
-    <w:link w:val="835"/>
+    <w:basedOn w:val="838"/>
+    <w:next w:val="838"/>
+    <w:link w:val="792"/>
     <w:uiPriority w:val="9"/>
     <w:unhideWhenUsed/>
     <w:qFormat/>
@@ -33378,11 +33613,11 @@
       <w:szCs w:val="28"/>
     </w:rPr>
   </w:style>
-  <w:style w:type="paragraph" w:styleId="826">
+  <w:style w:type="paragraph" w:styleId="783">
     <w:name w:val="Heading 4"/>
-    <w:basedOn w:val="881"/>
-    <w:next w:val="881"/>
-    <w:link w:val="836"/>
+    <w:basedOn w:val="838"/>
+    <w:next w:val="838"/>
+    <w:link w:val="793"/>
     <w:uiPriority w:val="9"/>
     <w:unhideWhenUsed/>
     <w:qFormat/>
@@ -33401,11 +33636,11 @@
       <w:color w:val="0f4761" w:themeColor="accent1" w:themeShade="BF"/>
     </w:rPr>
   </w:style>
-  <w:style w:type="paragraph" w:styleId="827">
+  <w:style w:type="paragraph" w:styleId="784">
     <w:name w:val="Heading 5"/>
-    <w:basedOn w:val="881"/>
-    <w:next w:val="881"/>
-    <w:link w:val="837"/>
+    <w:basedOn w:val="838"/>
+    <w:next w:val="838"/>
+    <w:link w:val="794"/>
     <w:uiPriority w:val="9"/>
     <w:unhideWhenUsed/>
     <w:qFormat/>
@@ -33422,11 +33657,11 @@
       <w:color w:val="0f4761" w:themeColor="accent1" w:themeShade="BF"/>
     </w:rPr>
   </w:style>
-  <w:style w:type="paragraph" w:styleId="828">
+  <w:style w:type="paragraph" w:styleId="785">
     <w:name w:val="Heading 6"/>
-    <w:basedOn w:val="881"/>
-    <w:next w:val="881"/>
-    <w:link w:val="838"/>
+    <w:basedOn w:val="838"/>
+    <w:next w:val="838"/>
+    <w:link w:val="795"/>
     <w:uiPriority w:val="9"/>
     <w:unhideWhenUsed/>
     <w:qFormat/>
@@ -33445,11 +33680,11 @@
       <w:color w:val="595959" w:themeColor="text1" w:themeTint="A6"/>
     </w:rPr>
   </w:style>
-  <w:style w:type="paragraph" w:styleId="829">
+  <w:style w:type="paragraph" w:styleId="786">
     <w:name w:val="Heading 7"/>
-    <w:basedOn w:val="881"/>
-    <w:next w:val="881"/>
-    <w:link w:val="839"/>
+    <w:basedOn w:val="838"/>
+    <w:next w:val="838"/>
+    <w:link w:val="796"/>
     <w:uiPriority w:val="9"/>
     <w:unhideWhenUsed/>
     <w:qFormat/>
@@ -33466,11 +33701,11 @@
       <w:color w:val="595959" w:themeColor="text1" w:themeTint="A6"/>
     </w:rPr>
   </w:style>
-  <w:style w:type="paragraph" w:styleId="830">
+  <w:style w:type="paragraph" w:styleId="787">
     <w:name w:val="Heading 8"/>
-    <w:basedOn w:val="881"/>
-    <w:next w:val="881"/>
-    <w:link w:val="840"/>
+    <w:basedOn w:val="838"/>
+    <w:next w:val="838"/>
+    <w:link w:val="797"/>
     <w:uiPriority w:val="9"/>
     <w:unhideWhenUsed/>
     <w:qFormat/>
@@ -33489,11 +33724,11 @@
       <w:color w:val="272727" w:themeColor="text1" w:themeTint="D8"/>
     </w:rPr>
   </w:style>
-  <w:style w:type="paragraph" w:styleId="831">
+  <w:style w:type="paragraph" w:styleId="788">
     <w:name w:val="Heading 9"/>
-    <w:basedOn w:val="881"/>
-    <w:next w:val="881"/>
-    <w:link w:val="841"/>
+    <w:basedOn w:val="838"/>
+    <w:next w:val="838"/>
+    <w:link w:val="798"/>
     <w:uiPriority w:val="9"/>
     <w:unhideWhenUsed/>
     <w:qFormat/>
@@ -33512,7 +33747,7 @@
       <w:color w:val="272727" w:themeColor="text1" w:themeTint="D8"/>
     </w:rPr>
   </w:style>
-  <w:style w:type="character" w:styleId="832" w:default="1">
+  <w:style w:type="character" w:styleId="789" w:default="1">
     <w:name w:val="Default Paragraph Font"/>
     <w:uiPriority w:val="1"/>
     <w:semiHidden/>
@@ -33523,10 +33758,10 @@
       <w:ind/>
     </w:pPr>
   </w:style>
-  <w:style w:type="character" w:styleId="833">
+  <w:style w:type="character" w:styleId="790">
     <w:name w:val="Heading 1 Char"/>
-    <w:basedOn w:val="832"/>
-    <w:link w:val="823"/>
+    <w:basedOn w:val="789"/>
+    <w:link w:val="780"/>
     <w:uiPriority w:val="9"/>
     <w:pPr>
       <w:pBdr/>
@@ -33540,10 +33775,10 @@
       <w:szCs w:val="40"/>
     </w:rPr>
   </w:style>
-  <w:style w:type="character" w:styleId="834">
+  <w:style w:type="character" w:styleId="791">
     <w:name w:val="Heading 2 Char"/>
-    <w:basedOn w:val="832"/>
-    <w:link w:val="824"/>
+    <w:basedOn w:val="789"/>
+    <w:link w:val="781"/>
     <w:uiPriority w:val="9"/>
     <w:pPr>
       <w:pBdr/>
@@ -33557,10 +33792,10 @@
       <w:szCs w:val="32"/>
     </w:rPr>
   </w:style>
-  <w:style w:type="character" w:styleId="835">
+  <w:style w:type="character" w:styleId="792">
     <w:name w:val="Heading 3 Char"/>
-    <w:basedOn w:val="832"/>
-    <w:link w:val="825"/>
+    <w:basedOn w:val="789"/>
+    <w:link w:val="782"/>
     <w:uiPriority w:val="9"/>
     <w:pPr>
       <w:pBdr/>
@@ -33574,10 +33809,10 @@
       <w:szCs w:val="28"/>
     </w:rPr>
   </w:style>
-  <w:style w:type="character" w:styleId="836">
+  <w:style w:type="character" w:styleId="793">
     <w:name w:val="Heading 4 Char"/>
-    <w:basedOn w:val="832"/>
-    <w:link w:val="826"/>
+    <w:basedOn w:val="789"/>
+    <w:link w:val="783"/>
     <w:uiPriority w:val="9"/>
     <w:pPr>
       <w:pBdr/>
@@ -33591,10 +33826,10 @@
       <w:color w:val="0f4761" w:themeColor="accent1" w:themeShade="BF"/>
     </w:rPr>
   </w:style>
-  <w:style w:type="character" w:styleId="837">
+  <w:style w:type="character" w:styleId="794">
     <w:name w:val="Heading 5 Char"/>
-    <w:basedOn w:val="832"/>
-    <w:link w:val="827"/>
+    <w:basedOn w:val="789"/>
+    <w:link w:val="784"/>
     <w:uiPriority w:val="9"/>
     <w:pPr>
       <w:pBdr/>
@@ -33606,10 +33841,10 @@
       <w:color w:val="0f4761" w:themeColor="accent1" w:themeShade="BF"/>
     </w:rPr>
   </w:style>
-  <w:style w:type="character" w:styleId="838">
+  <w:style w:type="character" w:styleId="795">
     <w:name w:val="Heading 6 Char"/>
-    <w:basedOn w:val="832"/>
-    <w:link w:val="828"/>
+    <w:basedOn w:val="789"/>
+    <w:link w:val="785"/>
     <w:uiPriority w:val="9"/>
     <w:pPr>
       <w:pBdr/>
@@ -33623,10 +33858,10 @@
       <w:color w:val="595959" w:themeColor="text1" w:themeTint="A6"/>
     </w:rPr>
   </w:style>
-  <w:style w:type="character" w:styleId="839">
+  <w:style w:type="character" w:styleId="796">
     <w:name w:val="Heading 7 Char"/>
-    <w:basedOn w:val="832"/>
-    <w:link w:val="829"/>
+    <w:basedOn w:val="789"/>
+    <w:link w:val="786"/>
     <w:uiPriority w:val="9"/>
     <w:pPr>
       <w:pBdr/>
@@ -33638,10 +33873,10 @@
       <w:color w:val="595959" w:themeColor="text1" w:themeTint="A6"/>
     </w:rPr>
   </w:style>
-  <w:style w:type="character" w:styleId="840">
+  <w:style w:type="character" w:styleId="797">
     <w:name w:val="Heading 8 Char"/>
-    <w:basedOn w:val="832"/>
-    <w:link w:val="830"/>
+    <w:basedOn w:val="789"/>
+    <w:link w:val="787"/>
     <w:uiPriority w:val="9"/>
     <w:pPr>
       <w:pBdr/>
@@ -33655,10 +33890,10 @@
       <w:color w:val="272727" w:themeColor="text1" w:themeTint="D8"/>
     </w:rPr>
   </w:style>
-  <w:style w:type="character" w:styleId="841">
+  <w:style w:type="character" w:styleId="798">
     <w:name w:val="Heading 9 Char"/>
-    <w:basedOn w:val="832"/>
-    <w:link w:val="831"/>
+    <w:basedOn w:val="789"/>
+    <w:link w:val="788"/>
     <w:uiPriority w:val="9"/>
     <w:pPr>
       <w:pBdr/>
@@ -33672,11 +33907,11 @@
       <w:color w:val="272727" w:themeColor="text1" w:themeTint="D8"/>
     </w:rPr>
   </w:style>
-  <w:style w:type="paragraph" w:styleId="842">
+  <w:style w:type="paragraph" w:styleId="799">
     <w:name w:val="Title"/>
-    <w:basedOn w:val="881"/>
-    <w:next w:val="881"/>
-    <w:link w:val="843"/>
+    <w:basedOn w:val="838"/>
+    <w:next w:val="838"/>
+    <w:link w:val="800"/>
     <w:uiPriority w:val="10"/>
     <w:qFormat/>
     <w:pPr>
@@ -33692,10 +33927,10 @@
       <w:szCs w:val="56"/>
     </w:rPr>
   </w:style>
-  <w:style w:type="character" w:styleId="843">
+  <w:style w:type="character" w:styleId="800">
     <w:name w:val="Title Char"/>
-    <w:basedOn w:val="832"/>
-    <w:link w:val="842"/>
+    <w:basedOn w:val="789"/>
+    <w:link w:val="799"/>
     <w:uiPriority w:val="10"/>
     <w:pPr>
       <w:pBdr/>
@@ -33709,11 +33944,11 @@
       <w:szCs w:val="56"/>
     </w:rPr>
   </w:style>
-  <w:style w:type="paragraph" w:styleId="844">
+  <w:style w:type="paragraph" w:styleId="801">
     <w:name w:val="Subtitle"/>
-    <w:basedOn w:val="881"/>
-    <w:next w:val="881"/>
-    <w:link w:val="845"/>
+    <w:basedOn w:val="838"/>
+    <w:next w:val="838"/>
+    <w:link w:val="802"/>
     <w:uiPriority w:val="11"/>
     <w:qFormat/>
     <w:pPr>
@@ -33731,10 +33966,10 @@
       <w:szCs w:val="28"/>
     </w:rPr>
   </w:style>
-  <w:style w:type="character" w:styleId="845">
+  <w:style w:type="character" w:styleId="802">
     <w:name w:val="Subtitle Char"/>
-    <w:basedOn w:val="832"/>
-    <w:link w:val="844"/>
+    <w:basedOn w:val="789"/>
+    <w:link w:val="801"/>
     <w:uiPriority w:val="11"/>
     <w:pPr>
       <w:pBdr/>
@@ -33748,11 +33983,11 @@
       <w:szCs w:val="28"/>
     </w:rPr>
   </w:style>
-  <w:style w:type="paragraph" w:styleId="846">
+  <w:style w:type="paragraph" w:styleId="803">
     <w:name w:val="Quote"/>
-    <w:basedOn w:val="881"/>
-    <w:next w:val="881"/>
-    <w:link w:val="847"/>
+    <w:basedOn w:val="838"/>
+    <w:next w:val="838"/>
+    <w:link w:val="804"/>
     <w:uiPriority w:val="29"/>
     <w:qFormat/>
     <w:pPr>
@@ -33767,10 +34002,10 @@
       <w:color w:val="404040" w:themeColor="text1" w:themeTint="BF"/>
     </w:rPr>
   </w:style>
-  <w:style w:type="character" w:styleId="847">
+  <w:style w:type="character" w:styleId="804">
     <w:name w:val="Quote Char"/>
-    <w:basedOn w:val="832"/>
-    <w:link w:val="846"/>
+    <w:basedOn w:val="789"/>
+    <w:link w:val="803"/>
     <w:uiPriority w:val="29"/>
     <w:pPr>
       <w:pBdr/>
@@ -33783,9 +34018,9 @@
       <w:color w:val="404040" w:themeColor="text1" w:themeTint="BF"/>
     </w:rPr>
   </w:style>
-  <w:style w:type="character" w:styleId="848">
+  <w:style w:type="character" w:styleId="805">
     <w:name w:val="Intense Emphasis"/>
-    <w:basedOn w:val="832"/>
+    <w:basedOn w:val="789"/>
     <w:uiPriority w:val="21"/>
     <w:qFormat/>
     <w:pPr>
@@ -33799,11 +34034,11 @@
       <w:color w:val="0f4761" w:themeColor="accent1" w:themeShade="BF"/>
     </w:rPr>
   </w:style>
-  <w:style w:type="paragraph" w:styleId="849">
+  <w:style w:type="paragraph" w:styleId="806">
     <w:name w:val="Intense Quote"/>
-    <w:basedOn w:val="881"/>
-    <w:next w:val="881"/>
-    <w:link w:val="850"/>
+    <w:basedOn w:val="838"/>
+    <w:next w:val="838"/>
+    <w:link w:val="807"/>
     <w:uiPriority w:val="30"/>
     <w:qFormat/>
     <w:pPr>
@@ -33821,10 +34056,10 @@
       <w:color w:val="0f4761" w:themeColor="accent1" w:themeShade="BF"/>
     </w:rPr>
   </w:style>
-  <w:style w:type="character" w:styleId="850">
+  <w:style w:type="character" w:styleId="807">
     <w:name w:val="Intense Quote Char"/>
-    <w:basedOn w:val="832"/>
-    <w:link w:val="849"/>
+    <w:basedOn w:val="789"/>
+    <w:link w:val="806"/>
     <w:uiPriority w:val="30"/>
     <w:pPr>
       <w:pBdr/>
@@ -33837,9 +34072,9 @@
       <w:color w:val="0f4761" w:themeColor="accent1" w:themeShade="BF"/>
     </w:rPr>
   </w:style>
-  <w:style w:type="character" w:styleId="851">
+  <w:style w:type="character" w:styleId="808">
     <w:name w:val="Intense Reference"/>
-    <w:basedOn w:val="832"/>
+    <w:basedOn w:val="789"/>
     <w:uiPriority w:val="32"/>
     <w:qFormat/>
     <w:pPr>
@@ -33855,9 +34090,9 @@
       <w:spacing w:val="5"/>
     </w:rPr>
   </w:style>
-  <w:style w:type="character" w:styleId="852">
+  <w:style w:type="character" w:styleId="809">
     <w:name w:val="Subtle Emphasis"/>
-    <w:basedOn w:val="832"/>
+    <w:basedOn w:val="789"/>
     <w:uiPriority w:val="19"/>
     <w:qFormat/>
     <w:pPr>
@@ -33871,9 +34106,9 @@
       <w:color w:val="404040" w:themeColor="text1" w:themeTint="BF"/>
     </w:rPr>
   </w:style>
-  <w:style w:type="character" w:styleId="853">
+  <w:style w:type="character" w:styleId="810">
     <w:name w:val="Emphasis"/>
-    <w:basedOn w:val="832"/>
+    <w:basedOn w:val="789"/>
     <w:uiPriority w:val="20"/>
     <w:qFormat/>
     <w:pPr>
@@ -33886,9 +34121,9 @@
       <w:iCs/>
     </w:rPr>
   </w:style>
-  <w:style w:type="character" w:styleId="854">
+  <w:style w:type="character" w:styleId="811">
     <w:name w:val="Strong"/>
-    <w:basedOn w:val="832"/>
+    <w:basedOn w:val="789"/>
     <w:uiPriority w:val="22"/>
     <w:qFormat/>
     <w:pPr>
@@ -33901,9 +34136,9 @@
       <w:bCs/>
     </w:rPr>
   </w:style>
-  <w:style w:type="character" w:styleId="855">
+  <w:style w:type="character" w:styleId="812">
     <w:name w:val="Subtle Reference"/>
-    <w:basedOn w:val="832"/>
+    <w:basedOn w:val="789"/>
     <w:uiPriority w:val="31"/>
     <w:qFormat/>
     <w:pPr>
@@ -33916,9 +34151,9 @@
       <w:color w:val="5a5a5a" w:themeColor="text1" w:themeTint="A5"/>
     </w:rPr>
   </w:style>
-  <w:style w:type="character" w:styleId="856">
+  <w:style w:type="character" w:styleId="813">
     <w:name w:val="Book Title"/>
-    <w:basedOn w:val="832"/>
+    <w:basedOn w:val="789"/>
     <w:uiPriority w:val="33"/>
     <w:qFormat/>
     <w:pPr>
@@ -33934,10 +34169,10 @@
       <w:spacing w:val="5"/>
     </w:rPr>
   </w:style>
-  <w:style w:type="paragraph" w:styleId="857">
+  <w:style w:type="paragraph" w:styleId="814">
     <w:name w:val="Header"/>
-    <w:basedOn w:val="881"/>
-    <w:link w:val="858"/>
+    <w:basedOn w:val="838"/>
+    <w:link w:val="815"/>
     <w:uiPriority w:val="99"/>
     <w:unhideWhenUsed/>
     <w:pPr>
@@ -33950,10 +34185,10 @@
       <w:ind/>
     </w:pPr>
   </w:style>
-  <w:style w:type="character" w:styleId="858">
+  <w:style w:type="character" w:styleId="815">
     <w:name w:val="Header Char"/>
-    <w:basedOn w:val="832"/>
-    <w:link w:val="857"/>
+    <w:basedOn w:val="789"/>
+    <w:link w:val="814"/>
     <w:uiPriority w:val="99"/>
     <w:pPr>
       <w:pBdr/>
@@ -33961,10 +34196,10 @@
       <w:ind/>
     </w:pPr>
   </w:style>
-  <w:style w:type="paragraph" w:styleId="859">
+  <w:style w:type="paragraph" w:styleId="816">
     <w:name w:val="Footer"/>
-    <w:basedOn w:val="881"/>
-    <w:link w:val="860"/>
+    <w:basedOn w:val="838"/>
+    <w:link w:val="817"/>
     <w:uiPriority w:val="99"/>
     <w:unhideWhenUsed/>
     <w:pPr>
@@ -33977,10 +34212,10 @@
       <w:ind/>
     </w:pPr>
   </w:style>
-  <w:style w:type="character" w:styleId="860">
+  <w:style w:type="character" w:styleId="817">
     <w:name w:val="Footer Char"/>
-    <w:basedOn w:val="832"/>
-    <w:link w:val="859"/>
+    <w:basedOn w:val="789"/>
+    <w:link w:val="816"/>
     <w:uiPriority w:val="99"/>
     <w:pPr>
       <w:pBdr/>
@@ -33988,10 +34223,10 @@
       <w:ind/>
     </w:pPr>
   </w:style>
-  <w:style w:type="paragraph" w:styleId="861">
+  <w:style w:type="paragraph" w:styleId="818">
     <w:name w:val="Caption"/>
-    <w:basedOn w:val="881"/>
-    <w:next w:val="881"/>
+    <w:basedOn w:val="838"/>
+    <w:next w:val="838"/>
     <w:uiPriority w:val="35"/>
     <w:unhideWhenUsed/>
     <w:qFormat/>
@@ -34008,10 +34243,10 @@
       <w:szCs w:val="18"/>
     </w:rPr>
   </w:style>
-  <w:style w:type="paragraph" w:styleId="862">
+  <w:style w:type="paragraph" w:styleId="819">
     <w:name w:val="footnote text"/>
-    <w:basedOn w:val="881"/>
-    <w:link w:val="863"/>
+    <w:basedOn w:val="838"/>
+    <w:link w:val="820"/>
     <w:uiPriority w:val="99"/>
     <w:semiHidden/>
     <w:unhideWhenUsed/>
@@ -34025,10 +34260,10 @@
       <w:szCs w:val="20"/>
     </w:rPr>
   </w:style>
-  <w:style w:type="character" w:styleId="863">
+  <w:style w:type="character" w:styleId="820">
     <w:name w:val="Footnote Text Char"/>
-    <w:basedOn w:val="832"/>
-    <w:link w:val="862"/>
+    <w:basedOn w:val="789"/>
+    <w:link w:val="819"/>
     <w:uiPriority w:val="99"/>
     <w:semiHidden/>
     <w:pPr>
@@ -34041,9 +34276,9 @@
       <w:szCs w:val="20"/>
     </w:rPr>
   </w:style>
-  <w:style w:type="character" w:styleId="864">
+  <w:style w:type="character" w:styleId="821">
     <w:name w:val="footnote reference"/>
-    <w:basedOn w:val="832"/>
+    <w:basedOn w:val="789"/>
     <w:uiPriority w:val="99"/>
     <w:semiHidden/>
     <w:unhideWhenUsed/>
@@ -34056,10 +34291,10 @@
       <w:vertAlign w:val="superscript"/>
     </w:rPr>
   </w:style>
-  <w:style w:type="paragraph" w:styleId="865">
+  <w:style w:type="paragraph" w:styleId="822">
     <w:name w:val="endnote text"/>
-    <w:basedOn w:val="881"/>
-    <w:link w:val="866"/>
+    <w:basedOn w:val="838"/>
+    <w:link w:val="823"/>
     <w:uiPriority w:val="99"/>
     <w:semiHidden/>
     <w:unhideWhenUsed/>
@@ -34073,10 +34308,10 @@
       <w:szCs w:val="20"/>
     </w:rPr>
   </w:style>
-  <w:style w:type="character" w:styleId="866">
+  <w:style w:type="character" w:styleId="823">
     <w:name w:val="Endnote Text Char"/>
-    <w:basedOn w:val="832"/>
-    <w:link w:val="865"/>
+    <w:basedOn w:val="789"/>
+    <w:link w:val="822"/>
     <w:uiPriority w:val="99"/>
     <w:semiHidden/>
     <w:pPr>
@@ -34089,9 +34324,9 @@
       <w:szCs w:val="20"/>
     </w:rPr>
   </w:style>
-  <w:style w:type="character" w:styleId="867">
+  <w:style w:type="character" w:styleId="824">
     <w:name w:val="endnote reference"/>
-    <w:basedOn w:val="832"/>
+    <w:basedOn w:val="789"/>
     <w:uiPriority w:val="99"/>
     <w:semiHidden/>
     <w:unhideWhenUsed/>
@@ -34104,9 +34339,9 @@
       <w:vertAlign w:val="superscript"/>
     </w:rPr>
   </w:style>
-  <w:style w:type="character" w:styleId="868">
+  <w:style w:type="character" w:styleId="825">
     <w:name w:val="Hyperlink"/>
-    <w:basedOn w:val="832"/>
+    <w:basedOn w:val="789"/>
     <w:uiPriority w:val="99"/>
     <w:unhideWhenUsed/>
     <w:pPr>
@@ -34119,9 +34354,9 @@
       <w:u w:val="single"/>
     </w:rPr>
   </w:style>
-  <w:style w:type="character" w:styleId="869">
+  <w:style w:type="character" w:styleId="826">
     <w:name w:val="FollowedHyperlink"/>
-    <w:basedOn w:val="832"/>
+    <w:basedOn w:val="789"/>
     <w:uiPriority w:val="99"/>
     <w:semiHidden/>
     <w:unhideWhenUsed/>
@@ -34135,10 +34370,10 @@
       <w:u w:val="single"/>
     </w:rPr>
   </w:style>
-  <w:style w:type="paragraph" w:styleId="870">
+  <w:style w:type="paragraph" w:styleId="827">
     <w:name w:val="toc 1"/>
-    <w:basedOn w:val="881"/>
-    <w:next w:val="881"/>
+    <w:basedOn w:val="838"/>
+    <w:next w:val="838"/>
     <w:uiPriority w:val="39"/>
     <w:unhideWhenUsed/>
     <w:pPr>
@@ -34147,10 +34382,10 @@
       <w:ind/>
     </w:pPr>
   </w:style>
-  <w:style w:type="paragraph" w:styleId="871">
+  <w:style w:type="paragraph" w:styleId="828">
     <w:name w:val="toc 2"/>
-    <w:basedOn w:val="881"/>
-    <w:next w:val="881"/>
+    <w:basedOn w:val="838"/>
+    <w:next w:val="838"/>
     <w:uiPriority w:val="39"/>
     <w:unhideWhenUsed/>
     <w:pPr>
@@ -34159,10 +34394,10 @@
       <w:ind w:left="220"/>
     </w:pPr>
   </w:style>
-  <w:style w:type="paragraph" w:styleId="872">
+  <w:style w:type="paragraph" w:styleId="829">
     <w:name w:val="toc 3"/>
-    <w:basedOn w:val="881"/>
-    <w:next w:val="881"/>
+    <w:basedOn w:val="838"/>
+    <w:next w:val="838"/>
     <w:uiPriority w:val="39"/>
     <w:unhideWhenUsed/>
     <w:pPr>
@@ -34171,10 +34406,10 @@
       <w:ind w:left="440"/>
     </w:pPr>
   </w:style>
-  <w:style w:type="paragraph" w:styleId="873">
+  <w:style w:type="paragraph" w:styleId="830">
     <w:name w:val="toc 4"/>
-    <w:basedOn w:val="881"/>
-    <w:next w:val="881"/>
+    <w:basedOn w:val="838"/>
+    <w:next w:val="838"/>
     <w:uiPriority w:val="39"/>
     <w:unhideWhenUsed/>
     <w:pPr>
@@ -34183,10 +34418,10 @@
       <w:ind w:left="660"/>
     </w:pPr>
   </w:style>
-  <w:style w:type="paragraph" w:styleId="874">
+  <w:style w:type="paragraph" w:styleId="831">
     <w:name w:val="toc 5"/>
-    <w:basedOn w:val="881"/>
-    <w:next w:val="881"/>
+    <w:basedOn w:val="838"/>
+    <w:next w:val="838"/>
     <w:uiPriority w:val="39"/>
     <w:unhideWhenUsed/>
     <w:pPr>
@@ -34195,10 +34430,10 @@
       <w:ind w:left="880"/>
     </w:pPr>
   </w:style>
-  <w:style w:type="paragraph" w:styleId="875">
+  <w:style w:type="paragraph" w:styleId="832">
     <w:name w:val="toc 6"/>
-    <w:basedOn w:val="881"/>
-    <w:next w:val="881"/>
+    <w:basedOn w:val="838"/>
+    <w:next w:val="838"/>
     <w:uiPriority w:val="39"/>
     <w:unhideWhenUsed/>
     <w:pPr>
@@ -34207,10 +34442,10 @@
       <w:ind w:left="1100"/>
     </w:pPr>
   </w:style>
-  <w:style w:type="paragraph" w:styleId="876">
+  <w:style w:type="paragraph" w:styleId="833">
     <w:name w:val="toc 7"/>
-    <w:basedOn w:val="881"/>
-    <w:next w:val="881"/>
+    <w:basedOn w:val="838"/>
+    <w:next w:val="838"/>
     <w:uiPriority w:val="39"/>
     <w:unhideWhenUsed/>
     <w:pPr>
@@ -34219,10 +34454,10 @@
       <w:ind w:left="1320"/>
     </w:pPr>
   </w:style>
-  <w:style w:type="paragraph" w:styleId="877">
+  <w:style w:type="paragraph" w:styleId="834">
     <w:name w:val="toc 8"/>
-    <w:basedOn w:val="881"/>
-    <w:next w:val="881"/>
+    <w:basedOn w:val="838"/>
+    <w:next w:val="838"/>
     <w:uiPriority w:val="39"/>
     <w:unhideWhenUsed/>
     <w:pPr>
@@ -34231,10 +34466,10 @@
       <w:ind w:left="1540"/>
     </w:pPr>
   </w:style>
-  <w:style w:type="paragraph" w:styleId="878">
+  <w:style w:type="paragraph" w:styleId="835">
     <w:name w:val="toc 9"/>
-    <w:basedOn w:val="881"/>
-    <w:next w:val="881"/>
+    <w:basedOn w:val="838"/>
+    <w:next w:val="838"/>
     <w:uiPriority w:val="39"/>
     <w:unhideWhenUsed/>
     <w:pPr>
@@ -34243,7 +34478,7 @@
       <w:ind w:left="1760"/>
     </w:pPr>
   </w:style>
-  <w:style w:type="paragraph" w:styleId="879">
+  <w:style w:type="paragraph" w:styleId="836">
     <w:name w:val="TOC Heading"/>
     <w:uiPriority w:val="39"/>
     <w:unhideWhenUsed/>
@@ -34253,10 +34488,10 @@
       <w:ind/>
     </w:pPr>
   </w:style>
-  <w:style w:type="paragraph" w:styleId="880">
+  <w:style w:type="paragraph" w:styleId="837">
     <w:name w:val="table of figures"/>
-    <w:basedOn w:val="881"/>
-    <w:next w:val="881"/>
+    <w:basedOn w:val="838"/>
+    <w:next w:val="838"/>
     <w:uiPriority w:val="99"/>
     <w:unhideWhenUsed/>
     <w:pPr>
@@ -34265,7 +34500,7 @@
       <w:ind/>
     </w:pPr>
   </w:style>
-  <w:style w:type="paragraph" w:styleId="881" w:default="1">
+  <w:style w:type="paragraph" w:styleId="838" w:default="1">
     <w:name w:val="Normal"/>
     <w:qFormat/>
     <w:pPr>
@@ -34274,7 +34509,7 @@
       <w:ind/>
     </w:pPr>
   </w:style>
-  <w:style w:type="table" w:styleId="882" w:default="1">
+  <w:style w:type="table" w:styleId="839" w:default="1">
     <w:name w:val="Normal Table"/>
     <w:uiPriority w:val="99"/>
     <w:semiHidden/>
@@ -34467,7 +34702,7 @@
       </w:tcPr>
     </w:tblStylePr>
   </w:style>
-  <w:style w:type="numbering" w:styleId="883" w:default="1">
+  <w:style w:type="numbering" w:styleId="840" w:default="1">
     <w:name w:val="No List"/>
     <w:uiPriority w:val="99"/>
     <w:semiHidden/>
@@ -34478,9 +34713,9 @@
       <w:ind/>
     </w:pPr>
   </w:style>
-  <w:style w:type="paragraph" w:styleId="884">
+  <w:style w:type="paragraph" w:styleId="841">
     <w:name w:val="No Spacing"/>
-    <w:basedOn w:val="881"/>
+    <w:basedOn w:val="838"/>
     <w:uiPriority w:val="1"/>
     <w:qFormat/>
     <w:pPr>
@@ -34489,9 +34724,9 @@
       <w:ind/>
     </w:pPr>
   </w:style>
-  <w:style w:type="paragraph" w:styleId="885">
+  <w:style w:type="paragraph" w:styleId="842">
     <w:name w:val="List Paragraph"/>
-    <w:basedOn w:val="881"/>
+    <w:basedOn w:val="838"/>
     <w:uiPriority w:val="34"/>
     <w:qFormat/>
     <w:pPr>

</xml_diff>

<commit_message>
Done a tiny bit more referencing (not complete yet)
</commit_message>
<xml_diff>
--- a/Testing.docx
+++ b/Testing.docx
@@ -22,6 +22,11 @@
           <w:highlight w:val="none"/>
         </w:rPr>
       </w:r>
+      <w:r>
+        <w:rPr>
+          <w:highlight w:val="none"/>
+        </w:rPr>
+      </w:r>
     </w:p>
     <w:p>
       <w:pPr>
@@ -41,31 +46,28 @@
           <w:highlight w:val="none"/>
         </w:rPr>
       </w:r>
-      <w:r>
+      <w:r/>
+    </w:p>
+    <w:p>
+      <w:pPr>
+        <w:pBdr/>
+        <w:spacing/>
+        <w:ind/>
         <w:rPr>
           <w:highlight w:val="none"/>
         </w:rPr>
+      </w:pPr>
+      <w:r>
+        <w:t xml:space="preserve">Objectives 1aii and 5 were implemented with separate files and then tho</w:t>
+      </w:r>
+      <w:r>
+        <w:t xml:space="preserve">se files were imported as modules into the main program, the functions in these files should be tested independently of the main program. The main() function for these files will be used to test them and demonstrate they work. Here is the code for test 01:</w:t>
       </w:r>
       <w:r>
         <w:rPr>
           <w:highlight w:val="none"/>
         </w:rPr>
       </w:r>
-      <w:r/>
-    </w:p>
-    <w:p>
-      <w:pPr>
-        <w:pBdr/>
-        <w:spacing/>
-        <w:ind/>
-        <w:rPr>
-          <w:highlight w:val="none"/>
-        </w:rPr>
-      </w:pPr>
-      <w:r>
-        <w:t xml:space="preserve">Objectives 1aii and 5 were implemented with separate files and then those files were imported as modules into the main program, the functions in these files should be tested independently of the main program. The main() function for these files will be used to test them and demonstrate they work. Here is the code for test 01:</w:t>
-      </w:r>
-      <w:r/>
     </w:p>
     <w:p>
       <w:pPr>
@@ -181,6 +183,11 @@
           <w:highlight w:val="none"/>
         </w:rPr>
       </w:r>
+      <w:r>
+        <w:rPr>
+          <w:highlight w:val="none"/>
+        </w:rPr>
+      </w:r>
     </w:p>
     <w:p>
       <w:pPr>
@@ -295,21 +302,58 @@
           <w:highlight w:val="none"/>
         </w:rPr>
       </w:r>
-    </w:p>
-    <w:p>
-      <w:pPr>
-        <w:pBdr/>
-        <w:spacing/>
-        <w:ind/>
-        <w:rPr>
-          <w:highlight w:val="none"/>
-        </w:rPr>
-      </w:pPr>
       <w:r>
         <w:rPr>
           <w:highlight w:val="none"/>
         </w:rPr>
-        <w:t xml:space="preserve">The tests have been chosen in an order that allows me to do most of them in a single run of the program. I’ve tried to also make the order sensible, i.e. The first test for the main program is with the start screen, as that’s the first thing you’ll see when you open the program. Some tests will inevitably destroy the solar system, I will restart after test 20 to do the last few tests. </w:t>
+      </w:r>
+    </w:p>
+    <w:p>
+      <w:pPr>
+        <w:pBdr/>
+        <w:spacing/>
+        <w:ind/>
+        <w:rPr>
+          <w:highlight w:val="none"/>
+        </w:rPr>
+      </w:pPr>
+      <w:r>
+        <w:rPr>
+          <w:highlight w:val="none"/>
+        </w:rPr>
+        <w:t xml:space="preserve">The tests have been chosen in an order that allows me to do most of them in a single run of the program. I’ve tried to also make the</w:t>
+      </w:r>
+      <w:r>
+        <w:rPr>
+          <w:highlight w:val="none"/>
+        </w:rPr>
+        <w:t xml:space="preserve"> order sensible, i.e. The first test for the main program is with the start screen, as that’s the first thing you’ll see when you open the program. Some tests will inevitably destroy the solar system, I will restart after test 20 to do the last few tests.</w:t>
+      </w:r>
+      <w:r>
+        <w:rPr>
+          <w:highlight w:val="none"/>
+        </w:rPr>
+      </w:r>
+      <w:r>
+        <w:rPr>
+          <w:highlight w:val="none"/>
+        </w:rPr>
+      </w:r>
+    </w:p>
+    <w:p>
+      <w:pPr>
+        <w:pBdr/>
+        <w:spacing/>
+        <w:ind/>
+        <w:rPr>
+          <w:highlight w:val="none"/>
+        </w:rPr>
+      </w:pPr>
+      <w:r>
+        <w:rPr>
+          <w:highlight w:val="none"/>
+        </w:rPr>
+        <w:t xml:space="preserve">I have done my best to explain what inputs I will be doing when carrying out each test. Note that I will scroll up and down to zoom in and out to make the tests easier to see, I have not added the scrolling to every input section as it’s unnecessary and would clutter it a lot.</w:t>
       </w:r>
       <w:r>
         <w:rPr>
@@ -4554,7 +4598,11 @@
       <w:r>
         <w:t xml:space="preserve">Here are the results of test 01:</w:t>
       </w:r>
-      <w:r/>
+      <w:r>
+        <w:rPr>
+          <w:highlight w:val="none"/>
+        </w:rPr>
+      </w:r>
     </w:p>
     <w:p>
       <w:pPr>
@@ -4642,11 +4690,7 @@
           <w:highlight w:val="none"/>
         </w:rPr>
       </w:r>
-      <w:r>
-        <w:rPr>
-          <w:highlight w:val="none"/>
-        </w:rPr>
-      </w:r>
+      <w:r/>
     </w:p>
     <w:p>
       <w:pPr>
@@ -4728,7 +4772,6 @@
         </mc:AlternateContent>
       </w:r>
       <w:r/>
-      <w:r/>
     </w:p>
     <w:p>
       <w:pPr>
@@ -4811,8 +4854,11 @@
           </mc:Fallback>
         </mc:AlternateContent>
       </w:r>
-      <w:r/>
-      <w:r/>
+      <w:r>
+        <w:rPr>
+          <w:highlight w:val="none"/>
+        </w:rPr>
+      </w:r>
     </w:p>
     <w:p>
       <w:pPr>
@@ -4828,6 +4874,11 @@
           <w:highlight w:val="none"/>
         </w:rPr>
         <w:t xml:space="preserve">And the positions and velocities match the NASA ephemeris results:</w:t>
+      </w:r>
+      <w:r>
+        <w:rPr>
+          <w:highlight w:val="none"/>
+        </w:rPr>
       </w:r>
       <w:r>
         <w:rPr>
@@ -4949,6 +5000,11 @@
           <w:highlight w:val="none"/>
         </w:rPr>
       </w:r>
+      <w:r>
+        <w:rPr>
+          <w:highlight w:val="none"/>
+        </w:rPr>
+      </w:r>
     </w:p>
     <w:p>
       <w:pPr>
@@ -4974,6 +5030,11 @@
           <w:highlight w:val="none"/>
         </w:rPr>
         <w:t xml:space="preserve">Here are the results of test 02:</w:t>
+      </w:r>
+      <w:r>
+        <w:rPr>
+          <w:highlight w:val="none"/>
+        </w:rPr>
       </w:r>
       <w:r>
         <w:rPr>
@@ -5069,12 +5130,6 @@
           <w:highlight w:val="none"/>
         </w:rPr>
       </w:r>
-      <w:r/>
-      <w:r>
-        <w:rPr>
-          <w:highlight w:val="none"/>
-        </w:rPr>
-      </w:r>
       <w:r>
         <w:rPr>
           <w:highlight w:val="none"/>
@@ -5099,6 +5154,7 @@
           <w:highlight w:val="none"/>
         </w:rPr>
       </w:r>
+      <w:r/>
     </w:p>
     <w:sectPr>
       <w:footnotePr/>

</xml_diff>